<commit_message>
docs(MilhasFacil): regenera .docx sincronizados com as correções de compliance
Regeneração dos 17 .docx correspondentes aos .md alterados na correção de
compliance e integração ao portfólio (commit anterior), via converter_md_docx.py.
Mantém os documentos Word (formato auditado pela ASR) sincronizados com a
fonte Markdown.

https://claude.ai/code/session_018zmkSvD4BNx5dnbgfmzEQP
</commit_message>
<xml_diff>
--- a/mps-nivel-c/oficial/04_registros/MilhasFacil_Busca-de-Milhas/ATA-MILHASFACIL01-002_Aprovacao-de-Arquitetura.docx
+++ b/mps-nivel-c/oficial/04_registros/MilhasFacil_Busca-de-Milhas/ATA-MILHASFACIL01-002_Aprovacao-de-Arquitetura.docx
@@ -3,39 +3,90 @@
 <w:document xmlns:wpc="http://schemas.microsoft.com/office/word/2010/wordprocessingCanvas" xmlns:mo="http://schemas.microsoft.com/office/mac/office/2008/main" xmlns:mc="http://schemas.openxmlformats.org/markup-compatibility/2006" xmlns:mv="urn:schemas-microsoft-com:mac:vml" xmlns:o="urn:schemas-microsoft-com:office:office" xmlns:r="http://schemas.openxmlformats.org/officeDocument/2006/relationships" xmlns:m="http://schemas.openxmlformats.org/officeDocument/2006/math" xmlns:v="urn:schemas-microsoft-com:vml" xmlns:wp14="http://schemas.microsoft.com/office/word/2010/wordprocessingDrawing" xmlns:wp="http://schemas.openxmlformats.org/drawingml/2006/wordprocessingDrawing" xmlns:w10="urn:schemas-microsoft-com:office:word" xmlns:w="http://schemas.openxmlformats.org/wordprocessingml/2006/main" xmlns:w14="http://schemas.microsoft.com/office/word/2010/wordml" xmlns:wpg="http://schemas.microsoft.com/office/word/2010/wordprocessingGroup" xmlns:wpi="http://schemas.microsoft.com/office/word/2010/wordprocessingInk" xmlns:wne="http://schemas.microsoft.com/office/word/2006/wordml" xmlns:wps="http://schemas.microsoft.com/office/word/2010/wordprocessingShape" mc:Ignorable="w14 wp14">
   <w:body>
     <w:p>
+      <w:pPr>
+        <w:pBdr>
+          <w:top w:val="single" w:sz="32" w:space="0" w:color="003366"/>
+        </w:pBdr>
+        <w:spacing w:before="0" w:after="0"/>
+      </w:pPr>
+    </w:p>
+    <w:p>
+      <w:pPr>
+        <w:spacing w:before="240" w:after="40"/>
+      </w:pPr>
       <w:r>
         <w:rPr>
+          <w:rFonts w:ascii="Calibri" w:hAnsi="Calibri"/>
           <w:b/>
-          <w:color w:val="1F3B73"/>
-          <w:sz w:val="34"/>
+          <w:color w:val="003366"/>
+          <w:sz w:val="36"/>
         </w:rPr>
-        <w:t>Ata de Reunião — Design Review / Aprovação da Arquitetura · MilhasFacil</w:t>
+        <w:t>ATA DE REUNIÃO — DESIGN REVIEW / APROVAÇÃO DA ARQUITETURA · MILHASFACIL</w:t>
       </w:r>
+    </w:p>
+    <w:p>
+      <w:pPr>
+        <w:spacing w:before="0" w:after="40"/>
+      </w:pPr>
+      <w:r>
+        <w:rPr>
+          <w:rFonts w:ascii="Calibri" w:hAnsi="Calibri"/>
+          <w:color w:val="555555"/>
+          <w:sz w:val="20"/>
+        </w:rPr>
+        <w:t>MILHASFACIL01   ·   Versão 1.1   ·   11/02/2026   ·   Timeware Brasil</w:t>
+      </w:r>
+    </w:p>
+    <w:p>
+      <w:pPr>
+        <w:pBdr>
+          <w:bottom w:val="single" w:sz="6" w:space="1" w:color="003366"/>
+        </w:pBdr>
+        <w:spacing w:before="120" w:after="280"/>
+      </w:pPr>
     </w:p>
     <w:tbl>
       <w:tblPr>
-        <w:tblStyle w:val="TableGrid"/>
         <w:tblW w:type="auto" w:w="0"/>
-        <w:jc w:val="center"/>
         <w:tblLook w:firstColumn="1" w:firstRow="1" w:lastColumn="0" w:lastRow="0" w:noHBand="0" w:noVBand="1" w:val="04A0"/>
+        <w:tblBorders>
+          <w:top w:val="single" w:sz="4" w:space="0" w:color="AAAAAA"/>
+          <w:left w:val="single" w:sz="4" w:space="0" w:color="AAAAAA"/>
+          <w:bottom w:val="single" w:sz="4" w:space="0" w:color="AAAAAA"/>
+          <w:right w:val="single" w:sz="4" w:space="0" w:color="AAAAAA"/>
+          <w:insideH w:val="single" w:sz="4" w:space="0" w:color="AAAAAA"/>
+          <w:insideV w:val="single" w:sz="4" w:space="0" w:color="AAAAAA"/>
+        </w:tblBorders>
       </w:tblPr>
       <w:tblGrid>
-        <w:gridCol w:w="4873"/>
-        <w:gridCol w:w="4873"/>
+        <w:gridCol w:w="4451"/>
+        <w:gridCol w:w="4451"/>
       </w:tblGrid>
       <w:tr>
+        <w:trPr>
+          <w:cantSplit w:val="1"/>
+        </w:trPr>
         <w:tc>
           <w:tcPr>
-            <w:tcW w:type="dxa" w:w="4873"/>
-            <w:shd w:val="clear" w:fill="1F3B73"/>
+            <w:tcW w:type="dxa" w:w="4451"/>
+            <w:tcMar>
+              <w:top w:w="60" w:type="dxa"/>
+              <w:bottom w:w="60" w:type="dxa"/>
+              <w:left w:w="100" w:type="dxa"/>
+              <w:right w:w="100" w:type="dxa"/>
+            </w:tcMar>
+            <w:shd w:val="clear" w:color="auto" w:fill="D6E4F0"/>
           </w:tcPr>
           <w:p>
-            <w:r/>
+            <w:pPr>
+              <w:spacing w:before="40" w:after="40"/>
+            </w:pPr>
             <w:r>
               <w:rPr>
+                <w:rFonts w:ascii="Calibri" w:hAnsi="Calibri"/>
                 <w:b/>
-                <w:color w:val="FFFFFF"/>
-                <w:sz w:val="18"/>
+                <w:i w:val="0"/>
+                <w:sz w:val="20"/>
               </w:rPr>
               <w:t>Campo</w:t>
             </w:r>
@@ -43,16 +94,25 @@
         </w:tc>
         <w:tc>
           <w:tcPr>
-            <w:tcW w:type="dxa" w:w="4873"/>
-            <w:shd w:val="clear" w:fill="1F3B73"/>
+            <w:tcW w:type="dxa" w:w="4451"/>
+            <w:tcMar>
+              <w:top w:w="60" w:type="dxa"/>
+              <w:bottom w:w="60" w:type="dxa"/>
+              <w:left w:w="100" w:type="dxa"/>
+              <w:right w:w="100" w:type="dxa"/>
+            </w:tcMar>
+            <w:shd w:val="clear" w:color="auto" w:fill="D6E4F0"/>
           </w:tcPr>
           <w:p>
-            <w:r/>
+            <w:pPr>
+              <w:spacing w:before="40" w:after="40"/>
+            </w:pPr>
             <w:r>
               <w:rPr>
+                <w:rFonts w:ascii="Calibri" w:hAnsi="Calibri"/>
                 <w:b/>
-                <w:color w:val="FFFFFF"/>
-                <w:sz w:val="18"/>
+                <w:i w:val="0"/>
+                <w:sz w:val="20"/>
               </w:rPr>
               <w:t>Valor</w:t>
             </w:r>
@@ -60,20 +120,30 @@
         </w:tc>
       </w:tr>
       <w:tr>
+        <w:trPr>
+          <w:cantSplit w:val="1"/>
+        </w:trPr>
         <w:tc>
           <w:tcPr>
-            <w:tcW w:type="dxa" w:w="4873"/>
+            <w:tcW w:type="dxa" w:w="4451"/>
+            <w:tcMar>
+              <w:top w:w="60" w:type="dxa"/>
+              <w:bottom w:w="60" w:type="dxa"/>
+              <w:left w:w="100" w:type="dxa"/>
+              <w:right w:w="100" w:type="dxa"/>
+            </w:tcMar>
+            <w:shd w:val="clear" w:color="auto" w:fill="F0F4F8"/>
           </w:tcPr>
           <w:p>
+            <w:pPr>
+              <w:spacing w:before="40" w:after="40"/>
+            </w:pPr>
             <w:r>
               <w:rPr>
-                <w:sz w:val="17"/>
-              </w:rPr>
-            </w:r>
-            <w:r>
-              <w:rPr>
+                <w:rFonts w:ascii="Calibri" w:hAnsi="Calibri"/>
                 <w:b/>
-                <w:sz w:val="17"/>
+                <w:i w:val="0"/>
+                <w:sz w:val="20"/>
               </w:rPr>
               <w:t>Documento</w:t>
             </w:r>
@@ -81,17 +151,24 @@
         </w:tc>
         <w:tc>
           <w:tcPr>
-            <w:tcW w:type="dxa" w:w="4873"/>
+            <w:tcW w:type="dxa" w:w="4451"/>
+            <w:tcMar>
+              <w:top w:w="60" w:type="dxa"/>
+              <w:bottom w:w="60" w:type="dxa"/>
+              <w:left w:w="100" w:type="dxa"/>
+              <w:right w:w="100" w:type="dxa"/>
+            </w:tcMar>
           </w:tcPr>
           <w:p>
+            <w:pPr>
+              <w:spacing w:before="40" w:after="40"/>
+            </w:pPr>
             <w:r>
               <w:rPr>
-                <w:sz w:val="17"/>
-              </w:rPr>
-            </w:r>
-            <w:r>
-              <w:rPr>
-                <w:sz w:val="17"/>
+                <w:rFonts w:ascii="Calibri" w:hAnsi="Calibri"/>
+                <w:b w:val="0"/>
+                <w:i w:val="0"/>
+                <w:sz w:val="20"/>
               </w:rPr>
               <w:t>ATA-MILHASFACIL01-002</w:t>
             </w:r>
@@ -99,21 +176,30 @@
         </w:tc>
       </w:tr>
       <w:tr>
+        <w:trPr>
+          <w:cantSplit w:val="1"/>
+        </w:trPr>
         <w:tc>
           <w:tcPr>
-            <w:tcW w:type="dxa" w:w="4873"/>
-            <w:shd w:val="clear" w:fill="EDF1F7"/>
+            <w:tcW w:type="dxa" w:w="4451"/>
+            <w:tcMar>
+              <w:top w:w="60" w:type="dxa"/>
+              <w:bottom w:w="60" w:type="dxa"/>
+              <w:left w:w="100" w:type="dxa"/>
+              <w:right w:w="100" w:type="dxa"/>
+            </w:tcMar>
+            <w:shd w:val="clear" w:color="auto" w:fill="F0F4F8"/>
           </w:tcPr>
           <w:p>
+            <w:pPr>
+              <w:spacing w:before="40" w:after="40"/>
+            </w:pPr>
             <w:r>
               <w:rPr>
-                <w:sz w:val="17"/>
-              </w:rPr>
-            </w:r>
-            <w:r>
-              <w:rPr>
+                <w:rFonts w:ascii="Calibri" w:hAnsi="Calibri"/>
                 <w:b/>
-                <w:sz w:val="17"/>
+                <w:i w:val="0"/>
+                <w:sz w:val="20"/>
               </w:rPr>
               <w:t>Projeto</w:t>
             </w:r>
@@ -121,18 +207,24 @@
         </w:tc>
         <w:tc>
           <w:tcPr>
-            <w:tcW w:type="dxa" w:w="4873"/>
-            <w:shd w:val="clear" w:fill="EDF1F7"/>
+            <w:tcW w:type="dxa" w:w="4451"/>
+            <w:tcMar>
+              <w:top w:w="60" w:type="dxa"/>
+              <w:bottom w:w="60" w:type="dxa"/>
+              <w:left w:w="100" w:type="dxa"/>
+              <w:right w:w="100" w:type="dxa"/>
+            </w:tcMar>
           </w:tcPr>
           <w:p>
+            <w:pPr>
+              <w:spacing w:before="40" w:after="40"/>
+            </w:pPr>
             <w:r>
               <w:rPr>
-                <w:sz w:val="17"/>
-              </w:rPr>
-            </w:r>
-            <w:r>
-              <w:rPr>
-                <w:sz w:val="17"/>
+                <w:rFonts w:ascii="Calibri" w:hAnsi="Calibri"/>
+                <w:b w:val="0"/>
+                <w:i w:val="0"/>
+                <w:sz w:val="20"/>
               </w:rPr>
               <w:t>MilhasFacil — Plataforma de Busca e Alerta de Passagens por Milhas</w:t>
             </w:r>
@@ -140,20 +232,86 @@
         </w:tc>
       </w:tr>
       <w:tr>
+        <w:trPr>
+          <w:cantSplit w:val="1"/>
+        </w:trPr>
         <w:tc>
           <w:tcPr>
-            <w:tcW w:type="dxa" w:w="4873"/>
+            <w:tcW w:type="dxa" w:w="4451"/>
+            <w:tcMar>
+              <w:top w:w="60" w:type="dxa"/>
+              <w:bottom w:w="60" w:type="dxa"/>
+              <w:left w:w="100" w:type="dxa"/>
+              <w:right w:w="100" w:type="dxa"/>
+            </w:tcMar>
+            <w:shd w:val="clear" w:color="auto" w:fill="F0F4F8"/>
           </w:tcPr>
           <w:p>
+            <w:pPr>
+              <w:spacing w:before="40" w:after="40"/>
+            </w:pPr>
             <w:r>
               <w:rPr>
-                <w:sz w:val="17"/>
+                <w:rFonts w:ascii="Calibri" w:hAnsi="Calibri"/>
+                <w:b/>
+                <w:i w:val="0"/>
+                <w:sz w:val="20"/>
               </w:rPr>
+              <w:t>Código do projeto</w:t>
             </w:r>
+          </w:p>
+        </w:tc>
+        <w:tc>
+          <w:tcPr>
+            <w:tcW w:type="dxa" w:w="4451"/>
+            <w:tcMar>
+              <w:top w:w="60" w:type="dxa"/>
+              <w:bottom w:w="60" w:type="dxa"/>
+              <w:left w:w="100" w:type="dxa"/>
+              <w:right w:w="100" w:type="dxa"/>
+            </w:tcMar>
+          </w:tcPr>
+          <w:p>
+            <w:pPr>
+              <w:spacing w:before="40" w:after="40"/>
+            </w:pPr>
             <w:r>
               <w:rPr>
+                <w:rFonts w:ascii="Calibri" w:hAnsi="Calibri"/>
+                <w:b w:val="0"/>
+                <w:i w:val="0"/>
+                <w:sz w:val="20"/>
+              </w:rPr>
+              <w:t>MILHASFACIL01</w:t>
+            </w:r>
+          </w:p>
+        </w:tc>
+      </w:tr>
+      <w:tr>
+        <w:trPr>
+          <w:cantSplit w:val="1"/>
+        </w:trPr>
+        <w:tc>
+          <w:tcPr>
+            <w:tcW w:type="dxa" w:w="4451"/>
+            <w:tcMar>
+              <w:top w:w="60" w:type="dxa"/>
+              <w:bottom w:w="60" w:type="dxa"/>
+              <w:left w:w="100" w:type="dxa"/>
+              <w:right w:w="100" w:type="dxa"/>
+            </w:tcMar>
+            <w:shd w:val="clear" w:color="auto" w:fill="F0F4F8"/>
+          </w:tcPr>
+          <w:p>
+            <w:pPr>
+              <w:spacing w:before="40" w:after="40"/>
+            </w:pPr>
+            <w:r>
+              <w:rPr>
+                <w:rFonts w:ascii="Calibri" w:hAnsi="Calibri"/>
                 <w:b/>
-                <w:sz w:val="17"/>
+                <w:i w:val="0"/>
+                <w:sz w:val="20"/>
               </w:rPr>
               <w:t>Cliente</w:t>
             </w:r>
@@ -161,17 +319,24 @@
         </w:tc>
         <w:tc>
           <w:tcPr>
-            <w:tcW w:type="dxa" w:w="4873"/>
+            <w:tcW w:type="dxa" w:w="4451"/>
+            <w:tcMar>
+              <w:top w:w="60" w:type="dxa"/>
+              <w:bottom w:w="60" w:type="dxa"/>
+              <w:left w:w="100" w:type="dxa"/>
+              <w:right w:w="100" w:type="dxa"/>
+            </w:tcMar>
           </w:tcPr>
           <w:p>
+            <w:pPr>
+              <w:spacing w:before="40" w:after="40"/>
+            </w:pPr>
             <w:r>
               <w:rPr>
-                <w:sz w:val="17"/>
-              </w:rPr>
-            </w:r>
-            <w:r>
-              <w:rPr>
-                <w:sz w:val="17"/>
+                <w:rFonts w:ascii="Calibri" w:hAnsi="Calibri"/>
+                <w:b w:val="0"/>
+                <w:i w:val="0"/>
+                <w:sz w:val="20"/>
               </w:rPr>
               <w:t>Hub de Milhas</w:t>
             </w:r>
@@ -179,21 +344,86 @@
         </w:tc>
       </w:tr>
       <w:tr>
+        <w:trPr>
+          <w:cantSplit w:val="1"/>
+        </w:trPr>
         <w:tc>
           <w:tcPr>
-            <w:tcW w:type="dxa" w:w="4873"/>
-            <w:shd w:val="clear" w:fill="EDF1F7"/>
+            <w:tcW w:type="dxa" w:w="4451"/>
+            <w:tcMar>
+              <w:top w:w="60" w:type="dxa"/>
+              <w:bottom w:w="60" w:type="dxa"/>
+              <w:left w:w="100" w:type="dxa"/>
+              <w:right w:w="100" w:type="dxa"/>
+            </w:tcMar>
+            <w:shd w:val="clear" w:color="auto" w:fill="F0F4F8"/>
           </w:tcPr>
           <w:p>
+            <w:pPr>
+              <w:spacing w:before="40" w:after="40"/>
+            </w:pPr>
             <w:r>
               <w:rPr>
-                <w:sz w:val="17"/>
+                <w:rFonts w:ascii="Calibri" w:hAnsi="Calibri"/>
+                <w:b/>
+                <w:i w:val="0"/>
+                <w:sz w:val="20"/>
               </w:rPr>
+              <w:t>Organização</w:t>
             </w:r>
+          </w:p>
+        </w:tc>
+        <w:tc>
+          <w:tcPr>
+            <w:tcW w:type="dxa" w:w="4451"/>
+            <w:tcMar>
+              <w:top w:w="60" w:type="dxa"/>
+              <w:bottom w:w="60" w:type="dxa"/>
+              <w:left w:w="100" w:type="dxa"/>
+              <w:right w:w="100" w:type="dxa"/>
+            </w:tcMar>
+          </w:tcPr>
+          <w:p>
+            <w:pPr>
+              <w:spacing w:before="40" w:after="40"/>
+            </w:pPr>
             <w:r>
               <w:rPr>
+                <w:rFonts w:ascii="Calibri" w:hAnsi="Calibri"/>
+                <w:b w:val="0"/>
+                <w:i w:val="0"/>
+                <w:sz w:val="20"/>
+              </w:rPr>
+              <w:t>Timeware Brasil Softwares e Serviços LTDA</w:t>
+            </w:r>
+          </w:p>
+        </w:tc>
+      </w:tr>
+      <w:tr>
+        <w:trPr>
+          <w:cantSplit w:val="1"/>
+        </w:trPr>
+        <w:tc>
+          <w:tcPr>
+            <w:tcW w:type="dxa" w:w="4451"/>
+            <w:tcMar>
+              <w:top w:w="60" w:type="dxa"/>
+              <w:bottom w:w="60" w:type="dxa"/>
+              <w:left w:w="100" w:type="dxa"/>
+              <w:right w:w="100" w:type="dxa"/>
+            </w:tcMar>
+            <w:shd w:val="clear" w:color="auto" w:fill="F0F4F8"/>
+          </w:tcPr>
+          <w:p>
+            <w:pPr>
+              <w:spacing w:before="40" w:after="40"/>
+            </w:pPr>
+            <w:r>
+              <w:rPr>
+                <w:rFonts w:ascii="Calibri" w:hAnsi="Calibri"/>
                 <w:b/>
-                <w:sz w:val="17"/>
+                <w:i w:val="0"/>
+                <w:sz w:val="20"/>
               </w:rPr>
               <w:t>Reunião</w:t>
             </w:r>
@@ -201,18 +431,24 @@
         </w:tc>
         <w:tc>
           <w:tcPr>
-            <w:tcW w:type="dxa" w:w="4873"/>
-            <w:shd w:val="clear" w:fill="EDF1F7"/>
+            <w:tcW w:type="dxa" w:w="4451"/>
+            <w:tcMar>
+              <w:top w:w="60" w:type="dxa"/>
+              <w:bottom w:w="60" w:type="dxa"/>
+              <w:left w:w="100" w:type="dxa"/>
+              <w:right w:w="100" w:type="dxa"/>
+            </w:tcMar>
           </w:tcPr>
           <w:p>
+            <w:pPr>
+              <w:spacing w:before="40" w:after="40"/>
+            </w:pPr>
             <w:r>
               <w:rPr>
-                <w:sz w:val="17"/>
-              </w:rPr>
-            </w:r>
-            <w:r>
-              <w:rPr>
-                <w:sz w:val="17"/>
+                <w:rFonts w:ascii="Calibri" w:hAnsi="Calibri"/>
+                <w:b w:val="0"/>
+                <w:i w:val="0"/>
+                <w:sz w:val="20"/>
               </w:rPr>
               <w:t>Design Review — Aprovação da Arquitetura técnica da solução</w:t>
             </w:r>
@@ -220,20 +456,30 @@
         </w:tc>
       </w:tr>
       <w:tr>
+        <w:trPr>
+          <w:cantSplit w:val="1"/>
+        </w:trPr>
         <w:tc>
           <w:tcPr>
-            <w:tcW w:type="dxa" w:w="4873"/>
+            <w:tcW w:type="dxa" w:w="4451"/>
+            <w:tcMar>
+              <w:top w:w="60" w:type="dxa"/>
+              <w:bottom w:w="60" w:type="dxa"/>
+              <w:left w:w="100" w:type="dxa"/>
+              <w:right w:w="100" w:type="dxa"/>
+            </w:tcMar>
+            <w:shd w:val="clear" w:color="auto" w:fill="F0F4F8"/>
           </w:tcPr>
           <w:p>
+            <w:pPr>
+              <w:spacing w:before="40" w:after="40"/>
+            </w:pPr>
             <w:r>
               <w:rPr>
-                <w:sz w:val="17"/>
-              </w:rPr>
-            </w:r>
-            <w:r>
-              <w:rPr>
+                <w:rFonts w:ascii="Calibri" w:hAnsi="Calibri"/>
                 <w:b/>
-                <w:sz w:val="17"/>
+                <w:i w:val="0"/>
+                <w:sz w:val="20"/>
               </w:rPr>
               <w:t>Data</w:t>
             </w:r>
@@ -241,17 +487,24 @@
         </w:tc>
         <w:tc>
           <w:tcPr>
-            <w:tcW w:type="dxa" w:w="4873"/>
+            <w:tcW w:type="dxa" w:w="4451"/>
+            <w:tcMar>
+              <w:top w:w="60" w:type="dxa"/>
+              <w:bottom w:w="60" w:type="dxa"/>
+              <w:left w:w="100" w:type="dxa"/>
+              <w:right w:w="100" w:type="dxa"/>
+            </w:tcMar>
           </w:tcPr>
           <w:p>
+            <w:pPr>
+              <w:spacing w:before="40" w:after="40"/>
+            </w:pPr>
             <w:r>
               <w:rPr>
-                <w:sz w:val="17"/>
-              </w:rPr>
-            </w:r>
-            <w:r>
-              <w:rPr>
-                <w:sz w:val="17"/>
+                <w:rFonts w:ascii="Calibri" w:hAnsi="Calibri"/>
+                <w:b w:val="0"/>
+                <w:i w:val="0"/>
+                <w:sz w:val="20"/>
               </w:rPr>
               <w:t>11/02/2026</w:t>
             </w:r>
@@ -259,21 +512,30 @@
         </w:tc>
       </w:tr>
       <w:tr>
+        <w:trPr>
+          <w:cantSplit w:val="1"/>
+        </w:trPr>
         <w:tc>
           <w:tcPr>
-            <w:tcW w:type="dxa" w:w="4873"/>
-            <w:shd w:val="clear" w:fill="EDF1F7"/>
+            <w:tcW w:type="dxa" w:w="4451"/>
+            <w:tcMar>
+              <w:top w:w="60" w:type="dxa"/>
+              <w:bottom w:w="60" w:type="dxa"/>
+              <w:left w:w="100" w:type="dxa"/>
+              <w:right w:w="100" w:type="dxa"/>
+            </w:tcMar>
+            <w:shd w:val="clear" w:color="auto" w:fill="F0F4F8"/>
           </w:tcPr>
           <w:p>
+            <w:pPr>
+              <w:spacing w:before="40" w:after="40"/>
+            </w:pPr>
             <w:r>
               <w:rPr>
-                <w:sz w:val="17"/>
-              </w:rPr>
-            </w:r>
-            <w:r>
-              <w:rPr>
+                <w:rFonts w:ascii="Calibri" w:hAnsi="Calibri"/>
                 <w:b/>
-                <w:sz w:val="17"/>
+                <w:i w:val="0"/>
+                <w:sz w:val="20"/>
               </w:rPr>
               <w:t>Horário</w:t>
             </w:r>
@@ -281,18 +543,24 @@
         </w:tc>
         <w:tc>
           <w:tcPr>
-            <w:tcW w:type="dxa" w:w="4873"/>
-            <w:shd w:val="clear" w:fill="EDF1F7"/>
+            <w:tcW w:type="dxa" w:w="4451"/>
+            <w:tcMar>
+              <w:top w:w="60" w:type="dxa"/>
+              <w:bottom w:w="60" w:type="dxa"/>
+              <w:left w:w="100" w:type="dxa"/>
+              <w:right w:w="100" w:type="dxa"/>
+            </w:tcMar>
           </w:tcPr>
           <w:p>
+            <w:pPr>
+              <w:spacing w:before="40" w:after="40"/>
+            </w:pPr>
             <w:r>
               <w:rPr>
-                <w:sz w:val="17"/>
-              </w:rPr>
-            </w:r>
-            <w:r>
-              <w:rPr>
-                <w:sz w:val="17"/>
+                <w:rFonts w:ascii="Calibri" w:hAnsi="Calibri"/>
+                <w:b w:val="0"/>
+                <w:i w:val="0"/>
+                <w:sz w:val="20"/>
               </w:rPr>
               <w:t>14h00 – 15h30</w:t>
             </w:r>
@@ -300,20 +568,30 @@
         </w:tc>
       </w:tr>
       <w:tr>
+        <w:trPr>
+          <w:cantSplit w:val="1"/>
+        </w:trPr>
         <w:tc>
           <w:tcPr>
-            <w:tcW w:type="dxa" w:w="4873"/>
+            <w:tcW w:type="dxa" w:w="4451"/>
+            <w:tcMar>
+              <w:top w:w="60" w:type="dxa"/>
+              <w:bottom w:w="60" w:type="dxa"/>
+              <w:left w:w="100" w:type="dxa"/>
+              <w:right w:w="100" w:type="dxa"/>
+            </w:tcMar>
+            <w:shd w:val="clear" w:color="auto" w:fill="F0F4F8"/>
           </w:tcPr>
           <w:p>
+            <w:pPr>
+              <w:spacing w:before="40" w:after="40"/>
+            </w:pPr>
             <w:r>
               <w:rPr>
-                <w:sz w:val="17"/>
-              </w:rPr>
-            </w:r>
-            <w:r>
-              <w:rPr>
+                <w:rFonts w:ascii="Calibri" w:hAnsi="Calibri"/>
                 <w:b/>
-                <w:sz w:val="17"/>
+                <w:i w:val="0"/>
+                <w:sz w:val="20"/>
               </w:rPr>
               <w:t>Canal</w:t>
             </w:r>
@@ -321,17 +599,24 @@
         </w:tc>
         <w:tc>
           <w:tcPr>
-            <w:tcW w:type="dxa" w:w="4873"/>
+            <w:tcW w:type="dxa" w:w="4451"/>
+            <w:tcMar>
+              <w:top w:w="60" w:type="dxa"/>
+              <w:bottom w:w="60" w:type="dxa"/>
+              <w:left w:w="100" w:type="dxa"/>
+              <w:right w:w="100" w:type="dxa"/>
+            </w:tcMar>
           </w:tcPr>
           <w:p>
+            <w:pPr>
+              <w:spacing w:before="40" w:after="40"/>
+            </w:pPr>
             <w:r>
               <w:rPr>
-                <w:sz w:val="17"/>
-              </w:rPr>
-            </w:r>
-            <w:r>
-              <w:rPr>
-                <w:sz w:val="17"/>
+                <w:rFonts w:ascii="Calibri" w:hAnsi="Calibri"/>
+                <w:b w:val="0"/>
+                <w:i w:val="0"/>
+                <w:sz w:val="20"/>
               </w:rPr>
               <w:t>Microsoft Teams</w:t>
             </w:r>
@@ -339,21 +624,30 @@
         </w:tc>
       </w:tr>
       <w:tr>
+        <w:trPr>
+          <w:cantSplit w:val="1"/>
+        </w:trPr>
         <w:tc>
           <w:tcPr>
-            <w:tcW w:type="dxa" w:w="4873"/>
-            <w:shd w:val="clear" w:fill="EDF1F7"/>
+            <w:tcW w:type="dxa" w:w="4451"/>
+            <w:tcMar>
+              <w:top w:w="60" w:type="dxa"/>
+              <w:bottom w:w="60" w:type="dxa"/>
+              <w:left w:w="100" w:type="dxa"/>
+              <w:right w:w="100" w:type="dxa"/>
+            </w:tcMar>
+            <w:shd w:val="clear" w:color="auto" w:fill="F0F4F8"/>
           </w:tcPr>
           <w:p>
+            <w:pPr>
+              <w:spacing w:before="40" w:after="40"/>
+            </w:pPr>
             <w:r>
               <w:rPr>
-                <w:sz w:val="17"/>
-              </w:rPr>
-            </w:r>
-            <w:r>
-              <w:rPr>
+                <w:rFonts w:ascii="Calibri" w:hAnsi="Calibri"/>
                 <w:b/>
-                <w:sz w:val="17"/>
+                <w:i w:val="0"/>
+                <w:sz w:val="20"/>
               </w:rPr>
               <w:t>Facilitador</w:t>
             </w:r>
@@ -361,18 +655,24 @@
         </w:tc>
         <w:tc>
           <w:tcPr>
-            <w:tcW w:type="dxa" w:w="4873"/>
-            <w:shd w:val="clear" w:fill="EDF1F7"/>
+            <w:tcW w:type="dxa" w:w="4451"/>
+            <w:tcMar>
+              <w:top w:w="60" w:type="dxa"/>
+              <w:bottom w:w="60" w:type="dxa"/>
+              <w:left w:w="100" w:type="dxa"/>
+              <w:right w:w="100" w:type="dxa"/>
+            </w:tcMar>
           </w:tcPr>
           <w:p>
+            <w:pPr>
+              <w:spacing w:before="40" w:after="40"/>
+            </w:pPr>
             <w:r>
               <w:rPr>
-                <w:sz w:val="17"/>
-              </w:rPr>
-            </w:r>
-            <w:r>
-              <w:rPr>
-                <w:sz w:val="17"/>
+                <w:rFonts w:ascii="Calibri" w:hAnsi="Calibri"/>
+                <w:b w:val="0"/>
+                <w:i w:val="0"/>
+                <w:sz w:val="20"/>
               </w:rPr>
               <w:t>Cézar Velazquez (Tech Lead / Arquiteto)</w:t>
             </w:r>
@@ -380,20 +680,30 @@
         </w:tc>
       </w:tr>
       <w:tr>
+        <w:trPr>
+          <w:cantSplit w:val="1"/>
+        </w:trPr>
         <w:tc>
           <w:tcPr>
-            <w:tcW w:type="dxa" w:w="4873"/>
+            <w:tcW w:type="dxa" w:w="4451"/>
+            <w:tcMar>
+              <w:top w:w="60" w:type="dxa"/>
+              <w:bottom w:w="60" w:type="dxa"/>
+              <w:left w:w="100" w:type="dxa"/>
+              <w:right w:w="100" w:type="dxa"/>
+            </w:tcMar>
+            <w:shd w:val="clear" w:color="auto" w:fill="F0F4F8"/>
           </w:tcPr>
           <w:p>
+            <w:pPr>
+              <w:spacing w:before="40" w:after="40"/>
+            </w:pPr>
             <w:r>
               <w:rPr>
-                <w:sz w:val="17"/>
-              </w:rPr>
-            </w:r>
-            <w:r>
-              <w:rPr>
+                <w:rFonts w:ascii="Calibri" w:hAnsi="Calibri"/>
                 <w:b/>
-                <w:sz w:val="17"/>
+                <w:i w:val="0"/>
+                <w:sz w:val="20"/>
               </w:rPr>
               <w:t>Versão</w:t>
             </w:r>
@@ -401,19 +711,26 @@
         </w:tc>
         <w:tc>
           <w:tcPr>
-            <w:tcW w:type="dxa" w:w="4873"/>
+            <w:tcW w:type="dxa" w:w="4451"/>
+            <w:tcMar>
+              <w:top w:w="60" w:type="dxa"/>
+              <w:bottom w:w="60" w:type="dxa"/>
+              <w:left w:w="100" w:type="dxa"/>
+              <w:right w:w="100" w:type="dxa"/>
+            </w:tcMar>
           </w:tcPr>
           <w:p>
+            <w:pPr>
+              <w:spacing w:before="40" w:after="40"/>
+            </w:pPr>
             <w:r>
               <w:rPr>
-                <w:sz w:val="17"/>
+                <w:rFonts w:ascii="Calibri" w:hAnsi="Calibri"/>
+                <w:b w:val="0"/>
+                <w:i w:val="0"/>
+                <w:sz w:val="20"/>
               </w:rPr>
-            </w:r>
-            <w:r>
-              <w:rPr>
-                <w:sz w:val="17"/>
-              </w:rPr>
-              <w:t>1.0</w:t>
+              <w:t>1.1</w:t>
             </w:r>
           </w:p>
         </w:tc>
@@ -421,44 +738,66 @@
     </w:tbl>
     <w:p>
       <w:pPr>
+        <w:spacing w:before="0" w:after="160"/>
+      </w:pPr>
+    </w:p>
+    <w:p>
+      <w:pPr>
+        <w:pStyle w:val="Heading1"/>
+        <w:keepNext/>
+        <w:keepLines/>
         <w:pBdr>
-          <w:bottom w:val="single" w:sz="6" w:space="3" w:color="1F3B73"/>
+          <w:bottom w:val="single" w:sz="4" w:space="2" w:color="D6E4F0"/>
         </w:pBdr>
       </w:pPr>
       <w:r>
-        <w:rPr>
-          <w:b/>
-          <w:color w:val="1F3B73"/>
-          <w:sz w:val="27"/>
-        </w:rPr>
         <w:t>1. Participantes</w:t>
       </w:r>
     </w:p>
     <w:tbl>
       <w:tblPr>
-        <w:tblStyle w:val="TableGrid"/>
         <w:tblW w:type="auto" w:w="0"/>
-        <w:jc w:val="center"/>
         <w:tblLook w:firstColumn="1" w:firstRow="1" w:lastColumn="0" w:lastRow="0" w:noHBand="0" w:noVBand="1" w:val="04A0"/>
+        <w:tblBorders>
+          <w:top w:val="single" w:sz="4" w:space="0" w:color="003366"/>
+          <w:left w:val="single" w:sz="4" w:space="0" w:color="003366"/>
+          <w:bottom w:val="single" w:sz="4" w:space="0" w:color="003366"/>
+          <w:right w:val="single" w:sz="4" w:space="0" w:color="003366"/>
+          <w:insideH w:val="single" w:sz="4" w:space="0" w:color="003366"/>
+          <w:insideV w:val="single" w:sz="4" w:space="0" w:color="003366"/>
+        </w:tblBorders>
       </w:tblPr>
       <w:tblGrid>
-        <w:gridCol w:w="3249"/>
-        <w:gridCol w:w="3249"/>
-        <w:gridCol w:w="3249"/>
+        <w:gridCol w:w="2967"/>
+        <w:gridCol w:w="2967"/>
+        <w:gridCol w:w="2967"/>
       </w:tblGrid>
       <w:tr>
+        <w:trPr>
+          <w:cantSplit w:val="1"/>
+        </w:trPr>
         <w:tc>
           <w:tcPr>
-            <w:tcW w:type="dxa" w:w="3249"/>
-            <w:shd w:val="clear" w:fill="1F3B73"/>
+            <w:tcW w:type="dxa" w:w="2967"/>
+            <w:tcMar>
+              <w:top w:w="60" w:type="dxa"/>
+              <w:bottom w:w="60" w:type="dxa"/>
+              <w:left w:w="100" w:type="dxa"/>
+              <w:right w:w="100" w:type="dxa"/>
+            </w:tcMar>
+            <w:shd w:val="clear" w:color="auto" w:fill="003366"/>
           </w:tcPr>
           <w:p>
-            <w:r/>
+            <w:pPr>
+              <w:spacing w:before="40" w:after="40"/>
+            </w:pPr>
             <w:r>
               <w:rPr>
+                <w:rFonts w:ascii="Calibri" w:hAnsi="Calibri"/>
                 <w:b/>
+                <w:i w:val="0"/>
                 <w:color w:val="FFFFFF"/>
-                <w:sz w:val="18"/>
+                <w:sz w:val="20"/>
               </w:rPr>
               <w:t>Nome</w:t>
             </w:r>
@@ -466,16 +805,26 @@
         </w:tc>
         <w:tc>
           <w:tcPr>
-            <w:tcW w:type="dxa" w:w="3249"/>
-            <w:shd w:val="clear" w:fill="1F3B73"/>
+            <w:tcW w:type="dxa" w:w="2967"/>
+            <w:tcMar>
+              <w:top w:w="60" w:type="dxa"/>
+              <w:bottom w:w="60" w:type="dxa"/>
+              <w:left w:w="100" w:type="dxa"/>
+              <w:right w:w="100" w:type="dxa"/>
+            </w:tcMar>
+            <w:shd w:val="clear" w:color="auto" w:fill="003366"/>
           </w:tcPr>
           <w:p>
-            <w:r/>
+            <w:pPr>
+              <w:spacing w:before="40" w:after="40"/>
+            </w:pPr>
             <w:r>
               <w:rPr>
+                <w:rFonts w:ascii="Calibri" w:hAnsi="Calibri"/>
                 <w:b/>
+                <w:i w:val="0"/>
                 <w:color w:val="FFFFFF"/>
-                <w:sz w:val="18"/>
+                <w:sz w:val="20"/>
               </w:rPr>
               <w:t>Papel</w:t>
             </w:r>
@@ -483,16 +832,26 @@
         </w:tc>
         <w:tc>
           <w:tcPr>
-            <w:tcW w:type="dxa" w:w="3249"/>
-            <w:shd w:val="clear" w:fill="1F3B73"/>
+            <w:tcW w:type="dxa" w:w="2967"/>
+            <w:tcMar>
+              <w:top w:w="60" w:type="dxa"/>
+              <w:bottom w:w="60" w:type="dxa"/>
+              <w:left w:w="100" w:type="dxa"/>
+              <w:right w:w="100" w:type="dxa"/>
+            </w:tcMar>
+            <w:shd w:val="clear" w:color="auto" w:fill="003366"/>
           </w:tcPr>
           <w:p>
-            <w:r/>
+            <w:pPr>
+              <w:spacing w:before="40" w:after="40"/>
+            </w:pPr>
             <w:r>
               <w:rPr>
+                <w:rFonts w:ascii="Calibri" w:hAnsi="Calibri"/>
                 <w:b/>
+                <w:i w:val="0"/>
                 <w:color w:val="FFFFFF"/>
-                <w:sz w:val="18"/>
+                <w:sz w:val="20"/>
               </w:rPr>
               <w:t>Presença</w:t>
             </w:r>
@@ -500,19 +859,30 @@
         </w:tc>
       </w:tr>
       <w:tr>
+        <w:trPr>
+          <w:cantSplit w:val="1"/>
+        </w:trPr>
         <w:tc>
           <w:tcPr>
-            <w:tcW w:type="dxa" w:w="3249"/>
+            <w:tcW w:type="dxa" w:w="2967"/>
+            <w:tcMar>
+              <w:top w:w="60" w:type="dxa"/>
+              <w:bottom w:w="60" w:type="dxa"/>
+              <w:left w:w="100" w:type="dxa"/>
+              <w:right w:w="100" w:type="dxa"/>
+            </w:tcMar>
+            <w:shd w:val="clear" w:color="auto" w:fill="EBF5FB"/>
           </w:tcPr>
           <w:p>
+            <w:pPr>
+              <w:spacing w:before="40" w:after="40"/>
+            </w:pPr>
             <w:r>
               <w:rPr>
-                <w:sz w:val="17"/>
-              </w:rPr>
-            </w:r>
-            <w:r>
-              <w:rPr>
-                <w:sz w:val="17"/>
+                <w:rFonts w:ascii="Calibri" w:hAnsi="Calibri"/>
+                <w:b w:val="0"/>
+                <w:i w:val="0"/>
+                <w:sz w:val="20"/>
               </w:rPr>
               <w:t>Abraão</w:t>
             </w:r>
@@ -520,17 +890,25 @@
         </w:tc>
         <w:tc>
           <w:tcPr>
-            <w:tcW w:type="dxa" w:w="3249"/>
+            <w:tcW w:type="dxa" w:w="2967"/>
+            <w:tcMar>
+              <w:top w:w="60" w:type="dxa"/>
+              <w:bottom w:w="60" w:type="dxa"/>
+              <w:left w:w="100" w:type="dxa"/>
+              <w:right w:w="100" w:type="dxa"/>
+            </w:tcMar>
+            <w:shd w:val="clear" w:color="auto" w:fill="EBF5FB"/>
           </w:tcPr>
           <w:p>
+            <w:pPr>
+              <w:spacing w:before="40" w:after="40"/>
+            </w:pPr>
             <w:r>
               <w:rPr>
-                <w:sz w:val="17"/>
-              </w:rPr>
-            </w:r>
-            <w:r>
-              <w:rPr>
-                <w:sz w:val="17"/>
+                <w:rFonts w:ascii="Calibri" w:hAnsi="Calibri"/>
+                <w:b w:val="0"/>
+                <w:i w:val="0"/>
+                <w:sz w:val="20"/>
               </w:rPr>
               <w:t>Gerente de Projeto / PO</w:t>
             </w:r>
@@ -538,17 +916,25 @@
         </w:tc>
         <w:tc>
           <w:tcPr>
-            <w:tcW w:type="dxa" w:w="3249"/>
+            <w:tcW w:type="dxa" w:w="2967"/>
+            <w:tcMar>
+              <w:top w:w="60" w:type="dxa"/>
+              <w:bottom w:w="60" w:type="dxa"/>
+              <w:left w:w="100" w:type="dxa"/>
+              <w:right w:w="100" w:type="dxa"/>
+            </w:tcMar>
+            <w:shd w:val="clear" w:color="auto" w:fill="EBF5FB"/>
           </w:tcPr>
           <w:p>
+            <w:pPr>
+              <w:spacing w:before="40" w:after="40"/>
+            </w:pPr>
             <w:r>
               <w:rPr>
-                <w:sz w:val="17"/>
-              </w:rPr>
-            </w:r>
-            <w:r>
-              <w:rPr>
-                <w:sz w:val="17"/>
+                <w:rFonts w:ascii="Calibri" w:hAnsi="Calibri"/>
+                <w:b w:val="0"/>
+                <w:i w:val="0"/>
+                <w:sz w:val="20"/>
               </w:rPr>
               <w:t>Presente</w:t>
             </w:r>
@@ -556,20 +942,29 @@
         </w:tc>
       </w:tr>
       <w:tr>
+        <w:trPr>
+          <w:cantSplit w:val="1"/>
+        </w:trPr>
         <w:tc>
           <w:tcPr>
-            <w:tcW w:type="dxa" w:w="3249"/>
-            <w:shd w:val="clear" w:fill="EDF1F7"/>
+            <w:tcW w:type="dxa" w:w="2967"/>
+            <w:tcMar>
+              <w:top w:w="60" w:type="dxa"/>
+              <w:bottom w:w="60" w:type="dxa"/>
+              <w:left w:w="100" w:type="dxa"/>
+              <w:right w:w="100" w:type="dxa"/>
+            </w:tcMar>
           </w:tcPr>
           <w:p>
+            <w:pPr>
+              <w:spacing w:before="40" w:after="40"/>
+            </w:pPr>
             <w:r>
               <w:rPr>
-                <w:sz w:val="17"/>
-              </w:rPr>
-            </w:r>
-            <w:r>
-              <w:rPr>
-                <w:sz w:val="17"/>
+                <w:rFonts w:ascii="Calibri" w:hAnsi="Calibri"/>
+                <w:b w:val="0"/>
+                <w:i w:val="0"/>
+                <w:sz w:val="20"/>
               </w:rPr>
               <w:t>Cézar Velazquez</w:t>
             </w:r>
@@ -577,18 +972,24 @@
         </w:tc>
         <w:tc>
           <w:tcPr>
-            <w:tcW w:type="dxa" w:w="3249"/>
-            <w:shd w:val="clear" w:fill="EDF1F7"/>
+            <w:tcW w:type="dxa" w:w="2967"/>
+            <w:tcMar>
+              <w:top w:w="60" w:type="dxa"/>
+              <w:bottom w:w="60" w:type="dxa"/>
+              <w:left w:w="100" w:type="dxa"/>
+              <w:right w:w="100" w:type="dxa"/>
+            </w:tcMar>
           </w:tcPr>
           <w:p>
+            <w:pPr>
+              <w:spacing w:before="40" w:after="40"/>
+            </w:pPr>
             <w:r>
               <w:rPr>
-                <w:sz w:val="17"/>
-              </w:rPr>
-            </w:r>
-            <w:r>
-              <w:rPr>
-                <w:sz w:val="17"/>
+                <w:rFonts w:ascii="Calibri" w:hAnsi="Calibri"/>
+                <w:b w:val="0"/>
+                <w:i w:val="0"/>
+                <w:sz w:val="20"/>
               </w:rPr>
               <w:t>Tech Lead / Arquiteto / DevOps</w:t>
             </w:r>
@@ -596,18 +997,24 @@
         </w:tc>
         <w:tc>
           <w:tcPr>
-            <w:tcW w:type="dxa" w:w="3249"/>
-            <w:shd w:val="clear" w:fill="EDF1F7"/>
+            <w:tcW w:type="dxa" w:w="2967"/>
+            <w:tcMar>
+              <w:top w:w="60" w:type="dxa"/>
+              <w:bottom w:w="60" w:type="dxa"/>
+              <w:left w:w="100" w:type="dxa"/>
+              <w:right w:w="100" w:type="dxa"/>
+            </w:tcMar>
           </w:tcPr>
           <w:p>
+            <w:pPr>
+              <w:spacing w:before="40" w:after="40"/>
+            </w:pPr>
             <w:r>
               <w:rPr>
-                <w:sz w:val="17"/>
-              </w:rPr>
-            </w:r>
-            <w:r>
-              <w:rPr>
-                <w:sz w:val="17"/>
+                <w:rFonts w:ascii="Calibri" w:hAnsi="Calibri"/>
+                <w:b w:val="0"/>
+                <w:i w:val="0"/>
+                <w:sz w:val="20"/>
               </w:rPr>
               <w:t>Presente (facilitador)</w:t>
             </w:r>
@@ -615,19 +1022,30 @@
         </w:tc>
       </w:tr>
       <w:tr>
+        <w:trPr>
+          <w:cantSplit w:val="1"/>
+        </w:trPr>
         <w:tc>
           <w:tcPr>
-            <w:tcW w:type="dxa" w:w="3249"/>
+            <w:tcW w:type="dxa" w:w="2967"/>
+            <w:tcMar>
+              <w:top w:w="60" w:type="dxa"/>
+              <w:bottom w:w="60" w:type="dxa"/>
+              <w:left w:w="100" w:type="dxa"/>
+              <w:right w:w="100" w:type="dxa"/>
+            </w:tcMar>
+            <w:shd w:val="clear" w:color="auto" w:fill="EBF5FB"/>
           </w:tcPr>
           <w:p>
+            <w:pPr>
+              <w:spacing w:before="40" w:after="40"/>
+            </w:pPr>
             <w:r>
               <w:rPr>
-                <w:sz w:val="17"/>
-              </w:rPr>
-            </w:r>
-            <w:r>
-              <w:rPr>
-                <w:sz w:val="17"/>
+                <w:rFonts w:ascii="Calibri" w:hAnsi="Calibri"/>
+                <w:b w:val="0"/>
+                <w:i w:val="0"/>
+                <w:sz w:val="20"/>
               </w:rPr>
               <w:t>Felipe Santos</w:t>
             </w:r>
@@ -635,17 +1053,25 @@
         </w:tc>
         <w:tc>
           <w:tcPr>
-            <w:tcW w:type="dxa" w:w="3249"/>
+            <w:tcW w:type="dxa" w:w="2967"/>
+            <w:tcMar>
+              <w:top w:w="60" w:type="dxa"/>
+              <w:bottom w:w="60" w:type="dxa"/>
+              <w:left w:w="100" w:type="dxa"/>
+              <w:right w:w="100" w:type="dxa"/>
+            </w:tcMar>
+            <w:shd w:val="clear" w:color="auto" w:fill="EBF5FB"/>
           </w:tcPr>
           <w:p>
+            <w:pPr>
+              <w:spacing w:before="40" w:after="40"/>
+            </w:pPr>
             <w:r>
               <w:rPr>
-                <w:sz w:val="17"/>
-              </w:rPr>
-            </w:r>
-            <w:r>
-              <w:rPr>
-                <w:sz w:val="17"/>
+                <w:rFonts w:ascii="Calibri" w:hAnsi="Calibri"/>
+                <w:b w:val="0"/>
+                <w:i w:val="0"/>
+                <w:sz w:val="20"/>
               </w:rPr>
               <w:t>Dev (Backend / Crawlers)</w:t>
             </w:r>
@@ -653,17 +1079,25 @@
         </w:tc>
         <w:tc>
           <w:tcPr>
-            <w:tcW w:type="dxa" w:w="3249"/>
+            <w:tcW w:type="dxa" w:w="2967"/>
+            <w:tcMar>
+              <w:top w:w="60" w:type="dxa"/>
+              <w:bottom w:w="60" w:type="dxa"/>
+              <w:left w:w="100" w:type="dxa"/>
+              <w:right w:w="100" w:type="dxa"/>
+            </w:tcMar>
+            <w:shd w:val="clear" w:color="auto" w:fill="EBF5FB"/>
           </w:tcPr>
           <w:p>
+            <w:pPr>
+              <w:spacing w:before="40" w:after="40"/>
+            </w:pPr>
             <w:r>
               <w:rPr>
-                <w:sz w:val="17"/>
-              </w:rPr>
-            </w:r>
-            <w:r>
-              <w:rPr>
-                <w:sz w:val="17"/>
+                <w:rFonts w:ascii="Calibri" w:hAnsi="Calibri"/>
+                <w:b w:val="0"/>
+                <w:i w:val="0"/>
+                <w:sz w:val="20"/>
               </w:rPr>
               <w:t>Presente</w:t>
             </w:r>
@@ -671,20 +1105,29 @@
         </w:tc>
       </w:tr>
       <w:tr>
+        <w:trPr>
+          <w:cantSplit w:val="1"/>
+        </w:trPr>
         <w:tc>
           <w:tcPr>
-            <w:tcW w:type="dxa" w:w="3249"/>
-            <w:shd w:val="clear" w:fill="EDF1F7"/>
+            <w:tcW w:type="dxa" w:w="2967"/>
+            <w:tcMar>
+              <w:top w:w="60" w:type="dxa"/>
+              <w:bottom w:w="60" w:type="dxa"/>
+              <w:left w:w="100" w:type="dxa"/>
+              <w:right w:w="100" w:type="dxa"/>
+            </w:tcMar>
           </w:tcPr>
           <w:p>
+            <w:pPr>
+              <w:spacing w:before="40" w:after="40"/>
+            </w:pPr>
             <w:r>
               <w:rPr>
-                <w:sz w:val="17"/>
-              </w:rPr>
-            </w:r>
-            <w:r>
-              <w:rPr>
-                <w:sz w:val="17"/>
+                <w:rFonts w:ascii="Calibri" w:hAnsi="Calibri"/>
+                <w:b w:val="0"/>
+                <w:i w:val="0"/>
+                <w:sz w:val="20"/>
               </w:rPr>
               <w:t>Lucas Batista</w:t>
             </w:r>
@@ -692,18 +1135,24 @@
         </w:tc>
         <w:tc>
           <w:tcPr>
-            <w:tcW w:type="dxa" w:w="3249"/>
-            <w:shd w:val="clear" w:fill="EDF1F7"/>
+            <w:tcW w:type="dxa" w:w="2967"/>
+            <w:tcMar>
+              <w:top w:w="60" w:type="dxa"/>
+              <w:bottom w:w="60" w:type="dxa"/>
+              <w:left w:w="100" w:type="dxa"/>
+              <w:right w:w="100" w:type="dxa"/>
+            </w:tcMar>
           </w:tcPr>
           <w:p>
+            <w:pPr>
+              <w:spacing w:before="40" w:after="40"/>
+            </w:pPr>
             <w:r>
               <w:rPr>
-                <w:sz w:val="17"/>
-              </w:rPr>
-            </w:r>
-            <w:r>
-              <w:rPr>
-                <w:sz w:val="17"/>
+                <w:rFonts w:ascii="Calibri" w:hAnsi="Calibri"/>
+                <w:b w:val="0"/>
+                <w:i w:val="0"/>
+                <w:sz w:val="20"/>
               </w:rPr>
               <w:t>Dev (Full Stack)</w:t>
             </w:r>
@@ -711,18 +1160,24 @@
         </w:tc>
         <w:tc>
           <w:tcPr>
-            <w:tcW w:type="dxa" w:w="3249"/>
-            <w:shd w:val="clear" w:fill="EDF1F7"/>
+            <w:tcW w:type="dxa" w:w="2967"/>
+            <w:tcMar>
+              <w:top w:w="60" w:type="dxa"/>
+              <w:bottom w:w="60" w:type="dxa"/>
+              <w:left w:w="100" w:type="dxa"/>
+              <w:right w:w="100" w:type="dxa"/>
+            </w:tcMar>
           </w:tcPr>
           <w:p>
+            <w:pPr>
+              <w:spacing w:before="40" w:after="40"/>
+            </w:pPr>
             <w:r>
               <w:rPr>
-                <w:sz w:val="17"/>
-              </w:rPr>
-            </w:r>
-            <w:r>
-              <w:rPr>
-                <w:sz w:val="17"/>
+                <w:rFonts w:ascii="Calibri" w:hAnsi="Calibri"/>
+                <w:b w:val="0"/>
+                <w:i w:val="0"/>
+                <w:sz w:val="20"/>
               </w:rPr>
               <w:t>Presente</w:t>
             </w:r>
@@ -730,19 +1185,30 @@
         </w:tc>
       </w:tr>
       <w:tr>
+        <w:trPr>
+          <w:cantSplit w:val="1"/>
+        </w:trPr>
         <w:tc>
           <w:tcPr>
-            <w:tcW w:type="dxa" w:w="3249"/>
+            <w:tcW w:type="dxa" w:w="2967"/>
+            <w:tcMar>
+              <w:top w:w="60" w:type="dxa"/>
+              <w:bottom w:w="60" w:type="dxa"/>
+              <w:left w:w="100" w:type="dxa"/>
+              <w:right w:w="100" w:type="dxa"/>
+            </w:tcMar>
+            <w:shd w:val="clear" w:color="auto" w:fill="EBF5FB"/>
           </w:tcPr>
           <w:p>
+            <w:pPr>
+              <w:spacing w:before="40" w:after="40"/>
+            </w:pPr>
             <w:r>
               <w:rPr>
-                <w:sz w:val="17"/>
-              </w:rPr>
-            </w:r>
-            <w:r>
-              <w:rPr>
-                <w:sz w:val="17"/>
+                <w:rFonts w:ascii="Calibri" w:hAnsi="Calibri"/>
+                <w:b w:val="0"/>
+                <w:i w:val="0"/>
+                <w:sz w:val="20"/>
               </w:rPr>
               <w:t>Henry Oliveira</w:t>
             </w:r>
@@ -750,17 +1216,25 @@
         </w:tc>
         <w:tc>
           <w:tcPr>
-            <w:tcW w:type="dxa" w:w="3249"/>
+            <w:tcW w:type="dxa" w:w="2967"/>
+            <w:tcMar>
+              <w:top w:w="60" w:type="dxa"/>
+              <w:bottom w:w="60" w:type="dxa"/>
+              <w:left w:w="100" w:type="dxa"/>
+              <w:right w:w="100" w:type="dxa"/>
+            </w:tcMar>
+            <w:shd w:val="clear" w:color="auto" w:fill="EBF5FB"/>
           </w:tcPr>
           <w:p>
+            <w:pPr>
+              <w:spacing w:before="40" w:after="40"/>
+            </w:pPr>
             <w:r>
               <w:rPr>
-                <w:sz w:val="17"/>
-              </w:rPr>
-            </w:r>
-            <w:r>
-              <w:rPr>
-                <w:sz w:val="17"/>
+                <w:rFonts w:ascii="Calibri" w:hAnsi="Calibri"/>
+                <w:b w:val="0"/>
+                <w:i w:val="0"/>
+                <w:sz w:val="20"/>
               </w:rPr>
               <w:t>Dev (Full Stack)</w:t>
             </w:r>
@@ -768,17 +1242,25 @@
         </w:tc>
         <w:tc>
           <w:tcPr>
-            <w:tcW w:type="dxa" w:w="3249"/>
+            <w:tcW w:type="dxa" w:w="2967"/>
+            <w:tcMar>
+              <w:top w:w="60" w:type="dxa"/>
+              <w:bottom w:w="60" w:type="dxa"/>
+              <w:left w:w="100" w:type="dxa"/>
+              <w:right w:w="100" w:type="dxa"/>
+            </w:tcMar>
+            <w:shd w:val="clear" w:color="auto" w:fill="EBF5FB"/>
           </w:tcPr>
           <w:p>
+            <w:pPr>
+              <w:spacing w:before="40" w:after="40"/>
+            </w:pPr>
             <w:r>
               <w:rPr>
-                <w:sz w:val="17"/>
-              </w:rPr>
-            </w:r>
-            <w:r>
-              <w:rPr>
-                <w:sz w:val="17"/>
+                <w:rFonts w:ascii="Calibri" w:hAnsi="Calibri"/>
+                <w:b w:val="0"/>
+                <w:i w:val="0"/>
+                <w:sz w:val="20"/>
               </w:rPr>
               <w:t>Presente</w:t>
             </w:r>
@@ -787,122 +1269,189 @@
       </w:tr>
     </w:tbl>
     <w:p>
+      <w:pPr>
+        <w:spacing w:before="0" w:after="160"/>
+      </w:pPr>
+    </w:p>
+    <w:p>
+      <w:pPr>
+        <w:spacing w:before="40" w:after="120"/>
+        <w:ind w:left="454"/>
+        <w:pBdr>
+          <w:left w:val="single" w:sz="12" w:space="8" w:color="003366"/>
+        </w:pBdr>
+      </w:pPr>
       <w:r>
         <w:rPr>
-          <w:i/>
-          <w:color w:val="444444"/>
+          <w:rFonts w:ascii="Calibri" w:hAnsi="Calibri"/>
+          <w:b w:val="0"/>
+          <w:i w:val="0"/>
+          <w:color w:val="1A5276"/>
+          <w:sz w:val="22"/>
         </w:rPr>
         <w:t xml:space="preserve">A aprovação da arquitetura é responsabilidade conjunta do </w:t>
       </w:r>
       <w:r>
         <w:rPr>
+          <w:rFonts w:ascii="Calibri" w:hAnsi="Calibri"/>
           <w:b/>
-          <w:i/>
-          <w:color w:val="444444"/>
+          <w:i w:val="0"/>
+          <w:color w:val="1A5276"/>
+          <w:sz w:val="22"/>
         </w:rPr>
         <w:t>Gerente de Projeto / PO (Abraão)</w:t>
       </w:r>
       <w:r>
         <w:rPr>
-          <w:i/>
-          <w:color w:val="444444"/>
+          <w:rFonts w:ascii="Calibri" w:hAnsi="Calibri"/>
+          <w:b w:val="0"/>
+          <w:i w:val="0"/>
+          <w:color w:val="1A5276"/>
+          <w:sz w:val="22"/>
         </w:rPr>
         <w:t xml:space="preserve"> e do </w:t>
       </w:r>
       <w:r>
         <w:rPr>
+          <w:rFonts w:ascii="Calibri" w:hAnsi="Calibri"/>
           <w:b/>
-          <w:i/>
-          <w:color w:val="444444"/>
+          <w:i w:val="0"/>
+          <w:color w:val="1A5276"/>
+          <w:sz w:val="22"/>
         </w:rPr>
         <w:t>Tech Lead / Arquiteto (Cézar Velazquez)</w:t>
       </w:r>
       <w:r>
         <w:rPr>
-          <w:i/>
-          <w:color w:val="444444"/>
+          <w:rFonts w:ascii="Calibri" w:hAnsi="Calibri"/>
+          <w:b w:val="0"/>
+          <w:i w:val="0"/>
+          <w:color w:val="1A5276"/>
+          <w:sz w:val="22"/>
         </w:rPr>
         <w:t>; os desenvolvedores participam como apoio técnico. A QA (Jonathan Alves) e a GQA independente (Carol/Caroline) não participam da decisão de arquitetura.</w:t>
       </w:r>
     </w:p>
     <w:p>
       <w:pPr>
+        <w:pStyle w:val="Heading1"/>
+        <w:keepNext/>
+        <w:keepLines/>
         <w:pBdr>
-          <w:bottom w:val="single" w:sz="6" w:space="3" w:color="1F3B73"/>
+          <w:bottom w:val="single" w:sz="4" w:space="2" w:color="D6E4F0"/>
         </w:pBdr>
       </w:pPr>
       <w:r>
-        <w:rPr>
-          <w:b/>
-          <w:color w:val="1F3B73"/>
-          <w:sz w:val="27"/>
-        </w:rPr>
         <w:t>2. Objetivo</w:t>
       </w:r>
     </w:p>
     <w:p>
+      <w:pPr>
+        <w:spacing w:before="0" w:after="120"/>
+      </w:pPr>
       <w:r>
+        <w:rPr>
+          <w:rFonts w:ascii="Calibri" w:hAnsi="Calibri"/>
+          <w:b w:val="0"/>
+          <w:i w:val="0"/>
+          <w:sz w:val="22"/>
+        </w:rPr>
         <w:t xml:space="preserve">Revisar e </w:t>
       </w:r>
       <w:r>
         <w:rPr>
+          <w:rFonts w:ascii="Calibri" w:hAnsi="Calibri"/>
           <w:b/>
+          <w:i w:val="0"/>
+          <w:sz w:val="22"/>
         </w:rPr>
         <w:t>aprovar formalmente a arquitetura técnica</w:t>
       </w:r>
       <w:r>
+        <w:rPr>
+          <w:rFonts w:ascii="Calibri" w:hAnsi="Calibri"/>
+          <w:b w:val="0"/>
+          <w:i w:val="0"/>
+          <w:sz w:val="22"/>
+        </w:rPr>
         <w:t xml:space="preserve"> da plataforma MilhasFacil antes do início do desenvolvimento incremental, conforme o processo de Projeto e Construção do Produto (PCP) e a Gerência de Decisões (GDE). A arquitetura aprovada é a baseline de design registrada em </w:t>
       </w:r>
       <w:r>
         <w:rPr>
+          <w:rFonts w:ascii="Calibri" w:hAnsi="Calibri"/>
           <w:b/>
+          <w:i w:val="0"/>
+          <w:sz w:val="22"/>
         </w:rPr>
         <w:t>PCP-MILHASFACIL01-001</w:t>
       </w:r>
       <w:r>
+        <w:rPr>
+          <w:rFonts w:ascii="Calibri" w:hAnsi="Calibri"/>
+          <w:b w:val="0"/>
+          <w:i w:val="0"/>
+          <w:sz w:val="22"/>
+        </w:rPr>
         <w:t>.</w:t>
       </w:r>
     </w:p>
     <w:p>
       <w:pPr>
+        <w:pStyle w:val="Heading1"/>
+        <w:keepNext/>
+        <w:keepLines/>
         <w:pBdr>
-          <w:bottom w:val="single" w:sz="6" w:space="3" w:color="1F3B73"/>
+          <w:bottom w:val="single" w:sz="4" w:space="2" w:color="D6E4F0"/>
         </w:pBdr>
       </w:pPr>
       <w:r>
-        <w:rPr>
-          <w:b/>
-          <w:color w:val="1F3B73"/>
-          <w:sz w:val="27"/>
-        </w:rPr>
         <w:t>3. Escopo da aprovação de design</w:t>
       </w:r>
     </w:p>
     <w:tbl>
       <w:tblPr>
-        <w:tblStyle w:val="TableGrid"/>
         <w:tblW w:type="auto" w:w="0"/>
-        <w:jc w:val="center"/>
         <w:tblLook w:firstColumn="1" w:firstRow="1" w:lastColumn="0" w:lastRow="0" w:noHBand="0" w:noVBand="1" w:val="04A0"/>
+        <w:tblBorders>
+          <w:top w:val="single" w:sz="4" w:space="0" w:color="003366"/>
+          <w:left w:val="single" w:sz="4" w:space="0" w:color="003366"/>
+          <w:bottom w:val="single" w:sz="4" w:space="0" w:color="003366"/>
+          <w:right w:val="single" w:sz="4" w:space="0" w:color="003366"/>
+          <w:insideH w:val="single" w:sz="4" w:space="0" w:color="003366"/>
+          <w:insideV w:val="single" w:sz="4" w:space="0" w:color="003366"/>
+        </w:tblBorders>
       </w:tblPr>
       <w:tblGrid>
-        <w:gridCol w:w="3249"/>
-        <w:gridCol w:w="3249"/>
-        <w:gridCol w:w="3249"/>
+        <w:gridCol w:w="2967"/>
+        <w:gridCol w:w="2967"/>
+        <w:gridCol w:w="2967"/>
       </w:tblGrid>
       <w:tr>
+        <w:trPr>
+          <w:cantSplit w:val="1"/>
+        </w:trPr>
         <w:tc>
           <w:tcPr>
-            <w:tcW w:type="dxa" w:w="3249"/>
-            <w:shd w:val="clear" w:fill="1F3B73"/>
+            <w:tcW w:type="dxa" w:w="2967"/>
+            <w:tcMar>
+              <w:top w:w="60" w:type="dxa"/>
+              <w:bottom w:w="60" w:type="dxa"/>
+              <w:left w:w="100" w:type="dxa"/>
+              <w:right w:w="100" w:type="dxa"/>
+            </w:tcMar>
+            <w:shd w:val="clear" w:color="auto" w:fill="003366"/>
           </w:tcPr>
           <w:p>
-            <w:r/>
+            <w:pPr>
+              <w:spacing w:before="40" w:after="40"/>
+            </w:pPr>
             <w:r>
               <w:rPr>
+                <w:rFonts w:ascii="Calibri" w:hAnsi="Calibri"/>
                 <w:b/>
+                <w:i w:val="0"/>
                 <w:color w:val="FFFFFF"/>
-                <w:sz w:val="18"/>
+                <w:sz w:val="20"/>
               </w:rPr>
               <w:t>Item de design</w:t>
             </w:r>
@@ -910,16 +1459,26 @@
         </w:tc>
         <w:tc>
           <w:tcPr>
-            <w:tcW w:type="dxa" w:w="3249"/>
-            <w:shd w:val="clear" w:fill="1F3B73"/>
+            <w:tcW w:type="dxa" w:w="2967"/>
+            <w:tcMar>
+              <w:top w:w="60" w:type="dxa"/>
+              <w:bottom w:w="60" w:type="dxa"/>
+              <w:left w:w="100" w:type="dxa"/>
+              <w:right w:w="100" w:type="dxa"/>
+            </w:tcMar>
+            <w:shd w:val="clear" w:color="auto" w:fill="003366"/>
           </w:tcPr>
           <w:p>
-            <w:r/>
+            <w:pPr>
+              <w:spacing w:before="40" w:after="40"/>
+            </w:pPr>
             <w:r>
               <w:rPr>
+                <w:rFonts w:ascii="Calibri" w:hAnsi="Calibri"/>
                 <w:b/>
+                <w:i w:val="0"/>
                 <w:color w:val="FFFFFF"/>
-                <w:sz w:val="18"/>
+                <w:sz w:val="20"/>
               </w:rPr>
               <w:t>Aplicável?</w:t>
             </w:r>
@@ -927,16 +1486,26 @@
         </w:tc>
         <w:tc>
           <w:tcPr>
-            <w:tcW w:type="dxa" w:w="3249"/>
-            <w:shd w:val="clear" w:fill="1F3B73"/>
+            <w:tcW w:type="dxa" w:w="2967"/>
+            <w:tcMar>
+              <w:top w:w="60" w:type="dxa"/>
+              <w:bottom w:w="60" w:type="dxa"/>
+              <w:left w:w="100" w:type="dxa"/>
+              <w:right w:w="100" w:type="dxa"/>
+            </w:tcMar>
+            <w:shd w:val="clear" w:color="auto" w:fill="003366"/>
           </w:tcPr>
           <w:p>
-            <w:r/>
+            <w:pPr>
+              <w:spacing w:before="40" w:after="40"/>
+            </w:pPr>
             <w:r>
               <w:rPr>
+                <w:rFonts w:ascii="Calibri" w:hAnsi="Calibri"/>
                 <w:b/>
+                <w:i w:val="0"/>
                 <w:color w:val="FFFFFF"/>
-                <w:sz w:val="18"/>
+                <w:sz w:val="20"/>
               </w:rPr>
               <w:t>Decisão</w:t>
             </w:r>
@@ -944,26 +1513,39 @@
         </w:tc>
       </w:tr>
       <w:tr>
+        <w:trPr>
+          <w:cantSplit w:val="1"/>
+        </w:trPr>
         <w:tc>
           <w:tcPr>
-            <w:tcW w:type="dxa" w:w="3249"/>
+            <w:tcW w:type="dxa" w:w="2967"/>
+            <w:tcMar>
+              <w:top w:w="60" w:type="dxa"/>
+              <w:bottom w:w="60" w:type="dxa"/>
+              <w:left w:w="100" w:type="dxa"/>
+              <w:right w:w="100" w:type="dxa"/>
+            </w:tcMar>
+            <w:shd w:val="clear" w:color="auto" w:fill="EBF5FB"/>
           </w:tcPr>
           <w:p>
+            <w:pPr>
+              <w:spacing w:before="40" w:after="40"/>
+            </w:pPr>
             <w:r>
               <w:rPr>
-                <w:sz w:val="17"/>
-              </w:rPr>
-            </w:r>
-            <w:r>
-              <w:rPr>
+                <w:rFonts w:ascii="Calibri" w:hAnsi="Calibri"/>
                 <w:b/>
-                <w:sz w:val="17"/>
+                <w:i w:val="0"/>
+                <w:sz w:val="20"/>
               </w:rPr>
               <w:t>Arquitetura técnica</w:t>
             </w:r>
             <w:r>
               <w:rPr>
-                <w:sz w:val="17"/>
+                <w:rFonts w:ascii="Calibri" w:hAnsi="Calibri"/>
+                <w:b w:val="0"/>
+                <w:i w:val="0"/>
+                <w:sz w:val="20"/>
               </w:rPr>
               <w:t xml:space="preserve"> (serviços, segurança, integração, dados)</w:t>
             </w:r>
@@ -971,18 +1553,25 @@
         </w:tc>
         <w:tc>
           <w:tcPr>
-            <w:tcW w:type="dxa" w:w="3249"/>
+            <w:tcW w:type="dxa" w:w="2967"/>
+            <w:tcMar>
+              <w:top w:w="60" w:type="dxa"/>
+              <w:bottom w:w="60" w:type="dxa"/>
+              <w:left w:w="100" w:type="dxa"/>
+              <w:right w:w="100" w:type="dxa"/>
+            </w:tcMar>
+            <w:shd w:val="clear" w:color="auto" w:fill="EBF5FB"/>
           </w:tcPr>
           <w:p>
+            <w:pPr>
+              <w:spacing w:before="40" w:after="40"/>
+            </w:pPr>
             <w:r>
               <w:rPr>
-                <w:sz w:val="17"/>
-              </w:rPr>
-            </w:r>
-            <w:r>
-              <w:rPr>
+                <w:rFonts w:ascii="Calibri" w:hAnsi="Calibri"/>
                 <w:b/>
-                <w:sz w:val="17"/>
+                <w:i w:val="0"/>
+                <w:sz w:val="20"/>
               </w:rPr>
               <w:t>Sim</w:t>
             </w:r>
@@ -990,17 +1579,25 @@
         </w:tc>
         <w:tc>
           <w:tcPr>
-            <w:tcW w:type="dxa" w:w="3249"/>
+            <w:tcW w:type="dxa" w:w="2967"/>
+            <w:tcMar>
+              <w:top w:w="60" w:type="dxa"/>
+              <w:bottom w:w="60" w:type="dxa"/>
+              <w:left w:w="100" w:type="dxa"/>
+              <w:right w:w="100" w:type="dxa"/>
+            </w:tcMar>
+            <w:shd w:val="clear" w:color="auto" w:fill="EBF5FB"/>
           </w:tcPr>
           <w:p>
+            <w:pPr>
+              <w:spacing w:before="40" w:after="40"/>
+            </w:pPr>
             <w:r>
               <w:rPr>
-                <w:sz w:val="17"/>
-              </w:rPr>
-            </w:r>
-            <w:r>
-              <w:rPr>
-                <w:sz w:val="17"/>
+                <w:rFonts w:ascii="Calibri" w:hAnsi="Calibri"/>
+                <w:b w:val="0"/>
+                <w:i w:val="0"/>
+                <w:sz w:val="20"/>
               </w:rPr>
               <w:t>Objeto desta ata — aprovada pelo PO + Tech Lead</w:t>
             </w:r>
@@ -1008,21 +1605,29 @@
         </w:tc>
       </w:tr>
       <w:tr>
+        <w:trPr>
+          <w:cantSplit w:val="1"/>
+        </w:trPr>
         <w:tc>
           <w:tcPr>
-            <w:tcW w:type="dxa" w:w="3249"/>
-            <w:shd w:val="clear" w:fill="EDF1F7"/>
+            <w:tcW w:type="dxa" w:w="2967"/>
+            <w:tcMar>
+              <w:top w:w="60" w:type="dxa"/>
+              <w:bottom w:w="60" w:type="dxa"/>
+              <w:left w:w="100" w:type="dxa"/>
+              <w:right w:w="100" w:type="dxa"/>
+            </w:tcMar>
           </w:tcPr>
           <w:p>
+            <w:pPr>
+              <w:spacing w:before="40" w:after="40"/>
+            </w:pPr>
             <w:r>
               <w:rPr>
-                <w:sz w:val="17"/>
-              </w:rPr>
-            </w:r>
-            <w:r>
-              <w:rPr>
+                <w:rFonts w:ascii="Calibri" w:hAnsi="Calibri"/>
                 <w:b/>
-                <w:sz w:val="17"/>
+                <w:i w:val="0"/>
+                <w:sz w:val="20"/>
               </w:rPr>
               <w:t>Design de UI / UX (layout, identidade visual, telas)</w:t>
             </w:r>
@@ -1030,19 +1635,24 @@
         </w:tc>
         <w:tc>
           <w:tcPr>
-            <w:tcW w:type="dxa" w:w="3249"/>
-            <w:shd w:val="clear" w:fill="EDF1F7"/>
+            <w:tcW w:type="dxa" w:w="2967"/>
+            <w:tcMar>
+              <w:top w:w="60" w:type="dxa"/>
+              <w:bottom w:w="60" w:type="dxa"/>
+              <w:left w:w="100" w:type="dxa"/>
+              <w:right w:w="100" w:type="dxa"/>
+            </w:tcMar>
           </w:tcPr>
           <w:p>
+            <w:pPr>
+              <w:spacing w:before="40" w:after="40"/>
+            </w:pPr>
             <w:r>
               <w:rPr>
-                <w:sz w:val="17"/>
-              </w:rPr>
-            </w:r>
-            <w:r>
-              <w:rPr>
+                <w:rFonts w:ascii="Calibri" w:hAnsi="Calibri"/>
                 <w:b/>
-                <w:sz w:val="17"/>
+                <w:i w:val="0"/>
+                <w:sz w:val="20"/>
               </w:rPr>
               <w:t>Não aplicável</w:t>
             </w:r>
@@ -1050,57 +1660,78 @@
         </w:tc>
         <w:tc>
           <w:tcPr>
-            <w:tcW w:type="dxa" w:w="3249"/>
-            <w:shd w:val="clear" w:fill="EDF1F7"/>
+            <w:tcW w:type="dxa" w:w="2967"/>
+            <w:tcMar>
+              <w:top w:w="60" w:type="dxa"/>
+              <w:bottom w:w="60" w:type="dxa"/>
+              <w:left w:w="100" w:type="dxa"/>
+              <w:right w:w="100" w:type="dxa"/>
+            </w:tcMar>
           </w:tcPr>
           <w:p>
+            <w:pPr>
+              <w:spacing w:before="40" w:after="40"/>
+            </w:pPr>
             <w:r>
               <w:rPr>
-                <w:sz w:val="17"/>
-              </w:rPr>
-            </w:r>
-            <w:r>
-              <w:rPr>
-                <w:sz w:val="17"/>
+                <w:rFonts w:ascii="Calibri" w:hAnsi="Calibri"/>
+                <w:b w:val="0"/>
+                <w:i w:val="0"/>
+                <w:sz w:val="20"/>
               </w:rPr>
               <w:t xml:space="preserve">O </w:t>
             </w:r>
             <w:r>
               <w:rPr>
+                <w:rFonts w:ascii="Calibri" w:hAnsi="Calibri"/>
                 <w:b/>
-                <w:sz w:val="17"/>
+                <w:i w:val="0"/>
+                <w:sz w:val="20"/>
               </w:rPr>
               <w:t>layout e a identidade visual são fornecidos pelo cliente (Hub de Milhas)</w:t>
             </w:r>
             <w:r>
               <w:rPr>
-                <w:sz w:val="17"/>
+                <w:rFonts w:ascii="Calibri" w:hAnsi="Calibri"/>
+                <w:b w:val="0"/>
+                <w:i w:val="0"/>
+                <w:sz w:val="20"/>
               </w:rPr>
               <w:t xml:space="preserve">; o projeto </w:t>
             </w:r>
             <w:r>
               <w:rPr>
+                <w:rFonts w:ascii="Calibri" w:hAnsi="Calibri"/>
                 <w:b/>
-                <w:sz w:val="17"/>
+                <w:i w:val="0"/>
+                <w:sz w:val="20"/>
               </w:rPr>
               <w:t>não inclui design de UI/UX</w:t>
             </w:r>
             <w:r>
               <w:rPr>
-                <w:sz w:val="17"/>
+                <w:rFonts w:ascii="Calibri" w:hAnsi="Calibri"/>
+                <w:b w:val="0"/>
+                <w:i w:val="0"/>
+                <w:sz w:val="20"/>
               </w:rPr>
               <w:t xml:space="preserve">. A camada web (Angular + TailwindCSS) apenas </w:t>
             </w:r>
             <w:r>
               <w:rPr>
+                <w:rFonts w:ascii="Calibri" w:hAnsi="Calibri"/>
                 <w:b/>
-                <w:sz w:val="17"/>
+                <w:i w:val="0"/>
+                <w:sz w:val="20"/>
               </w:rPr>
               <w:t>implementa</w:t>
             </w:r>
             <w:r>
               <w:rPr>
-                <w:sz w:val="17"/>
+                <w:rFonts w:ascii="Calibri" w:hAnsi="Calibri"/>
+                <w:b w:val="0"/>
+                <w:i w:val="0"/>
+                <w:sz w:val="20"/>
               </w:rPr>
               <w:t xml:space="preserve"> o layout entregue pelo cliente, com aprovação visual nas Sprint Reviews. Não há, portanto, etapa de aprovação de design de interface.</w:t>
             </w:r>
@@ -1110,221 +1741,373 @@
     </w:tbl>
     <w:p>
       <w:pPr>
+        <w:spacing w:before="0" w:after="160"/>
+      </w:pPr>
+    </w:p>
+    <w:p>
+      <w:pPr>
+        <w:pStyle w:val="Heading1"/>
+        <w:keepNext/>
+        <w:keepLines/>
         <w:pBdr>
-          <w:bottom w:val="single" w:sz="6" w:space="3" w:color="1F3B73"/>
+          <w:bottom w:val="single" w:sz="4" w:space="2" w:color="D6E4F0"/>
         </w:pBdr>
       </w:pPr>
       <w:r>
-        <w:rPr>
-          <w:b/>
-          <w:color w:val="1F3B73"/>
-          <w:sz w:val="27"/>
-        </w:rPr>
         <w:t>4. Arquitetura revisada e aprovada</w:t>
       </w:r>
     </w:p>
     <w:p>
+      <w:pPr>
+        <w:spacing w:before="0" w:after="120"/>
+      </w:pPr>
       <w:r>
+        <w:rPr>
+          <w:rFonts w:ascii="Calibri" w:hAnsi="Calibri"/>
+          <w:b w:val="0"/>
+          <w:i w:val="0"/>
+          <w:sz w:val="22"/>
+        </w:rPr>
         <w:t xml:space="preserve">Arquitetura distribuída em </w:t>
       </w:r>
       <w:r>
         <w:rPr>
+          <w:rFonts w:ascii="Calibri" w:hAnsi="Calibri"/>
           <w:b/>
+          <w:i w:val="0"/>
+          <w:sz w:val="22"/>
         </w:rPr>
         <w:t>três serviços conteinerizados</w:t>
       </w:r>
       <w:r>
+        <w:rPr>
+          <w:rFonts w:ascii="Calibri" w:hAnsi="Calibri"/>
+          <w:b w:val="0"/>
+          <w:i w:val="0"/>
+          <w:sz w:val="22"/>
+        </w:rPr>
         <w:t>, orquestrados por Docker Compose (lida do código-fonte; detalhada em PCP-MILHASFACIL01-001):</w:t>
       </w:r>
     </w:p>
     <w:p>
       <w:pPr>
         <w:pStyle w:val="ListBullet"/>
+        <w:spacing w:before="20" w:after="40"/>
       </w:pPr>
       <w:r>
         <w:rPr>
+          <w:rFonts w:ascii="Calibri" w:hAnsi="Calibri"/>
           <w:b/>
+          <w:i w:val="0"/>
+          <w:sz w:val="22"/>
         </w:rPr>
         <w:t>API (MilhasFacil_api)</w:t>
       </w:r>
       <w:r>
+        <w:rPr>
+          <w:rFonts w:ascii="Calibri" w:hAnsi="Calibri"/>
+          <w:b w:val="0"/>
+          <w:i w:val="0"/>
+          <w:sz w:val="22"/>
+        </w:rPr>
         <w:t xml:space="preserve"> — Spring Boot 3.2.5 / Java 21, padrão MVC em camadas (Controller → Service → Repository); persistência em </w:t>
       </w:r>
       <w:r>
         <w:rPr>
+          <w:rFonts w:ascii="Calibri" w:hAnsi="Calibri"/>
           <w:b/>
+          <w:i w:val="0"/>
+          <w:sz w:val="22"/>
         </w:rPr>
         <w:t>PostgreSQL</w:t>
       </w:r>
       <w:r>
+        <w:rPr>
+          <w:rFonts w:ascii="Calibri" w:hAnsi="Calibri"/>
+          <w:b w:val="0"/>
+          <w:i w:val="0"/>
+          <w:sz w:val="22"/>
+        </w:rPr>
         <w:t xml:space="preserve"> (migrations Flyway) e cache/segurança em </w:t>
       </w:r>
       <w:r>
         <w:rPr>
+          <w:rFonts w:ascii="Calibri" w:hAnsi="Calibri"/>
           <w:b/>
+          <w:i w:val="0"/>
+          <w:sz w:val="22"/>
         </w:rPr>
         <w:t>Redis</w:t>
       </w:r>
       <w:r>
+        <w:rPr>
+          <w:rFonts w:ascii="Calibri" w:hAnsi="Calibri"/>
+          <w:b w:val="0"/>
+          <w:i w:val="0"/>
+          <w:sz w:val="22"/>
+        </w:rPr>
         <w:t>.</w:t>
       </w:r>
     </w:p>
     <w:p>
       <w:pPr>
         <w:pStyle w:val="ListBullet"/>
+        <w:spacing w:before="20" w:after="40"/>
       </w:pPr>
       <w:r>
         <w:rPr>
+          <w:rFonts w:ascii="Calibri" w:hAnsi="Calibri"/>
           <w:b/>
+          <w:i w:val="0"/>
+          <w:sz w:val="22"/>
         </w:rPr>
         <w:t>Web (MilhasFacil_web)</w:t>
       </w:r>
       <w:r>
+        <w:rPr>
+          <w:rFonts w:ascii="Calibri" w:hAnsi="Calibri"/>
+          <w:b w:val="0"/>
+          <w:i w:val="0"/>
+          <w:sz w:val="22"/>
+        </w:rPr>
         <w:t xml:space="preserve"> — Angular 17.3 standalone + TailwindCSS 3.4, com lazy loading; consome a API via REST.</w:t>
       </w:r>
     </w:p>
     <w:p>
       <w:pPr>
         <w:pStyle w:val="ListBullet"/>
+        <w:spacing w:before="20" w:after="40"/>
       </w:pPr>
       <w:r>
         <w:rPr>
+          <w:rFonts w:ascii="Calibri" w:hAnsi="Calibri"/>
           <w:b/>
+          <w:i w:val="0"/>
+          <w:sz w:val="22"/>
         </w:rPr>
         <w:t>Crawler (MilhasFacil_crawler)</w:t>
       </w:r>
       <w:r>
+        <w:rPr>
+          <w:rFonts w:ascii="Calibri" w:hAnsi="Calibri"/>
+          <w:b w:val="0"/>
+          <w:i w:val="0"/>
+          <w:sz w:val="22"/>
+        </w:rPr>
         <w:t xml:space="preserve"> — FastAPI 0.111 + SeleniumBase 4.27.4, com três parsers (Smiles/Azul/Latam); serviço isolado da API.</w:t>
       </w:r>
     </w:p>
     <w:p>
+      <w:pPr>
+        <w:spacing w:before="0" w:after="120"/>
+      </w:pPr>
       <w:r>
+        <w:rPr>
+          <w:rFonts w:ascii="Calibri" w:hAnsi="Calibri"/>
+          <w:b w:val="0"/>
+          <w:i w:val="0"/>
+          <w:sz w:val="22"/>
+        </w:rPr>
         <w:t xml:space="preserve">Decisões arquiteturais aprovadas (registradas em </w:t>
       </w:r>
       <w:r>
         <w:rPr>
+          <w:rFonts w:ascii="Calibri" w:hAnsi="Calibri"/>
           <w:b/>
+          <w:i w:val="0"/>
+          <w:sz w:val="22"/>
         </w:rPr>
         <w:t>GDE-MILHASFACIL01-001</w:t>
       </w:r>
       <w:r>
+        <w:rPr>
+          <w:rFonts w:ascii="Calibri" w:hAnsi="Calibri"/>
+          <w:b w:val="0"/>
+          <w:i w:val="0"/>
+          <w:sz w:val="22"/>
+        </w:rPr>
         <w:t>):</w:t>
       </w:r>
     </w:p>
     <w:p>
       <w:pPr>
         <w:pStyle w:val="ListBullet"/>
+        <w:spacing w:before="20" w:after="40"/>
       </w:pPr>
       <w:r>
         <w:rPr>
+          <w:rFonts w:ascii="Calibri" w:hAnsi="Calibri"/>
           <w:b/>
+          <w:i w:val="0"/>
+          <w:sz w:val="22"/>
         </w:rPr>
         <w:t>GDE-1 — Autenticação JWT stateless</w:t>
       </w:r>
       <w:r>
+        <w:rPr>
+          <w:rFonts w:ascii="Calibri" w:hAnsi="Calibri"/>
+          <w:b w:val="0"/>
+          <w:i w:val="0"/>
+          <w:sz w:val="22"/>
+        </w:rPr>
         <w:t xml:space="preserve"> (HS256, access 30 min + refresh 7 dias) com </w:t>
       </w:r>
       <w:r>
         <w:rPr>
+          <w:rFonts w:ascii="Calibri" w:hAnsi="Calibri"/>
           <w:b/>
+          <w:i w:val="0"/>
+          <w:sz w:val="22"/>
         </w:rPr>
         <w:t>blacklist de jti no Redis</w:t>
       </w:r>
       <w:r>
+        <w:rPr>
+          <w:rFonts w:ascii="Calibri" w:hAnsi="Calibri"/>
+          <w:b w:val="0"/>
+          <w:i w:val="0"/>
+          <w:sz w:val="22"/>
+        </w:rPr>
         <w:t xml:space="preserve"> para logout seguro, mantendo escalabilidade horizontal sem sessão de servidor.</w:t>
       </w:r>
     </w:p>
     <w:p>
       <w:pPr>
         <w:pStyle w:val="ListBullet"/>
+        <w:spacing w:before="20" w:after="40"/>
       </w:pPr>
       <w:r>
         <w:rPr>
+          <w:rFonts w:ascii="Calibri" w:hAnsi="Calibri"/>
           <w:b/>
+          <w:i w:val="0"/>
+          <w:sz w:val="22"/>
         </w:rPr>
         <w:t>GDE-2 — Busca paralela</w:t>
       </w:r>
       <w:r>
+        <w:rPr>
+          <w:rFonts w:ascii="Calibri" w:hAnsi="Calibri"/>
+          <w:b w:val="0"/>
+          <w:i w:val="0"/>
+          <w:sz w:val="22"/>
+        </w:rPr>
         <w:t xml:space="preserve"> das três companhias com </w:t>
       </w:r>
       <w:r>
         <w:rPr>
-          <w:rFonts w:ascii="Consolas" w:hAnsi="Consolas"/>
-          <w:color w:val="444444"/>
-          <w:sz w:val="18"/>
+          <w:rFonts w:ascii="Courier New" w:hAnsi="Courier New"/>
+          <w:b w:val="0"/>
+          <w:i w:val="0"/>
+          <w:color w:val="333333"/>
+          <w:sz w:val="20"/>
         </w:rPr>
         <w:t>CompletableFuture</w:t>
       </w:r>
       <w:r>
+        <w:rPr>
+          <w:rFonts w:ascii="Calibri" w:hAnsi="Calibri"/>
+          <w:b w:val="0"/>
+          <w:i w:val="0"/>
+          <w:sz w:val="22"/>
+        </w:rPr>
         <w:t xml:space="preserve"> (timeout de 40 s por crawler), consolidando resultados sem duplicatas e ordenando por milhas (atende RNF01).</w:t>
       </w:r>
     </w:p>
     <w:p>
       <w:pPr>
         <w:pStyle w:val="ListBullet"/>
+        <w:spacing w:before="20" w:after="40"/>
       </w:pPr>
       <w:r>
         <w:rPr>
+          <w:rFonts w:ascii="Calibri" w:hAnsi="Calibri"/>
           <w:b/>
+          <w:i w:val="0"/>
+          <w:sz w:val="22"/>
         </w:rPr>
         <w:t>GDE-3 — Crawler em serviço separado</w:t>
       </w:r>
       <w:r>
+        <w:rPr>
+          <w:rFonts w:ascii="Calibri" w:hAnsi="Calibri"/>
+          <w:b w:val="0"/>
+          <w:i w:val="0"/>
+          <w:sz w:val="22"/>
+        </w:rPr>
         <w:t xml:space="preserve"> (FastAPI + SeleniumBase) em vez de scraping embarcado na API — isola a volatilidade dos portais das cias (risco R-01) e permite evolução independente.</w:t>
       </w:r>
     </w:p>
     <w:p>
       <w:pPr>
         <w:pStyle w:val="ListBullet"/>
+        <w:spacing w:before="20" w:after="40"/>
       </w:pPr>
       <w:r>
         <w:rPr>
+          <w:rFonts w:ascii="Calibri" w:hAnsi="Calibri"/>
           <w:b/>
+          <w:i w:val="0"/>
+          <w:sz w:val="22"/>
         </w:rPr>
         <w:t>GDE-4 — Senhas com BCrypt</w:t>
       </w:r>
       <w:r>
+        <w:rPr>
+          <w:rFonts w:ascii="Calibri" w:hAnsi="Calibri"/>
+          <w:b w:val="0"/>
+          <w:i w:val="0"/>
+          <w:sz w:val="22"/>
+        </w:rPr>
         <w:t xml:space="preserve"> e CORS restrito; </w:t>
       </w:r>
       <w:r>
         <w:rPr>
+          <w:rFonts w:ascii="Calibri" w:hAnsi="Calibri"/>
           <w:b/>
+          <w:i w:val="0"/>
+          <w:sz w:val="22"/>
         </w:rPr>
         <w:t>GDE-5 — exclusão lógica</w:t>
       </w:r>
       <w:r>
+        <w:rPr>
+          <w:rFonts w:ascii="Calibri" w:hAnsi="Calibri"/>
+          <w:b w:val="0"/>
+          <w:i w:val="0"/>
+          <w:sz w:val="22"/>
+        </w:rPr>
         <w:t xml:space="preserve"> (flag </w:t>
       </w:r>
       <w:r>
         <w:rPr>
-          <w:rFonts w:ascii="Consolas" w:hAnsi="Consolas"/>
-          <w:color w:val="444444"/>
-          <w:sz w:val="18"/>
+          <w:rFonts w:ascii="Courier New" w:hAnsi="Courier New"/>
+          <w:b w:val="0"/>
+          <w:i w:val="0"/>
+          <w:color w:val="333333"/>
+          <w:sz w:val="20"/>
         </w:rPr>
         <w:t>active</w:t>
       </w:r>
       <w:r>
+        <w:rPr>
+          <w:rFonts w:ascii="Calibri" w:hAnsi="Calibri"/>
+          <w:b w:val="0"/>
+          <w:i w:val="0"/>
+          <w:sz w:val="22"/>
+        </w:rPr>
         <w:t>) em rotas favoritas para preservar rastreabilidade.</w:t>
       </w:r>
     </w:p>
     <w:p>
       <w:pPr>
+        <w:spacing w:before="120" w:after="40"/>
         <w:jc w:val="center"/>
       </w:pPr>
       <w:r>
-        <w:rPr>
-          <w:i/>
-          <w:color w:val="2E5CAA"/>
-          <w:sz w:val="17"/>
-        </w:rPr>
-        <w:t>[ IMG-ARQ-01 — diagrama de arquitetura da solução ]</w:t>
-      </w:r>
-    </w:p>
-    <w:p>
-      <w:r>
         <w:drawing>
           <wp:inline xmlns:a="http://schemas.openxmlformats.org/drawingml/2006/main" xmlns:pic="http://schemas.openxmlformats.org/drawingml/2006/picture">
-            <wp:extent cx="5040000" cy="3250651"/>
+            <wp:extent cx="5029200" cy="3243685"/>
             <wp:docPr id="1" name="Picture 1"/>
             <wp:cNvGraphicFramePr>
               <a:graphicFrameLocks noChangeAspect="1"/>
@@ -1337,7 +2120,7 @@
                     <pic:cNvPicPr/>
                   </pic:nvPicPr>
                   <pic:blipFill>
-                    <a:blip r:embed="rId9"/>
+                    <a:blip r:embed="rId13"/>
                     <a:stretch>
                       <a:fillRect/>
                     </a:stretch>
@@ -1345,7 +2128,7 @@
                   <pic:spPr>
                     <a:xfrm>
                       <a:off x="0" y="0"/>
-                      <a:ext cx="5040000" cy="3250651"/>
+                      <a:ext cx="5029200" cy="3243685"/>
                     </a:xfrm>
                     <a:prstGeom prst="rect"/>
                   </pic:spPr>
@@ -1358,89 +2141,144 @@
     </w:p>
     <w:p>
       <w:pPr>
+        <w:spacing w:before="0" w:after="200"/>
         <w:jc w:val="center"/>
       </w:pPr>
       <w:r>
         <w:rPr>
+          <w:rFonts w:ascii="Calibri" w:hAnsi="Calibri"/>
           <w:i/>
-          <w:color w:val="444444"/>
-          <w:sz w:val="16"/>
+          <w:color w:val="555555"/>
+          <w:sz w:val="18"/>
         </w:rPr>
-        <w:t>Evidência (a anexar): evidencias/IMG-ARQ-01_diagrama-arquitetura.png</w:t>
+        <w:t>IMG-ARQ-01 — diagrama de arquitetura da solução</w:t>
       </w:r>
     </w:p>
     <w:p>
+      <w:pPr>
+        <w:spacing w:before="0" w:after="120"/>
+      </w:pPr>
       <w:r>
-        <w:t xml:space="preserve">*Figura — Diagrama de arquitetura da solução, mantido no </w:t>
+        <w:rPr>
+          <w:rFonts w:ascii="Calibri" w:hAnsi="Calibri"/>
+          <w:b w:val="0"/>
+          <w:i/>
+          <w:sz w:val="22"/>
+        </w:rPr>
+        <w:t xml:space="preserve">Figura — Diagrama de arquitetura da solução, mantido no </w:t>
       </w:r>
       <w:r>
         <w:rPr>
-          <w:b/>
+          <w:rFonts w:ascii="Calibri" w:hAnsi="Calibri"/>
+          <w:b w:val="0"/>
+          <w:i/>
+          <w:sz w:val="22"/>
         </w:rPr>
         <w:t>Lucidchart</w:t>
       </w:r>
       <w:r>
+        <w:rPr>
+          <w:rFonts w:ascii="Calibri" w:hAnsi="Calibri"/>
+          <w:b w:val="0"/>
+          <w:i/>
+          <w:sz w:val="22"/>
+        </w:rPr>
         <w:t xml:space="preserve">: &lt;https://lucid.app/lucidchart/a51c0f84-cc01-4468-bfdd-6e94aa7a3ae3&gt;. O </w:t>
       </w:r>
       <w:r>
         <w:rPr>
-          <w:b/>
+          <w:rFonts w:ascii="Calibri" w:hAnsi="Calibri"/>
+          <w:b w:val="0"/>
+          <w:i/>
+          <w:sz w:val="22"/>
         </w:rPr>
         <w:t>IMG-ARQ-01</w:t>
       </w:r>
       <w:r>
+        <w:rPr>
+          <w:rFonts w:ascii="Calibri" w:hAnsi="Calibri"/>
+          <w:b w:val="0"/>
+          <w:i/>
+          <w:sz w:val="22"/>
+        </w:rPr>
         <w:t xml:space="preserve"> é a exportação (PNG) desse diagrama. A arquitetura textual acima e o </w:t>
       </w:r>
       <w:r>
         <w:rPr>
-          <w:b/>
+          <w:rFonts w:ascii="Calibri" w:hAnsi="Calibri"/>
+          <w:b w:val="0"/>
+          <w:i/>
+          <w:sz w:val="22"/>
         </w:rPr>
         <w:t>PCP-MILHASFACIL01-001</w:t>
       </w:r>
       <w:r>
-        <w:t xml:space="preserve"> detalham a referência aprovada.*</w:t>
+        <w:rPr>
+          <w:rFonts w:ascii="Calibri" w:hAnsi="Calibri"/>
+          <w:b w:val="0"/>
+          <w:i/>
+          <w:sz w:val="22"/>
+        </w:rPr>
+        <w:t xml:space="preserve"> detalham a referência aprovada.</w:t>
       </w:r>
     </w:p>
     <w:p>
       <w:pPr>
+        <w:pStyle w:val="Heading1"/>
+        <w:keepNext/>
+        <w:keepLines/>
         <w:pBdr>
-          <w:bottom w:val="single" w:sz="6" w:space="3" w:color="1F3B73"/>
+          <w:bottom w:val="single" w:sz="4" w:space="2" w:color="D6E4F0"/>
         </w:pBdr>
       </w:pPr>
       <w:r>
-        <w:rPr>
-          <w:b/>
-          <w:color w:val="1F3B73"/>
-          <w:sz w:val="27"/>
-        </w:rPr>
         <w:t>5. Deliberações</w:t>
       </w:r>
     </w:p>
     <w:tbl>
       <w:tblPr>
-        <w:tblStyle w:val="TableGrid"/>
         <w:tblW w:type="auto" w:w="0"/>
-        <w:jc w:val="center"/>
         <w:tblLook w:firstColumn="1" w:firstRow="1" w:lastColumn="0" w:lastRow="0" w:noHBand="0" w:noVBand="1" w:val="04A0"/>
+        <w:tblBorders>
+          <w:top w:val="single" w:sz="4" w:space="0" w:color="003366"/>
+          <w:left w:val="single" w:sz="4" w:space="0" w:color="003366"/>
+          <w:bottom w:val="single" w:sz="4" w:space="0" w:color="003366"/>
+          <w:right w:val="single" w:sz="4" w:space="0" w:color="003366"/>
+          <w:insideH w:val="single" w:sz="4" w:space="0" w:color="003366"/>
+          <w:insideV w:val="single" w:sz="4" w:space="0" w:color="003366"/>
+        </w:tblBorders>
       </w:tblPr>
       <w:tblGrid>
-        <w:gridCol w:w="3249"/>
-        <w:gridCol w:w="3249"/>
-        <w:gridCol w:w="3249"/>
+        <w:gridCol w:w="2967"/>
+        <w:gridCol w:w="2967"/>
+        <w:gridCol w:w="2967"/>
       </w:tblGrid>
       <w:tr>
+        <w:trPr>
+          <w:cantSplit w:val="1"/>
+        </w:trPr>
         <w:tc>
           <w:tcPr>
-            <w:tcW w:type="dxa" w:w="3249"/>
-            <w:shd w:val="clear" w:fill="1F3B73"/>
+            <w:tcW w:type="dxa" w:w="2967"/>
+            <w:tcMar>
+              <w:top w:w="60" w:type="dxa"/>
+              <w:bottom w:w="60" w:type="dxa"/>
+              <w:left w:w="100" w:type="dxa"/>
+              <w:right w:w="100" w:type="dxa"/>
+            </w:tcMar>
+            <w:shd w:val="clear" w:color="auto" w:fill="003366"/>
           </w:tcPr>
           <w:p>
-            <w:r/>
+            <w:pPr>
+              <w:spacing w:before="40" w:after="40"/>
+            </w:pPr>
             <w:r>
               <w:rPr>
+                <w:rFonts w:ascii="Calibri" w:hAnsi="Calibri"/>
                 <w:b/>
+                <w:i w:val="0"/>
                 <w:color w:val="FFFFFF"/>
-                <w:sz w:val="18"/>
+                <w:sz w:val="20"/>
               </w:rPr>
               <w:t>#</w:t>
             </w:r>
@@ -1448,16 +2286,26 @@
         </w:tc>
         <w:tc>
           <w:tcPr>
-            <w:tcW w:type="dxa" w:w="3249"/>
-            <w:shd w:val="clear" w:fill="1F3B73"/>
+            <w:tcW w:type="dxa" w:w="2967"/>
+            <w:tcMar>
+              <w:top w:w="60" w:type="dxa"/>
+              <w:bottom w:w="60" w:type="dxa"/>
+              <w:left w:w="100" w:type="dxa"/>
+              <w:right w:w="100" w:type="dxa"/>
+            </w:tcMar>
+            <w:shd w:val="clear" w:color="auto" w:fill="003366"/>
           </w:tcPr>
           <w:p>
-            <w:r/>
+            <w:pPr>
+              <w:spacing w:before="40" w:after="40"/>
+            </w:pPr>
             <w:r>
               <w:rPr>
+                <w:rFonts w:ascii="Calibri" w:hAnsi="Calibri"/>
                 <w:b/>
+                <w:i w:val="0"/>
                 <w:color w:val="FFFFFF"/>
-                <w:sz w:val="18"/>
+                <w:sz w:val="20"/>
               </w:rPr>
               <w:t>Deliberação</w:t>
             </w:r>
@@ -1465,16 +2313,26 @@
         </w:tc>
         <w:tc>
           <w:tcPr>
-            <w:tcW w:type="dxa" w:w="3249"/>
-            <w:shd w:val="clear" w:fill="1F3B73"/>
+            <w:tcW w:type="dxa" w:w="2967"/>
+            <w:tcMar>
+              <w:top w:w="60" w:type="dxa"/>
+              <w:bottom w:w="60" w:type="dxa"/>
+              <w:left w:w="100" w:type="dxa"/>
+              <w:right w:w="100" w:type="dxa"/>
+            </w:tcMar>
+            <w:shd w:val="clear" w:color="auto" w:fill="003366"/>
           </w:tcPr>
           <w:p>
-            <w:r/>
+            <w:pPr>
+              <w:spacing w:before="40" w:after="40"/>
+            </w:pPr>
             <w:r>
               <w:rPr>
+                <w:rFonts w:ascii="Calibri" w:hAnsi="Calibri"/>
                 <w:b/>
+                <w:i w:val="0"/>
                 <w:color w:val="FFFFFF"/>
-                <w:sz w:val="18"/>
+                <w:sz w:val="20"/>
               </w:rPr>
               <w:t>Responsável</w:t>
             </w:r>
@@ -1482,19 +2340,30 @@
         </w:tc>
       </w:tr>
       <w:tr>
+        <w:trPr>
+          <w:cantSplit w:val="1"/>
+        </w:trPr>
         <w:tc>
           <w:tcPr>
-            <w:tcW w:type="dxa" w:w="3249"/>
+            <w:tcW w:type="dxa" w:w="2967"/>
+            <w:tcMar>
+              <w:top w:w="60" w:type="dxa"/>
+              <w:bottom w:w="60" w:type="dxa"/>
+              <w:left w:w="100" w:type="dxa"/>
+              <w:right w:w="100" w:type="dxa"/>
+            </w:tcMar>
+            <w:shd w:val="clear" w:color="auto" w:fill="EBF5FB"/>
           </w:tcPr>
           <w:p>
+            <w:pPr>
+              <w:spacing w:before="40" w:after="40"/>
+            </w:pPr>
             <w:r>
               <w:rPr>
-                <w:sz w:val="17"/>
-              </w:rPr>
-            </w:r>
-            <w:r>
-              <w:rPr>
-                <w:sz w:val="17"/>
+                <w:rFonts w:ascii="Calibri" w:hAnsi="Calibri"/>
+                <w:b w:val="0"/>
+                <w:i w:val="0"/>
+                <w:sz w:val="20"/>
               </w:rPr>
               <w:t>D-01</w:t>
             </w:r>
@@ -1502,30 +2371,43 @@
         </w:tc>
         <w:tc>
           <w:tcPr>
-            <w:tcW w:type="dxa" w:w="3249"/>
+            <w:tcW w:type="dxa" w:w="2967"/>
+            <w:tcMar>
+              <w:top w:w="60" w:type="dxa"/>
+              <w:bottom w:w="60" w:type="dxa"/>
+              <w:left w:w="100" w:type="dxa"/>
+              <w:right w:w="100" w:type="dxa"/>
+            </w:tcMar>
+            <w:shd w:val="clear" w:color="auto" w:fill="EBF5FB"/>
           </w:tcPr>
           <w:p>
+            <w:pPr>
+              <w:spacing w:before="40" w:after="40"/>
+            </w:pPr>
             <w:r>
               <w:rPr>
-                <w:sz w:val="17"/>
-              </w:rPr>
-            </w:r>
-            <w:r>
-              <w:rPr>
-                <w:sz w:val="17"/>
+                <w:rFonts w:ascii="Calibri" w:hAnsi="Calibri"/>
+                <w:b w:val="0"/>
+                <w:i w:val="0"/>
+                <w:sz w:val="20"/>
               </w:rPr>
               <w:t xml:space="preserve">Arquitetura técnica (3 serviços, JWT stateless + Redis, busca paralela, crawler isolado) </w:t>
             </w:r>
             <w:r>
               <w:rPr>
+                <w:rFonts w:ascii="Calibri" w:hAnsi="Calibri"/>
                 <w:b/>
-                <w:sz w:val="17"/>
+                <w:i w:val="0"/>
+                <w:sz w:val="20"/>
               </w:rPr>
               <w:t>APROVADA</w:t>
             </w:r>
             <w:r>
               <w:rPr>
-                <w:sz w:val="17"/>
+                <w:rFonts w:ascii="Calibri" w:hAnsi="Calibri"/>
+                <w:b w:val="0"/>
+                <w:i w:val="0"/>
+                <w:sz w:val="20"/>
               </w:rPr>
               <w:t xml:space="preserve"> como baseline de design</w:t>
             </w:r>
@@ -1533,17 +2415,25 @@
         </w:tc>
         <w:tc>
           <w:tcPr>
-            <w:tcW w:type="dxa" w:w="3249"/>
+            <w:tcW w:type="dxa" w:w="2967"/>
+            <w:tcMar>
+              <w:top w:w="60" w:type="dxa"/>
+              <w:bottom w:w="60" w:type="dxa"/>
+              <w:left w:w="100" w:type="dxa"/>
+              <w:right w:w="100" w:type="dxa"/>
+            </w:tcMar>
+            <w:shd w:val="clear" w:color="auto" w:fill="EBF5FB"/>
           </w:tcPr>
           <w:p>
+            <w:pPr>
+              <w:spacing w:before="40" w:after="40"/>
+            </w:pPr>
             <w:r>
               <w:rPr>
-                <w:sz w:val="17"/>
-              </w:rPr>
-            </w:r>
-            <w:r>
-              <w:rPr>
-                <w:sz w:val="17"/>
+                <w:rFonts w:ascii="Calibri" w:hAnsi="Calibri"/>
+                <w:b w:val="0"/>
+                <w:i w:val="0"/>
+                <w:sz w:val="20"/>
               </w:rPr>
               <w:t>Abraão (PO) + Cézar Velazquez (Tech Lead)</w:t>
             </w:r>
@@ -1551,20 +2441,29 @@
         </w:tc>
       </w:tr>
       <w:tr>
+        <w:trPr>
+          <w:cantSplit w:val="1"/>
+        </w:trPr>
         <w:tc>
           <w:tcPr>
-            <w:tcW w:type="dxa" w:w="3249"/>
-            <w:shd w:val="clear" w:fill="EDF1F7"/>
+            <w:tcW w:type="dxa" w:w="2967"/>
+            <w:tcMar>
+              <w:top w:w="60" w:type="dxa"/>
+              <w:bottom w:w="60" w:type="dxa"/>
+              <w:left w:w="100" w:type="dxa"/>
+              <w:right w:w="100" w:type="dxa"/>
+            </w:tcMar>
           </w:tcPr>
           <w:p>
+            <w:pPr>
+              <w:spacing w:before="40" w:after="40"/>
+            </w:pPr>
             <w:r>
               <w:rPr>
-                <w:sz w:val="17"/>
-              </w:rPr>
-            </w:r>
-            <w:r>
-              <w:rPr>
-                <w:sz w:val="17"/>
+                <w:rFonts w:ascii="Calibri" w:hAnsi="Calibri"/>
+                <w:b w:val="0"/>
+                <w:i w:val="0"/>
+                <w:sz w:val="20"/>
               </w:rPr>
               <w:t>D-02</w:t>
             </w:r>
@@ -1572,31 +2471,42 @@
         </w:tc>
         <w:tc>
           <w:tcPr>
-            <w:tcW w:type="dxa" w:w="3249"/>
-            <w:shd w:val="clear" w:fill="EDF1F7"/>
+            <w:tcW w:type="dxa" w:w="2967"/>
+            <w:tcMar>
+              <w:top w:w="60" w:type="dxa"/>
+              <w:bottom w:w="60" w:type="dxa"/>
+              <w:left w:w="100" w:type="dxa"/>
+              <w:right w:w="100" w:type="dxa"/>
+            </w:tcMar>
           </w:tcPr>
           <w:p>
+            <w:pPr>
+              <w:spacing w:before="40" w:after="40"/>
+            </w:pPr>
             <w:r>
               <w:rPr>
-                <w:sz w:val="17"/>
-              </w:rPr>
-            </w:r>
-            <w:r>
-              <w:rPr>
-                <w:sz w:val="17"/>
+                <w:rFonts w:ascii="Calibri" w:hAnsi="Calibri"/>
+                <w:b w:val="0"/>
+                <w:i w:val="0"/>
+                <w:sz w:val="20"/>
               </w:rPr>
               <w:t xml:space="preserve">Design de UI/UX </w:t>
             </w:r>
             <w:r>
               <w:rPr>
+                <w:rFonts w:ascii="Calibri" w:hAnsi="Calibri"/>
                 <w:b/>
-                <w:sz w:val="17"/>
+                <w:i w:val="0"/>
+                <w:sz w:val="20"/>
               </w:rPr>
               <w:t>não se aplica</w:t>
             </w:r>
             <w:r>
               <w:rPr>
-                <w:sz w:val="17"/>
+                <w:rFonts w:ascii="Calibri" w:hAnsi="Calibri"/>
+                <w:b w:val="0"/>
+                <w:i w:val="0"/>
+                <w:sz w:val="20"/>
               </w:rPr>
               <w:t xml:space="preserve"> ao escopo — layout fornecido pelo cliente; validação visual ocorre nas Sprint Reviews</w:t>
             </w:r>
@@ -1604,18 +2514,24 @@
         </w:tc>
         <w:tc>
           <w:tcPr>
-            <w:tcW w:type="dxa" w:w="3249"/>
-            <w:shd w:val="clear" w:fill="EDF1F7"/>
+            <w:tcW w:type="dxa" w:w="2967"/>
+            <w:tcMar>
+              <w:top w:w="60" w:type="dxa"/>
+              <w:bottom w:w="60" w:type="dxa"/>
+              <w:left w:w="100" w:type="dxa"/>
+              <w:right w:w="100" w:type="dxa"/>
+            </w:tcMar>
           </w:tcPr>
           <w:p>
+            <w:pPr>
+              <w:spacing w:before="40" w:after="40"/>
+            </w:pPr>
             <w:r>
               <w:rPr>
-                <w:sz w:val="17"/>
-              </w:rPr>
-            </w:r>
-            <w:r>
-              <w:rPr>
-                <w:sz w:val="17"/>
+                <w:rFonts w:ascii="Calibri" w:hAnsi="Calibri"/>
+                <w:b w:val="0"/>
+                <w:i w:val="0"/>
+                <w:sz w:val="20"/>
               </w:rPr>
               <w:t>Abraão (PO)</w:t>
             </w:r>
@@ -1623,19 +2539,30 @@
         </w:tc>
       </w:tr>
       <w:tr>
+        <w:trPr>
+          <w:cantSplit w:val="1"/>
+        </w:trPr>
         <w:tc>
           <w:tcPr>
-            <w:tcW w:type="dxa" w:w="3249"/>
+            <w:tcW w:type="dxa" w:w="2967"/>
+            <w:tcMar>
+              <w:top w:w="60" w:type="dxa"/>
+              <w:bottom w:w="60" w:type="dxa"/>
+              <w:left w:w="100" w:type="dxa"/>
+              <w:right w:w="100" w:type="dxa"/>
+            </w:tcMar>
+            <w:shd w:val="clear" w:color="auto" w:fill="EBF5FB"/>
           </w:tcPr>
           <w:p>
+            <w:pPr>
+              <w:spacing w:before="40" w:after="40"/>
+            </w:pPr>
             <w:r>
               <w:rPr>
-                <w:sz w:val="17"/>
-              </w:rPr>
-            </w:r>
-            <w:r>
-              <w:rPr>
-                <w:sz w:val="17"/>
+                <w:rFonts w:ascii="Calibri" w:hAnsi="Calibri"/>
+                <w:b w:val="0"/>
+                <w:i w:val="0"/>
+                <w:sz w:val="20"/>
               </w:rPr>
               <w:t>D-03</w:t>
             </w:r>
@@ -1643,17 +2570,25 @@
         </w:tc>
         <w:tc>
           <w:tcPr>
-            <w:tcW w:type="dxa" w:w="3249"/>
+            <w:tcW w:type="dxa" w:w="2967"/>
+            <w:tcMar>
+              <w:top w:w="60" w:type="dxa"/>
+              <w:bottom w:w="60" w:type="dxa"/>
+              <w:left w:w="100" w:type="dxa"/>
+              <w:right w:w="100" w:type="dxa"/>
+            </w:tcMar>
+            <w:shd w:val="clear" w:color="auto" w:fill="EBF5FB"/>
           </w:tcPr>
           <w:p>
+            <w:pPr>
+              <w:spacing w:before="40" w:after="40"/>
+            </w:pPr>
             <w:r>
               <w:rPr>
-                <w:sz w:val="17"/>
-              </w:rPr>
-            </w:r>
-            <w:r>
-              <w:rPr>
-                <w:sz w:val="17"/>
+                <w:rFonts w:ascii="Calibri" w:hAnsi="Calibri"/>
+                <w:b w:val="0"/>
+                <w:i w:val="0"/>
+                <w:sz w:val="20"/>
               </w:rPr>
               <w:t>Decisões arquiteturais registradas em GDE-MILHASFACIL01-001; alterações estruturais seguem o fluxo de change request</w:t>
             </w:r>
@@ -1661,17 +2596,25 @@
         </w:tc>
         <w:tc>
           <w:tcPr>
-            <w:tcW w:type="dxa" w:w="3249"/>
+            <w:tcW w:type="dxa" w:w="2967"/>
+            <w:tcMar>
+              <w:top w:w="60" w:type="dxa"/>
+              <w:bottom w:w="60" w:type="dxa"/>
+              <w:left w:w="100" w:type="dxa"/>
+              <w:right w:w="100" w:type="dxa"/>
+            </w:tcMar>
+            <w:shd w:val="clear" w:color="auto" w:fill="EBF5FB"/>
           </w:tcPr>
           <w:p>
+            <w:pPr>
+              <w:spacing w:before="40" w:after="40"/>
+            </w:pPr>
             <w:r>
               <w:rPr>
-                <w:sz w:val="17"/>
-              </w:rPr>
-            </w:r>
-            <w:r>
-              <w:rPr>
-                <w:sz w:val="17"/>
+                <w:rFonts w:ascii="Calibri" w:hAnsi="Calibri"/>
+                <w:b w:val="0"/>
+                <w:i w:val="0"/>
+                <w:sz w:val="20"/>
               </w:rPr>
               <w:t>Cézar Velazquez (Tech Lead)</w:t>
             </w:r>
@@ -1679,20 +2622,29 @@
         </w:tc>
       </w:tr>
       <w:tr>
+        <w:trPr>
+          <w:cantSplit w:val="1"/>
+        </w:trPr>
         <w:tc>
           <w:tcPr>
-            <w:tcW w:type="dxa" w:w="3249"/>
-            <w:shd w:val="clear" w:fill="EDF1F7"/>
+            <w:tcW w:type="dxa" w:w="2967"/>
+            <w:tcMar>
+              <w:top w:w="60" w:type="dxa"/>
+              <w:bottom w:w="60" w:type="dxa"/>
+              <w:left w:w="100" w:type="dxa"/>
+              <w:right w:w="100" w:type="dxa"/>
+            </w:tcMar>
           </w:tcPr>
           <w:p>
+            <w:pPr>
+              <w:spacing w:before="40" w:after="40"/>
+            </w:pPr>
             <w:r>
               <w:rPr>
-                <w:sz w:val="17"/>
-              </w:rPr>
-            </w:r>
-            <w:r>
-              <w:rPr>
-                <w:sz w:val="17"/>
+                <w:rFonts w:ascii="Calibri" w:hAnsi="Calibri"/>
+                <w:b w:val="0"/>
+                <w:i w:val="0"/>
+                <w:sz w:val="20"/>
               </w:rPr>
               <w:t>D-04</w:t>
             </w:r>
@@ -1700,18 +2652,24 @@
         </w:tc>
         <w:tc>
           <w:tcPr>
-            <w:tcW w:type="dxa" w:w="3249"/>
-            <w:shd w:val="clear" w:fill="EDF1F7"/>
+            <w:tcW w:type="dxa" w:w="2967"/>
+            <w:tcMar>
+              <w:top w:w="60" w:type="dxa"/>
+              <w:bottom w:w="60" w:type="dxa"/>
+              <w:left w:w="100" w:type="dxa"/>
+              <w:right w:w="100" w:type="dxa"/>
+            </w:tcMar>
           </w:tcPr>
           <w:p>
+            <w:pPr>
+              <w:spacing w:before="40" w:after="40"/>
+            </w:pPr>
             <w:r>
               <w:rPr>
-                <w:sz w:val="17"/>
-              </w:rPr>
-            </w:r>
-            <w:r>
-              <w:rPr>
-                <w:sz w:val="17"/>
+                <w:rFonts w:ascii="Calibri" w:hAnsi="Calibri"/>
+                <w:b w:val="0"/>
+                <w:i w:val="0"/>
+                <w:sz w:val="20"/>
               </w:rPr>
               <w:t>Revisão técnica contínua via Pull Request, com o Tech Lead como revisor obrigatório (branch policy)</w:t>
             </w:r>
@@ -1719,18 +2677,24 @@
         </w:tc>
         <w:tc>
           <w:tcPr>
-            <w:tcW w:type="dxa" w:w="3249"/>
-            <w:shd w:val="clear" w:fill="EDF1F7"/>
+            <w:tcW w:type="dxa" w:w="2967"/>
+            <w:tcMar>
+              <w:top w:w="60" w:type="dxa"/>
+              <w:bottom w:w="60" w:type="dxa"/>
+              <w:left w:w="100" w:type="dxa"/>
+              <w:right w:w="100" w:type="dxa"/>
+            </w:tcMar>
           </w:tcPr>
           <w:p>
+            <w:pPr>
+              <w:spacing w:before="40" w:after="40"/>
+            </w:pPr>
             <w:r>
               <w:rPr>
-                <w:sz w:val="17"/>
-              </w:rPr>
-            </w:r>
-            <w:r>
-              <w:rPr>
-                <w:sz w:val="17"/>
+                <w:rFonts w:ascii="Calibri" w:hAnsi="Calibri"/>
+                <w:b w:val="0"/>
+                <w:i w:val="0"/>
+                <w:sz w:val="20"/>
               </w:rPr>
               <w:t>Cézar Velazquez (Tech Lead)</w:t>
             </w:r>
@@ -1740,85 +2704,152 @@
     </w:tbl>
     <w:p>
       <w:pPr>
+        <w:spacing w:before="0" w:after="160"/>
+      </w:pPr>
+    </w:p>
+    <w:p>
+      <w:pPr>
+        <w:pStyle w:val="Heading1"/>
+        <w:keepNext/>
+        <w:keepLines/>
         <w:pBdr>
-          <w:bottom w:val="single" w:sz="6" w:space="3" w:color="1F3B73"/>
+          <w:bottom w:val="single" w:sz="4" w:space="2" w:color="D6E4F0"/>
         </w:pBdr>
       </w:pPr>
       <w:r>
-        <w:rPr>
-          <w:b/>
-          <w:color w:val="1F3B73"/>
-          <w:sz w:val="27"/>
-        </w:rPr>
         <w:t>6. Aprovação</w:t>
       </w:r>
     </w:p>
     <w:p>
+      <w:pPr>
+        <w:spacing w:before="0" w:after="120"/>
+      </w:pPr>
       <w:r>
+        <w:rPr>
+          <w:rFonts w:ascii="Calibri" w:hAnsi="Calibri"/>
+          <w:b w:val="0"/>
+          <w:i w:val="0"/>
+          <w:sz w:val="22"/>
+        </w:rPr>
         <w:t xml:space="preserve">A arquitetura técnica da plataforma MilhasFacil foi </w:t>
       </w:r>
       <w:r>
         <w:rPr>
+          <w:rFonts w:ascii="Calibri" w:hAnsi="Calibri"/>
           <w:b/>
+          <w:i w:val="0"/>
+          <w:sz w:val="22"/>
         </w:rPr>
         <w:t>revisada e aprovada</w:t>
       </w:r>
       <w:r>
+        <w:rPr>
+          <w:rFonts w:ascii="Calibri" w:hAnsi="Calibri"/>
+          <w:b w:val="0"/>
+          <w:i w:val="0"/>
+          <w:sz w:val="22"/>
+        </w:rPr>
         <w:t xml:space="preserve"> nesta reunião pelo </w:t>
       </w:r>
       <w:r>
         <w:rPr>
+          <w:rFonts w:ascii="Calibri" w:hAnsi="Calibri"/>
           <w:b/>
+          <w:i w:val="0"/>
+          <w:sz w:val="22"/>
         </w:rPr>
         <w:t>Gerente de Projeto / PO (Abraão)</w:t>
       </w:r>
       <w:r>
+        <w:rPr>
+          <w:rFonts w:ascii="Calibri" w:hAnsi="Calibri"/>
+          <w:b w:val="0"/>
+          <w:i w:val="0"/>
+          <w:sz w:val="22"/>
+        </w:rPr>
         <w:t xml:space="preserve"> e pelo </w:t>
       </w:r>
       <w:r>
         <w:rPr>
+          <w:rFonts w:ascii="Calibri" w:hAnsi="Calibri"/>
           <w:b/>
+          <w:i w:val="0"/>
+          <w:sz w:val="22"/>
         </w:rPr>
         <w:t>Tech Lead / Arquiteto (Cézar Velazquez)</w:t>
       </w:r>
       <w:r>
+        <w:rPr>
+          <w:rFonts w:ascii="Calibri" w:hAnsi="Calibri"/>
+          <w:b w:val="0"/>
+          <w:i w:val="0"/>
+          <w:sz w:val="22"/>
+        </w:rPr>
         <w:t xml:space="preserve">, constituindo a baseline de design do projeto (PCP-MILHASFACIL01-001). Reitera-se que </w:t>
       </w:r>
       <w:r>
         <w:rPr>
+          <w:rFonts w:ascii="Calibri" w:hAnsi="Calibri"/>
           <w:b/>
+          <w:i w:val="0"/>
+          <w:sz w:val="22"/>
         </w:rPr>
         <w:t>não há aprovação de design de UI/UX</w:t>
       </w:r>
       <w:r>
+        <w:rPr>
+          <w:rFonts w:ascii="Calibri" w:hAnsi="Calibri"/>
+          <w:b w:val="0"/>
+          <w:i w:val="0"/>
+          <w:sz w:val="22"/>
+        </w:rPr>
         <w:t>, por o layout ser fornecido pelo cliente Hub de Milhas.</w:t>
       </w:r>
     </w:p>
     <w:tbl>
       <w:tblPr>
-        <w:tblStyle w:val="TableGrid"/>
         <w:tblW w:type="auto" w:w="0"/>
-        <w:jc w:val="center"/>
         <w:tblLook w:firstColumn="1" w:firstRow="1" w:lastColumn="0" w:lastRow="0" w:noHBand="0" w:noVBand="1" w:val="04A0"/>
+        <w:tblBorders>
+          <w:top w:val="single" w:sz="4" w:space="0" w:color="003366"/>
+          <w:left w:val="single" w:sz="4" w:space="0" w:color="003366"/>
+          <w:bottom w:val="single" w:sz="4" w:space="0" w:color="003366"/>
+          <w:right w:val="single" w:sz="4" w:space="0" w:color="003366"/>
+          <w:insideH w:val="single" w:sz="4" w:space="0" w:color="003366"/>
+          <w:insideV w:val="single" w:sz="4" w:space="0" w:color="003366"/>
+        </w:tblBorders>
       </w:tblPr>
       <w:tblGrid>
-        <w:gridCol w:w="3249"/>
-        <w:gridCol w:w="3249"/>
-        <w:gridCol w:w="3249"/>
+        <w:gridCol w:w="2967"/>
+        <w:gridCol w:w="2967"/>
+        <w:gridCol w:w="2967"/>
       </w:tblGrid>
       <w:tr>
+        <w:trPr>
+          <w:cantSplit w:val="1"/>
+        </w:trPr>
         <w:tc>
           <w:tcPr>
-            <w:tcW w:type="dxa" w:w="3249"/>
-            <w:shd w:val="clear" w:fill="1F3B73"/>
+            <w:tcW w:type="dxa" w:w="2967"/>
+            <w:tcMar>
+              <w:top w:w="60" w:type="dxa"/>
+              <w:bottom w:w="60" w:type="dxa"/>
+              <w:left w:w="100" w:type="dxa"/>
+              <w:right w:w="100" w:type="dxa"/>
+            </w:tcMar>
+            <w:shd w:val="clear" w:color="auto" w:fill="003366"/>
           </w:tcPr>
           <w:p>
-            <w:r/>
+            <w:pPr>
+              <w:spacing w:before="40" w:after="40"/>
+            </w:pPr>
             <w:r>
               <w:rPr>
+                <w:rFonts w:ascii="Calibri" w:hAnsi="Calibri"/>
                 <w:b/>
+                <w:i w:val="0"/>
                 <w:color w:val="FFFFFF"/>
-                <w:sz w:val="18"/>
+                <w:sz w:val="20"/>
               </w:rPr>
               <w:t>Aprovador</w:t>
             </w:r>
@@ -1826,16 +2857,26 @@
         </w:tc>
         <w:tc>
           <w:tcPr>
-            <w:tcW w:type="dxa" w:w="3249"/>
-            <w:shd w:val="clear" w:fill="1F3B73"/>
+            <w:tcW w:type="dxa" w:w="2967"/>
+            <w:tcMar>
+              <w:top w:w="60" w:type="dxa"/>
+              <w:bottom w:w="60" w:type="dxa"/>
+              <w:left w:w="100" w:type="dxa"/>
+              <w:right w:w="100" w:type="dxa"/>
+            </w:tcMar>
+            <w:shd w:val="clear" w:color="auto" w:fill="003366"/>
           </w:tcPr>
           <w:p>
-            <w:r/>
+            <w:pPr>
+              <w:spacing w:before="40" w:after="40"/>
+            </w:pPr>
             <w:r>
               <w:rPr>
+                <w:rFonts w:ascii="Calibri" w:hAnsi="Calibri"/>
                 <w:b/>
+                <w:i w:val="0"/>
                 <w:color w:val="FFFFFF"/>
-                <w:sz w:val="18"/>
+                <w:sz w:val="20"/>
               </w:rPr>
               <w:t>Papel</w:t>
             </w:r>
@@ -1843,16 +2884,26 @@
         </w:tc>
         <w:tc>
           <w:tcPr>
-            <w:tcW w:type="dxa" w:w="3249"/>
-            <w:shd w:val="clear" w:fill="1F3B73"/>
+            <w:tcW w:type="dxa" w:w="2967"/>
+            <w:tcMar>
+              <w:top w:w="60" w:type="dxa"/>
+              <w:bottom w:w="60" w:type="dxa"/>
+              <w:left w:w="100" w:type="dxa"/>
+              <w:right w:w="100" w:type="dxa"/>
+            </w:tcMar>
+            <w:shd w:val="clear" w:color="auto" w:fill="003366"/>
           </w:tcPr>
           <w:p>
-            <w:r/>
+            <w:pPr>
+              <w:spacing w:before="40" w:after="40"/>
+            </w:pPr>
             <w:r>
               <w:rPr>
+                <w:rFonts w:ascii="Calibri" w:hAnsi="Calibri"/>
                 <w:b/>
+                <w:i w:val="0"/>
                 <w:color w:val="FFFFFF"/>
-                <w:sz w:val="18"/>
+                <w:sz w:val="20"/>
               </w:rPr>
               <w:t>Decisão</w:t>
             </w:r>
@@ -1860,19 +2911,30 @@
         </w:tc>
       </w:tr>
       <w:tr>
+        <w:trPr>
+          <w:cantSplit w:val="1"/>
+        </w:trPr>
         <w:tc>
           <w:tcPr>
-            <w:tcW w:type="dxa" w:w="3249"/>
+            <w:tcW w:type="dxa" w:w="2967"/>
+            <w:tcMar>
+              <w:top w:w="60" w:type="dxa"/>
+              <w:bottom w:w="60" w:type="dxa"/>
+              <w:left w:w="100" w:type="dxa"/>
+              <w:right w:w="100" w:type="dxa"/>
+            </w:tcMar>
+            <w:shd w:val="clear" w:color="auto" w:fill="EBF5FB"/>
           </w:tcPr>
           <w:p>
+            <w:pPr>
+              <w:spacing w:before="40" w:after="40"/>
+            </w:pPr>
             <w:r>
               <w:rPr>
-                <w:sz w:val="17"/>
-              </w:rPr>
-            </w:r>
-            <w:r>
-              <w:rPr>
-                <w:sz w:val="17"/>
+                <w:rFonts w:ascii="Calibri" w:hAnsi="Calibri"/>
+                <w:b w:val="0"/>
+                <w:i w:val="0"/>
+                <w:sz w:val="20"/>
               </w:rPr>
               <w:t>Abraão</w:t>
             </w:r>
@@ -1880,17 +2942,25 @@
         </w:tc>
         <w:tc>
           <w:tcPr>
-            <w:tcW w:type="dxa" w:w="3249"/>
+            <w:tcW w:type="dxa" w:w="2967"/>
+            <w:tcMar>
+              <w:top w:w="60" w:type="dxa"/>
+              <w:bottom w:w="60" w:type="dxa"/>
+              <w:left w:w="100" w:type="dxa"/>
+              <w:right w:w="100" w:type="dxa"/>
+            </w:tcMar>
+            <w:shd w:val="clear" w:color="auto" w:fill="EBF5FB"/>
           </w:tcPr>
           <w:p>
+            <w:pPr>
+              <w:spacing w:before="40" w:after="40"/>
+            </w:pPr>
             <w:r>
               <w:rPr>
-                <w:sz w:val="17"/>
-              </w:rPr>
-            </w:r>
-            <w:r>
-              <w:rPr>
-                <w:sz w:val="17"/>
+                <w:rFonts w:ascii="Calibri" w:hAnsi="Calibri"/>
+                <w:b w:val="0"/>
+                <w:i w:val="0"/>
+                <w:sz w:val="20"/>
               </w:rPr>
               <w:t>Gerente de Projeto / PO</w:t>
             </w:r>
@@ -1898,17 +2968,25 @@
         </w:tc>
         <w:tc>
           <w:tcPr>
-            <w:tcW w:type="dxa" w:w="3249"/>
+            <w:tcW w:type="dxa" w:w="2967"/>
+            <w:tcMar>
+              <w:top w:w="60" w:type="dxa"/>
+              <w:bottom w:w="60" w:type="dxa"/>
+              <w:left w:w="100" w:type="dxa"/>
+              <w:right w:w="100" w:type="dxa"/>
+            </w:tcMar>
+            <w:shd w:val="clear" w:color="auto" w:fill="EBF5FB"/>
           </w:tcPr>
           <w:p>
+            <w:pPr>
+              <w:spacing w:before="40" w:after="40"/>
+            </w:pPr>
             <w:r>
               <w:rPr>
-                <w:sz w:val="17"/>
-              </w:rPr>
-            </w:r>
-            <w:r>
-              <w:rPr>
-                <w:sz w:val="17"/>
+                <w:rFonts w:ascii="Calibri" w:hAnsi="Calibri"/>
+                <w:b w:val="0"/>
+                <w:i w:val="0"/>
+                <w:sz w:val="20"/>
               </w:rPr>
               <w:t>Aprovado</w:t>
             </w:r>
@@ -1916,20 +2994,29 @@
         </w:tc>
       </w:tr>
       <w:tr>
+        <w:trPr>
+          <w:cantSplit w:val="1"/>
+        </w:trPr>
         <w:tc>
           <w:tcPr>
-            <w:tcW w:type="dxa" w:w="3249"/>
-            <w:shd w:val="clear" w:fill="EDF1F7"/>
+            <w:tcW w:type="dxa" w:w="2967"/>
+            <w:tcMar>
+              <w:top w:w="60" w:type="dxa"/>
+              <w:bottom w:w="60" w:type="dxa"/>
+              <w:left w:w="100" w:type="dxa"/>
+              <w:right w:w="100" w:type="dxa"/>
+            </w:tcMar>
           </w:tcPr>
           <w:p>
+            <w:pPr>
+              <w:spacing w:before="40" w:after="40"/>
+            </w:pPr>
             <w:r>
               <w:rPr>
-                <w:sz w:val="17"/>
-              </w:rPr>
-            </w:r>
-            <w:r>
-              <w:rPr>
-                <w:sz w:val="17"/>
+                <w:rFonts w:ascii="Calibri" w:hAnsi="Calibri"/>
+                <w:b w:val="0"/>
+                <w:i w:val="0"/>
+                <w:sz w:val="20"/>
               </w:rPr>
               <w:t>Cézar Velazquez</w:t>
             </w:r>
@@ -1937,18 +3024,24 @@
         </w:tc>
         <w:tc>
           <w:tcPr>
-            <w:tcW w:type="dxa" w:w="3249"/>
-            <w:shd w:val="clear" w:fill="EDF1F7"/>
+            <w:tcW w:type="dxa" w:w="2967"/>
+            <w:tcMar>
+              <w:top w:w="60" w:type="dxa"/>
+              <w:bottom w:w="60" w:type="dxa"/>
+              <w:left w:w="100" w:type="dxa"/>
+              <w:right w:w="100" w:type="dxa"/>
+            </w:tcMar>
           </w:tcPr>
           <w:p>
+            <w:pPr>
+              <w:spacing w:before="40" w:after="40"/>
+            </w:pPr>
             <w:r>
               <w:rPr>
-                <w:sz w:val="17"/>
-              </w:rPr>
-            </w:r>
-            <w:r>
-              <w:rPr>
-                <w:sz w:val="17"/>
+                <w:rFonts w:ascii="Calibri" w:hAnsi="Calibri"/>
+                <w:b w:val="0"/>
+                <w:i w:val="0"/>
+                <w:sz w:val="20"/>
               </w:rPr>
               <w:t>Tech Lead / Arquiteto</w:t>
             </w:r>
@@ -1956,18 +3049,24 @@
         </w:tc>
         <w:tc>
           <w:tcPr>
-            <w:tcW w:type="dxa" w:w="3249"/>
-            <w:shd w:val="clear" w:fill="EDF1F7"/>
+            <w:tcW w:type="dxa" w:w="2967"/>
+            <w:tcMar>
+              <w:top w:w="60" w:type="dxa"/>
+              <w:bottom w:w="60" w:type="dxa"/>
+              <w:left w:w="100" w:type="dxa"/>
+              <w:right w:w="100" w:type="dxa"/>
+            </w:tcMar>
           </w:tcPr>
           <w:p>
+            <w:pPr>
+              <w:spacing w:before="40" w:after="40"/>
+            </w:pPr>
             <w:r>
               <w:rPr>
-                <w:sz w:val="17"/>
-              </w:rPr>
-            </w:r>
-            <w:r>
-              <w:rPr>
-                <w:sz w:val="17"/>
+                <w:rFonts w:ascii="Calibri" w:hAnsi="Calibri"/>
+                <w:b w:val="0"/>
+                <w:i w:val="0"/>
+                <w:sz w:val="20"/>
               </w:rPr>
               <w:t>Aprovado</w:t>
             </w:r>
@@ -1976,40 +3075,64 @@
       </w:tr>
     </w:tbl>
     <w:p>
+      <w:pPr>
+        <w:spacing w:before="0" w:after="160"/>
+      </w:pPr>
+    </w:p>
+    <w:p>
+      <w:pPr>
+        <w:pStyle w:val="Heading2"/>
+        <w:keepNext/>
+        <w:keepLines/>
+      </w:pPr>
       <w:r>
-        <w:rPr>
-          <w:b/>
-          <w:color w:val="2E5CAA"/>
-          <w:sz w:val="23"/>
-        </w:rPr>
         <w:t>Evidências referenciadas</w:t>
       </w:r>
     </w:p>
     <w:tbl>
       <w:tblPr>
-        <w:tblStyle w:val="TableGrid"/>
         <w:tblW w:type="auto" w:w="0"/>
-        <w:jc w:val="center"/>
         <w:tblLook w:firstColumn="1" w:firstRow="1" w:lastColumn="0" w:lastRow="0" w:noHBand="0" w:noVBand="1" w:val="04A0"/>
+        <w:tblBorders>
+          <w:top w:val="single" w:sz="4" w:space="0" w:color="003366"/>
+          <w:left w:val="single" w:sz="4" w:space="0" w:color="003366"/>
+          <w:bottom w:val="single" w:sz="4" w:space="0" w:color="003366"/>
+          <w:right w:val="single" w:sz="4" w:space="0" w:color="003366"/>
+          <w:insideH w:val="single" w:sz="4" w:space="0" w:color="003366"/>
+          <w:insideV w:val="single" w:sz="4" w:space="0" w:color="003366"/>
+        </w:tblBorders>
       </w:tblPr>
       <w:tblGrid>
-        <w:gridCol w:w="3249"/>
-        <w:gridCol w:w="3249"/>
-        <w:gridCol w:w="3249"/>
+        <w:gridCol w:w="2967"/>
+        <w:gridCol w:w="2967"/>
+        <w:gridCol w:w="2967"/>
       </w:tblGrid>
       <w:tr>
+        <w:trPr>
+          <w:cantSplit w:val="1"/>
+        </w:trPr>
         <w:tc>
           <w:tcPr>
-            <w:tcW w:type="dxa" w:w="3249"/>
-            <w:shd w:val="clear" w:fill="1F3B73"/>
+            <w:tcW w:type="dxa" w:w="2967"/>
+            <w:tcMar>
+              <w:top w:w="60" w:type="dxa"/>
+              <w:bottom w:w="60" w:type="dxa"/>
+              <w:left w:w="100" w:type="dxa"/>
+              <w:right w:w="100" w:type="dxa"/>
+            </w:tcMar>
+            <w:shd w:val="clear" w:color="auto" w:fill="003366"/>
           </w:tcPr>
           <w:p>
-            <w:r/>
+            <w:pPr>
+              <w:spacing w:before="40" w:after="40"/>
+            </w:pPr>
             <w:r>
               <w:rPr>
+                <w:rFonts w:ascii="Calibri" w:hAnsi="Calibri"/>
                 <w:b/>
+                <w:i w:val="0"/>
                 <w:color w:val="FFFFFF"/>
-                <w:sz w:val="18"/>
+                <w:sz w:val="20"/>
               </w:rPr>
               <w:t>Código</w:t>
             </w:r>
@@ -2017,16 +3140,26 @@
         </w:tc>
         <w:tc>
           <w:tcPr>
-            <w:tcW w:type="dxa" w:w="3249"/>
-            <w:shd w:val="clear" w:fill="1F3B73"/>
+            <w:tcW w:type="dxa" w:w="2967"/>
+            <w:tcMar>
+              <w:top w:w="60" w:type="dxa"/>
+              <w:bottom w:w="60" w:type="dxa"/>
+              <w:left w:w="100" w:type="dxa"/>
+              <w:right w:w="100" w:type="dxa"/>
+            </w:tcMar>
+            <w:shd w:val="clear" w:color="auto" w:fill="003366"/>
           </w:tcPr>
           <w:p>
-            <w:r/>
+            <w:pPr>
+              <w:spacing w:before="40" w:after="40"/>
+            </w:pPr>
             <w:r>
               <w:rPr>
+                <w:rFonts w:ascii="Calibri" w:hAnsi="Calibri"/>
                 <w:b/>
+                <w:i w:val="0"/>
                 <w:color w:val="FFFFFF"/>
-                <w:sz w:val="18"/>
+                <w:sz w:val="20"/>
               </w:rPr>
               <w:t>O que capturar</w:t>
             </w:r>
@@ -2034,16 +3167,26 @@
         </w:tc>
         <w:tc>
           <w:tcPr>
-            <w:tcW w:type="dxa" w:w="3249"/>
-            <w:shd w:val="clear" w:fill="1F3B73"/>
+            <w:tcW w:type="dxa" w:w="2967"/>
+            <w:tcMar>
+              <w:top w:w="60" w:type="dxa"/>
+              <w:bottom w:w="60" w:type="dxa"/>
+              <w:left w:w="100" w:type="dxa"/>
+              <w:right w:w="100" w:type="dxa"/>
+            </w:tcMar>
+            <w:shd w:val="clear" w:color="auto" w:fill="003366"/>
           </w:tcPr>
           <w:p>
-            <w:r/>
+            <w:pPr>
+              <w:spacing w:before="40" w:after="40"/>
+            </w:pPr>
             <w:r>
               <w:rPr>
+                <w:rFonts w:ascii="Calibri" w:hAnsi="Calibri"/>
                 <w:b/>
+                <w:i w:val="0"/>
                 <w:color w:val="FFFFFF"/>
-                <w:sz w:val="18"/>
+                <w:sz w:val="20"/>
               </w:rPr>
               <w:t>Fonte</w:t>
             </w:r>
@@ -2051,19 +3194,30 @@
         </w:tc>
       </w:tr>
       <w:tr>
+        <w:trPr>
+          <w:cantSplit w:val="1"/>
+        </w:trPr>
         <w:tc>
           <w:tcPr>
-            <w:tcW w:type="dxa" w:w="3249"/>
+            <w:tcW w:type="dxa" w:w="2967"/>
+            <w:tcMar>
+              <w:top w:w="60" w:type="dxa"/>
+              <w:bottom w:w="60" w:type="dxa"/>
+              <w:left w:w="100" w:type="dxa"/>
+              <w:right w:w="100" w:type="dxa"/>
+            </w:tcMar>
+            <w:shd w:val="clear" w:color="auto" w:fill="EBF5FB"/>
           </w:tcPr>
           <w:p>
+            <w:pPr>
+              <w:spacing w:before="40" w:after="40"/>
+            </w:pPr>
             <w:r>
               <w:rPr>
-                <w:sz w:val="17"/>
-              </w:rPr>
-            </w:r>
-            <w:r>
-              <w:rPr>
-                <w:sz w:val="17"/>
+                <w:rFonts w:ascii="Calibri" w:hAnsi="Calibri"/>
+                <w:b w:val="0"/>
+                <w:i w:val="0"/>
+                <w:sz w:val="20"/>
               </w:rPr>
               <w:t>IMG-ARQ-01</w:t>
             </w:r>
@@ -2071,17 +3225,25 @@
         </w:tc>
         <w:tc>
           <w:tcPr>
-            <w:tcW w:type="dxa" w:w="3249"/>
+            <w:tcW w:type="dxa" w:w="2967"/>
+            <w:tcMar>
+              <w:top w:w="60" w:type="dxa"/>
+              <w:bottom w:w="60" w:type="dxa"/>
+              <w:left w:w="100" w:type="dxa"/>
+              <w:right w:w="100" w:type="dxa"/>
+            </w:tcMar>
+            <w:shd w:val="clear" w:color="auto" w:fill="EBF5FB"/>
           </w:tcPr>
           <w:p>
+            <w:pPr>
+              <w:spacing w:before="40" w:after="40"/>
+            </w:pPr>
             <w:r>
               <w:rPr>
-                <w:sz w:val="17"/>
-              </w:rPr>
-            </w:r>
-            <w:r>
-              <w:rPr>
-                <w:sz w:val="17"/>
+                <w:rFonts w:ascii="Calibri" w:hAnsi="Calibri"/>
+                <w:b w:val="0"/>
+                <w:i w:val="0"/>
+                <w:sz w:val="20"/>
               </w:rPr>
               <w:t>Diagrama de arquitetura da solução (3 serviços)</w:t>
             </w:r>
@@ -2089,17 +3251,25 @@
         </w:tc>
         <w:tc>
           <w:tcPr>
-            <w:tcW w:type="dxa" w:w="3249"/>
+            <w:tcW w:type="dxa" w:w="2967"/>
+            <w:tcMar>
+              <w:top w:w="60" w:type="dxa"/>
+              <w:bottom w:w="60" w:type="dxa"/>
+              <w:left w:w="100" w:type="dxa"/>
+              <w:right w:w="100" w:type="dxa"/>
+            </w:tcMar>
+            <w:shd w:val="clear" w:color="auto" w:fill="EBF5FB"/>
           </w:tcPr>
           <w:p>
+            <w:pPr>
+              <w:spacing w:before="40" w:after="40"/>
+            </w:pPr>
             <w:r>
               <w:rPr>
-                <w:sz w:val="17"/>
-              </w:rPr>
-            </w:r>
-            <w:r>
-              <w:rPr>
-                <w:sz w:val="17"/>
+                <w:rFonts w:ascii="Calibri" w:hAnsi="Calibri"/>
+                <w:b w:val="0"/>
+                <w:i w:val="0"/>
+                <w:sz w:val="20"/>
               </w:rPr>
               <w:t>Documento de arquitetura / quadro do Design Review</w:t>
             </w:r>
@@ -2109,45 +3279,66 @@
     </w:tbl>
     <w:p>
       <w:pPr>
+        <w:spacing w:before="0" w:after="160"/>
+      </w:pPr>
+    </w:p>
+    <w:p>
+      <w:pPr>
+        <w:pStyle w:val="Heading1"/>
+        <w:keepNext/>
+        <w:keepLines/>
         <w:pBdr>
-          <w:bottom w:val="single" w:sz="6" w:space="3" w:color="1F3B73"/>
+          <w:bottom w:val="single" w:sz="4" w:space="2" w:color="D6E4F0"/>
         </w:pBdr>
       </w:pPr>
       <w:r>
-        <w:rPr>
-          <w:b/>
-          <w:color w:val="1F3B73"/>
-          <w:sz w:val="27"/>
-        </w:rPr>
         <w:t>Histórico de revisões</w:t>
       </w:r>
     </w:p>
     <w:tbl>
       <w:tblPr>
-        <w:tblStyle w:val="TableGrid"/>
         <w:tblW w:type="auto" w:w="0"/>
-        <w:jc w:val="center"/>
         <w:tblLook w:firstColumn="1" w:firstRow="1" w:lastColumn="0" w:lastRow="0" w:noHBand="0" w:noVBand="1" w:val="04A0"/>
+        <w:tblBorders>
+          <w:top w:val="single" w:sz="4" w:space="0" w:color="AAAAAA"/>
+          <w:left w:val="single" w:sz="4" w:space="0" w:color="AAAAAA"/>
+          <w:bottom w:val="single" w:sz="4" w:space="0" w:color="AAAAAA"/>
+          <w:right w:val="single" w:sz="4" w:space="0" w:color="AAAAAA"/>
+          <w:insideH w:val="single" w:sz="4" w:space="0" w:color="AAAAAA"/>
+          <w:insideV w:val="single" w:sz="4" w:space="0" w:color="AAAAAA"/>
+        </w:tblBorders>
       </w:tblPr>
       <w:tblGrid>
-        <w:gridCol w:w="2436"/>
-        <w:gridCol w:w="2436"/>
-        <w:gridCol w:w="2436"/>
-        <w:gridCol w:w="2436"/>
+        <w:gridCol w:w="2225"/>
+        <w:gridCol w:w="2225"/>
+        <w:gridCol w:w="2225"/>
+        <w:gridCol w:w="2225"/>
       </w:tblGrid>
       <w:tr>
+        <w:trPr>
+          <w:cantSplit w:val="1"/>
+        </w:trPr>
         <w:tc>
           <w:tcPr>
-            <w:tcW w:type="dxa" w:w="2436"/>
-            <w:shd w:val="clear" w:fill="1F3B73"/>
+            <w:tcW w:type="dxa" w:w="2225"/>
+            <w:tcMar>
+              <w:top w:w="60" w:type="dxa"/>
+              <w:bottom w:w="60" w:type="dxa"/>
+              <w:left w:w="100" w:type="dxa"/>
+              <w:right w:w="100" w:type="dxa"/>
+            </w:tcMar>
+            <w:shd w:val="clear" w:color="auto" w:fill="D6E4F0"/>
           </w:tcPr>
           <w:p>
-            <w:r/>
+            <w:pPr>
+              <w:spacing w:before="40" w:after="40"/>
+            </w:pPr>
             <w:r>
               <w:rPr>
+                <w:rFonts w:ascii="Calibri" w:hAnsi="Calibri"/>
                 <w:b/>
-                <w:color w:val="FFFFFF"/>
-                <w:sz w:val="18"/>
+                <w:i w:val="0"/>
+                <w:sz w:val="20"/>
               </w:rPr>
               <w:t>Versão</w:t>
             </w:r>
@@ -2155,16 +3346,25 @@
         </w:tc>
         <w:tc>
           <w:tcPr>
-            <w:tcW w:type="dxa" w:w="2436"/>
-            <w:shd w:val="clear" w:fill="1F3B73"/>
+            <w:tcW w:type="dxa" w:w="2225"/>
+            <w:tcMar>
+              <w:top w:w="60" w:type="dxa"/>
+              <w:bottom w:w="60" w:type="dxa"/>
+              <w:left w:w="100" w:type="dxa"/>
+              <w:right w:w="100" w:type="dxa"/>
+            </w:tcMar>
+            <w:shd w:val="clear" w:color="auto" w:fill="D6E4F0"/>
           </w:tcPr>
           <w:p>
-            <w:r/>
+            <w:pPr>
+              <w:spacing w:before="40" w:after="40"/>
+            </w:pPr>
             <w:r>
               <w:rPr>
+                <w:rFonts w:ascii="Calibri" w:hAnsi="Calibri"/>
                 <w:b/>
-                <w:color w:val="FFFFFF"/>
-                <w:sz w:val="18"/>
+                <w:i w:val="0"/>
+                <w:sz w:val="20"/>
               </w:rPr>
               <w:t>Data</w:t>
             </w:r>
@@ -2172,16 +3372,25 @@
         </w:tc>
         <w:tc>
           <w:tcPr>
-            <w:tcW w:type="dxa" w:w="2436"/>
-            <w:shd w:val="clear" w:fill="1F3B73"/>
+            <w:tcW w:type="dxa" w:w="2225"/>
+            <w:tcMar>
+              <w:top w:w="60" w:type="dxa"/>
+              <w:bottom w:w="60" w:type="dxa"/>
+              <w:left w:w="100" w:type="dxa"/>
+              <w:right w:w="100" w:type="dxa"/>
+            </w:tcMar>
+            <w:shd w:val="clear" w:color="auto" w:fill="D6E4F0"/>
           </w:tcPr>
           <w:p>
-            <w:r/>
+            <w:pPr>
+              <w:spacing w:before="40" w:after="40"/>
+            </w:pPr>
             <w:r>
               <w:rPr>
+                <w:rFonts w:ascii="Calibri" w:hAnsi="Calibri"/>
                 <w:b/>
-                <w:color w:val="FFFFFF"/>
-                <w:sz w:val="18"/>
+                <w:i w:val="0"/>
+                <w:sz w:val="20"/>
               </w:rPr>
               <w:t>Autor</w:t>
             </w:r>
@@ -2189,16 +3398,25 @@
         </w:tc>
         <w:tc>
           <w:tcPr>
-            <w:tcW w:type="dxa" w:w="2436"/>
-            <w:shd w:val="clear" w:fill="1F3B73"/>
+            <w:tcW w:type="dxa" w:w="2225"/>
+            <w:tcMar>
+              <w:top w:w="60" w:type="dxa"/>
+              <w:bottom w:w="60" w:type="dxa"/>
+              <w:left w:w="100" w:type="dxa"/>
+              <w:right w:w="100" w:type="dxa"/>
+            </w:tcMar>
+            <w:shd w:val="clear" w:color="auto" w:fill="D6E4F0"/>
           </w:tcPr>
           <w:p>
-            <w:r/>
+            <w:pPr>
+              <w:spacing w:before="40" w:after="40"/>
+            </w:pPr>
             <w:r>
               <w:rPr>
+                <w:rFonts w:ascii="Calibri" w:hAnsi="Calibri"/>
                 <w:b/>
-                <w:color w:val="FFFFFF"/>
-                <w:sz w:val="18"/>
+                <w:i w:val="0"/>
+                <w:sz w:val="20"/>
               </w:rPr>
               <w:t>Descrição</w:t>
             </w:r>
@@ -2206,19 +3424,30 @@
         </w:tc>
       </w:tr>
       <w:tr>
+        <w:trPr>
+          <w:cantSplit w:val="1"/>
+        </w:trPr>
         <w:tc>
           <w:tcPr>
-            <w:tcW w:type="dxa" w:w="2436"/>
+            <w:tcW w:type="dxa" w:w="2225"/>
+            <w:tcMar>
+              <w:top w:w="60" w:type="dxa"/>
+              <w:bottom w:w="60" w:type="dxa"/>
+              <w:left w:w="100" w:type="dxa"/>
+              <w:right w:w="100" w:type="dxa"/>
+            </w:tcMar>
+            <w:shd w:val="clear" w:color="auto" w:fill="F0F4F8"/>
           </w:tcPr>
           <w:p>
+            <w:pPr>
+              <w:spacing w:before="40" w:after="40"/>
+            </w:pPr>
             <w:r>
               <w:rPr>
-                <w:sz w:val="17"/>
-              </w:rPr>
-            </w:r>
-            <w:r>
-              <w:rPr>
-                <w:sz w:val="17"/>
+                <w:rFonts w:ascii="Calibri" w:hAnsi="Calibri"/>
+                <w:b/>
+                <w:i w:val="0"/>
+                <w:sz w:val="20"/>
               </w:rPr>
               <w:t>1.0</w:t>
             </w:r>
@@ -2226,17 +3455,24 @@
         </w:tc>
         <w:tc>
           <w:tcPr>
-            <w:tcW w:type="dxa" w:w="2436"/>
+            <w:tcW w:type="dxa" w:w="2225"/>
+            <w:tcMar>
+              <w:top w:w="60" w:type="dxa"/>
+              <w:bottom w:w="60" w:type="dxa"/>
+              <w:left w:w="100" w:type="dxa"/>
+              <w:right w:w="100" w:type="dxa"/>
+            </w:tcMar>
           </w:tcPr>
           <w:p>
+            <w:pPr>
+              <w:spacing w:before="40" w:after="40"/>
+            </w:pPr>
             <w:r>
               <w:rPr>
-                <w:sz w:val="17"/>
-              </w:rPr>
-            </w:r>
-            <w:r>
-              <w:rPr>
-                <w:sz w:val="17"/>
+                <w:rFonts w:ascii="Calibri" w:hAnsi="Calibri"/>
+                <w:b w:val="0"/>
+                <w:i w:val="0"/>
+                <w:sz w:val="20"/>
               </w:rPr>
               <w:t>15/06/2026</w:t>
             </w:r>
@@ -2244,17 +3480,24 @@
         </w:tc>
         <w:tc>
           <w:tcPr>
-            <w:tcW w:type="dxa" w:w="2436"/>
+            <w:tcW w:type="dxa" w:w="2225"/>
+            <w:tcMar>
+              <w:top w:w="60" w:type="dxa"/>
+              <w:bottom w:w="60" w:type="dxa"/>
+              <w:left w:w="100" w:type="dxa"/>
+              <w:right w:w="100" w:type="dxa"/>
+            </w:tcMar>
           </w:tcPr>
           <w:p>
+            <w:pPr>
+              <w:spacing w:before="40" w:after="40"/>
+            </w:pPr>
             <w:r>
               <w:rPr>
-                <w:sz w:val="17"/>
-              </w:rPr>
-            </w:r>
-            <w:r>
-              <w:rPr>
-                <w:sz w:val="17"/>
+                <w:rFonts w:ascii="Calibri" w:hAnsi="Calibri"/>
+                <w:b w:val="0"/>
+                <w:i w:val="0"/>
+                <w:sz w:val="20"/>
               </w:rPr>
               <w:t>Time de Melhoria Contínua</w:t>
             </w:r>
@@ -2262,32 +3505,334 @@
         </w:tc>
         <w:tc>
           <w:tcPr>
-            <w:tcW w:type="dxa" w:w="2436"/>
+            <w:tcW w:type="dxa" w:w="2225"/>
+            <w:tcMar>
+              <w:top w:w="60" w:type="dxa"/>
+              <w:bottom w:w="60" w:type="dxa"/>
+              <w:left w:w="100" w:type="dxa"/>
+              <w:right w:w="100" w:type="dxa"/>
+            </w:tcMar>
           </w:tcPr>
           <w:p>
+            <w:pPr>
+              <w:spacing w:before="40" w:after="40"/>
+            </w:pPr>
             <w:r>
               <w:rPr>
-                <w:sz w:val="17"/>
-              </w:rPr>
-            </w:r>
-            <w:r>
-              <w:rPr>
-                <w:sz w:val="17"/>
+                <w:rFonts w:ascii="Calibri" w:hAnsi="Calibri"/>
+                <w:b w:val="0"/>
+                <w:i w:val="0"/>
+                <w:sz w:val="20"/>
               </w:rPr>
               <w:t>Emissão inicial — registro da reunião de Design Review e aprovação da arquitetura (PO + Tech Lead) realizada em 11/02/2026.</w:t>
             </w:r>
           </w:p>
         </w:tc>
       </w:tr>
+      <w:tr>
+        <w:trPr>
+          <w:cantSplit w:val="1"/>
+        </w:trPr>
+        <w:tc>
+          <w:tcPr>
+            <w:tcW w:type="dxa" w:w="2225"/>
+            <w:tcMar>
+              <w:top w:w="60" w:type="dxa"/>
+              <w:bottom w:w="60" w:type="dxa"/>
+              <w:left w:w="100" w:type="dxa"/>
+              <w:right w:w="100" w:type="dxa"/>
+            </w:tcMar>
+            <w:shd w:val="clear" w:color="auto" w:fill="F0F4F8"/>
+          </w:tcPr>
+          <w:p>
+            <w:pPr>
+              <w:spacing w:before="40" w:after="40"/>
+            </w:pPr>
+            <w:r>
+              <w:rPr>
+                <w:rFonts w:ascii="Calibri" w:hAnsi="Calibri"/>
+                <w:b/>
+                <w:i w:val="0"/>
+                <w:sz w:val="20"/>
+              </w:rPr>
+              <w:t>1.1</w:t>
+            </w:r>
+          </w:p>
+        </w:tc>
+        <w:tc>
+          <w:tcPr>
+            <w:tcW w:type="dxa" w:w="2225"/>
+            <w:tcMar>
+              <w:top w:w="60" w:type="dxa"/>
+              <w:bottom w:w="60" w:type="dxa"/>
+              <w:left w:w="100" w:type="dxa"/>
+              <w:right w:w="100" w:type="dxa"/>
+            </w:tcMar>
+          </w:tcPr>
+          <w:p>
+            <w:pPr>
+              <w:spacing w:before="40" w:after="40"/>
+            </w:pPr>
+            <w:r>
+              <w:rPr>
+                <w:rFonts w:ascii="Calibri" w:hAnsi="Calibri"/>
+                <w:b w:val="0"/>
+                <w:i w:val="0"/>
+                <w:sz w:val="20"/>
+              </w:rPr>
+              <w:t>15/06/2026</w:t>
+            </w:r>
+          </w:p>
+        </w:tc>
+        <w:tc>
+          <w:tcPr>
+            <w:tcW w:type="dxa" w:w="2225"/>
+            <w:tcMar>
+              <w:top w:w="60" w:type="dxa"/>
+              <w:bottom w:w="60" w:type="dxa"/>
+              <w:left w:w="100" w:type="dxa"/>
+              <w:right w:w="100" w:type="dxa"/>
+            </w:tcMar>
+          </w:tcPr>
+          <w:p>
+            <w:pPr>
+              <w:spacing w:before="40" w:after="40"/>
+            </w:pPr>
+            <w:r>
+              <w:rPr>
+                <w:rFonts w:ascii="Calibri" w:hAnsi="Calibri"/>
+                <w:b w:val="0"/>
+                <w:i w:val="0"/>
+                <w:sz w:val="20"/>
+              </w:rPr>
+              <w:t>Time de Melhoria Contínua</w:t>
+            </w:r>
+          </w:p>
+        </w:tc>
+        <w:tc>
+          <w:tcPr>
+            <w:tcW w:type="dxa" w:w="2225"/>
+            <w:tcMar>
+              <w:top w:w="60" w:type="dxa"/>
+              <w:bottom w:w="60" w:type="dxa"/>
+              <w:left w:w="100" w:type="dxa"/>
+              <w:right w:w="100" w:type="dxa"/>
+            </w:tcMar>
+          </w:tcPr>
+          <w:p>
+            <w:pPr>
+              <w:spacing w:before="40" w:after="40"/>
+            </w:pPr>
+            <w:r>
+              <w:rPr>
+                <w:rFonts w:ascii="Calibri" w:hAnsi="Calibri"/>
+                <w:b w:val="0"/>
+                <w:i w:val="0"/>
+                <w:sz w:val="20"/>
+              </w:rPr>
+              <w:t>Inclusão dos campos de cabeçalho Código do projeto (MILHASFACIL01) e Organização (Timeware Brasil Softwares e Serviços LTDA), padronizando com os demais registros do projeto.</w:t>
+            </w:r>
+          </w:p>
+        </w:tc>
+      </w:tr>
     </w:tbl>
+    <w:p>
+      <w:pPr>
+        <w:spacing w:before="0" w:after="160"/>
+      </w:pPr>
+    </w:p>
     <w:sectPr>
-      <w:pgSz w:w="12240" w:h="15840"/>
-      <w:pgMar w:top="1134" w:right="1247" w:bottom="1134" w:left="1247" w:header="720" w:footer="720" w:gutter="0"/>
+      <w:headerReference w:type="default" r:id="rId9"/>
+      <w:headerReference w:type="first" r:id="rId10"/>
+      <w:footerReference w:type="default" r:id="rId11"/>
+      <w:footerReference w:type="first" r:id="rId12"/>
+      <w:pgSz w:w="11906" w:h="16838"/>
+      <w:pgMar w:top="1587" w:right="1417" w:bottom="1417" w:left="1587" w:header="720" w:footer="720" w:gutter="0"/>
       <w:cols w:space="720"/>
+      <w:titlePg/>
       <w:docGrid w:linePitch="360"/>
     </w:sectPr>
   </w:body>
 </w:document>
+</file>
+
+<file path=word/footer1.xml><?xml version="1.0" encoding="utf-8"?>
+<w:ftr xmlns:m="http://schemas.openxmlformats.org/officeDocument/2006/math" xmlns:mc="http://schemas.openxmlformats.org/markup-compatibility/2006" xmlns:mo="http://schemas.microsoft.com/office/mac/office/2008/main" xmlns:mv="urn:schemas-microsoft-com:mac:vml" xmlns:o="urn:schemas-microsoft-com:office:office" xmlns:r="http://schemas.openxmlformats.org/officeDocument/2006/relationships" xmlns:v="urn:schemas-microsoft-com:vml" xmlns:w10="urn:schemas-microsoft-com:office:word" xmlns:w14="http://schemas.microsoft.com/office/word/2010/wordml" xmlns:w="http://schemas.openxmlformats.org/wordprocessingml/2006/main" xmlns:wne="http://schemas.microsoft.com/office/word/2006/wordml" xmlns:wp14="http://schemas.microsoft.com/office/word/2010/wordprocessingDrawing" xmlns:wp="http://schemas.openxmlformats.org/drawingml/2006/wordprocessingDrawing" xmlns:wpc="http://schemas.microsoft.com/office/word/2010/wordprocessingCanvas" xmlns:wpg="http://schemas.microsoft.com/office/word/2010/wordprocessingGroup" xmlns:wpi="http://schemas.microsoft.com/office/word/2010/wordprocessingInk" xmlns:wps="http://schemas.microsoft.com/office/word/2010/wordprocessingShape" mc:Ignorable="w14 wp14">
+  <w:p>
+    <w:pPr>
+      <w:pStyle w:val="Footer"/>
+      <w:tabs>
+        <w:tab w:val="right" w:pos="8901"/>
+      </w:tabs>
+      <w:pBdr>
+        <w:top w:val="single" w:sz="4" w:space="4" w:color="003366"/>
+      </w:pBdr>
+      <w:spacing w:before="80" w:after="0"/>
+    </w:pPr>
+    <w:r>
+      <w:rPr>
+        <w:rFonts w:ascii="Calibri" w:hAnsi="Calibri"/>
+        <w:color w:val="555555"/>
+        <w:sz w:val="16"/>
+      </w:rPr>
+      <w:t>v1.1  ·  11/02/2026</w:t>
+    </w:r>
+    <w:r>
+      <w:tab/>
+    </w:r>
+    <w:r>
+      <w:rPr>
+        <w:rFonts w:ascii="Calibri" w:hAnsi="Calibri"/>
+        <w:color w:val="555555"/>
+        <w:sz w:val="16"/>
+      </w:rPr>
+      <w:t xml:space="preserve">Página </w:t>
+    </w:r>
+    <w:r>
+      <w:rPr>
+        <w:rFonts w:ascii="Calibri" w:hAnsi="Calibri"/>
+        <w:sz w:val="16"/>
+      </w:rPr>
+      <w:fldChar w:fldCharType="begin"/>
+      <w:instrText xml:space="preserve"> PAGE </w:instrText>
+      <w:fldChar w:fldCharType="end"/>
+    </w:r>
+    <w:r>
+      <w:rPr>
+        <w:rFonts w:ascii="Calibri" w:hAnsi="Calibri"/>
+        <w:color w:val="555555"/>
+        <w:sz w:val="16"/>
+      </w:rPr>
+      <w:t xml:space="preserve"> de </w:t>
+    </w:r>
+    <w:r>
+      <w:rPr>
+        <w:rFonts w:ascii="Calibri" w:hAnsi="Calibri"/>
+        <w:sz w:val="16"/>
+      </w:rPr>
+      <w:fldChar w:fldCharType="begin"/>
+      <w:instrText xml:space="preserve"> NUMPAGES </w:instrText>
+      <w:fldChar w:fldCharType="end"/>
+    </w:r>
+  </w:p>
+</w:ftr>
+</file>
+
+<file path=word/footer2.xml><?xml version="1.0" encoding="utf-8"?>
+<w:ftr xmlns:m="http://schemas.openxmlformats.org/officeDocument/2006/math" xmlns:mc="http://schemas.openxmlformats.org/markup-compatibility/2006" xmlns:mo="http://schemas.microsoft.com/office/mac/office/2008/main" xmlns:mv="urn:schemas-microsoft-com:mac:vml" xmlns:o="urn:schemas-microsoft-com:office:office" xmlns:r="http://schemas.openxmlformats.org/officeDocument/2006/relationships" xmlns:v="urn:schemas-microsoft-com:vml" xmlns:w10="urn:schemas-microsoft-com:office:word" xmlns:w14="http://schemas.microsoft.com/office/word/2010/wordml" xmlns:w="http://schemas.openxmlformats.org/wordprocessingml/2006/main" xmlns:wne="http://schemas.microsoft.com/office/word/2006/wordml" xmlns:wp14="http://schemas.microsoft.com/office/word/2010/wordprocessingDrawing" xmlns:wp="http://schemas.openxmlformats.org/drawingml/2006/wordprocessingDrawing" xmlns:wpc="http://schemas.microsoft.com/office/word/2010/wordprocessingCanvas" xmlns:wpg="http://schemas.microsoft.com/office/word/2010/wordprocessingGroup" xmlns:wpi="http://schemas.microsoft.com/office/word/2010/wordprocessingInk" xmlns:wps="http://schemas.microsoft.com/office/word/2010/wordprocessingShape" mc:Ignorable="w14 wp14">
+  <w:p>
+    <w:pPr>
+      <w:pStyle w:val="Footer"/>
+      <w:tabs>
+        <w:tab w:val="right" w:pos="8901"/>
+      </w:tabs>
+      <w:pBdr>
+        <w:top w:val="single" w:sz="4" w:space="4" w:color="003366"/>
+      </w:pBdr>
+      <w:spacing w:before="80" w:after="0"/>
+    </w:pPr>
+    <w:r>
+      <w:rPr>
+        <w:rFonts w:ascii="Calibri" w:hAnsi="Calibri"/>
+        <w:color w:val="555555"/>
+        <w:sz w:val="16"/>
+      </w:rPr>
+      <w:t>v1.1  ·  11/02/2026</w:t>
+    </w:r>
+    <w:r>
+      <w:tab/>
+    </w:r>
+    <w:r>
+      <w:rPr>
+        <w:rFonts w:ascii="Calibri" w:hAnsi="Calibri"/>
+        <w:color w:val="555555"/>
+        <w:sz w:val="16"/>
+      </w:rPr>
+      <w:t xml:space="preserve">Página </w:t>
+    </w:r>
+    <w:r>
+      <w:rPr>
+        <w:rFonts w:ascii="Calibri" w:hAnsi="Calibri"/>
+        <w:sz w:val="16"/>
+      </w:rPr>
+      <w:fldChar w:fldCharType="begin"/>
+      <w:instrText xml:space="preserve"> PAGE </w:instrText>
+      <w:fldChar w:fldCharType="end"/>
+    </w:r>
+    <w:r>
+      <w:rPr>
+        <w:rFonts w:ascii="Calibri" w:hAnsi="Calibri"/>
+        <w:color w:val="555555"/>
+        <w:sz w:val="16"/>
+      </w:rPr>
+      <w:t xml:space="preserve"> de </w:t>
+    </w:r>
+    <w:r>
+      <w:rPr>
+        <w:rFonts w:ascii="Calibri" w:hAnsi="Calibri"/>
+        <w:sz w:val="16"/>
+      </w:rPr>
+      <w:fldChar w:fldCharType="begin"/>
+      <w:instrText xml:space="preserve"> NUMPAGES </w:instrText>
+      <w:fldChar w:fldCharType="end"/>
+    </w:r>
+  </w:p>
+</w:ftr>
+</file>
+
+<file path=word/header1.xml><?xml version="1.0" encoding="utf-8"?>
+<w:hdr xmlns:m="http://schemas.openxmlformats.org/officeDocument/2006/math" xmlns:mc="http://schemas.openxmlformats.org/markup-compatibility/2006" xmlns:mo="http://schemas.microsoft.com/office/mac/office/2008/main" xmlns:mv="urn:schemas-microsoft-com:mac:vml" xmlns:o="urn:schemas-microsoft-com:office:office" xmlns:r="http://schemas.openxmlformats.org/officeDocument/2006/relationships" xmlns:v="urn:schemas-microsoft-com:vml" xmlns:w10="urn:schemas-microsoft-com:office:word" xmlns:w14="http://schemas.microsoft.com/office/word/2010/wordml" xmlns:w="http://schemas.openxmlformats.org/wordprocessingml/2006/main" xmlns:wne="http://schemas.microsoft.com/office/word/2006/wordml" xmlns:wp14="http://schemas.microsoft.com/office/word/2010/wordprocessingDrawing" xmlns:wp="http://schemas.openxmlformats.org/drawingml/2006/wordprocessingDrawing" xmlns:wpc="http://schemas.microsoft.com/office/word/2010/wordprocessingCanvas" xmlns:wpg="http://schemas.microsoft.com/office/word/2010/wordprocessingGroup" xmlns:wpi="http://schemas.microsoft.com/office/word/2010/wordprocessingInk" xmlns:wps="http://schemas.microsoft.com/office/word/2010/wordprocessingShape" mc:Ignorable="w14 wp14">
+  <w:p>
+    <w:pPr>
+      <w:pStyle w:val="Header"/>
+      <w:tabs>
+        <w:tab w:val="right" w:pos="8901"/>
+      </w:tabs>
+      <w:pBdr>
+        <w:bottom w:val="single" w:sz="8" w:space="4" w:color="003366"/>
+      </w:pBdr>
+      <w:spacing w:before="0" w:after="80"/>
+    </w:pPr>
+    <w:r>
+      <w:rPr>
+        <w:rFonts w:ascii="Calibri" w:hAnsi="Calibri"/>
+        <w:b/>
+        <w:color w:val="003366"/>
+        <w:sz w:val="18"/>
+      </w:rPr>
+      <w:t>TIMEWARE</w:t>
+    </w:r>
+    <w:r>
+      <w:rPr>
+        <w:rFonts w:ascii="Calibri" w:hAnsi="Calibri"/>
+        <w:color w:val="555555"/>
+        <w:sz w:val="18"/>
+      </w:rPr>
+      <w:t xml:space="preserve">   ·   MILHASFACIL01</w:t>
+    </w:r>
+    <w:r>
+      <w:tab/>
+    </w:r>
+    <w:r>
+      <w:rPr>
+        <w:rFonts w:ascii="Calibri" w:hAnsi="Calibri"/>
+        <w:color w:val="555555"/>
+        <w:sz w:val="18"/>
+      </w:rPr>
+      <w:t>Evidência de Projeto</w:t>
+    </w:r>
+  </w:p>
+</w:hdr>
+</file>
+
+<file path=word/header2.xml><?xml version="1.0" encoding="utf-8"?>
+<w:hdr xmlns:m="http://schemas.openxmlformats.org/officeDocument/2006/math" xmlns:mc="http://schemas.openxmlformats.org/markup-compatibility/2006" xmlns:mo="http://schemas.microsoft.com/office/mac/office/2008/main" xmlns:mv="urn:schemas-microsoft-com:mac:vml" xmlns:o="urn:schemas-microsoft-com:office:office" xmlns:r="http://schemas.openxmlformats.org/officeDocument/2006/relationships" xmlns:v="urn:schemas-microsoft-com:vml" xmlns:w10="urn:schemas-microsoft-com:office:word" xmlns:w14="http://schemas.microsoft.com/office/word/2010/wordml" xmlns:w="http://schemas.openxmlformats.org/wordprocessingml/2006/main" xmlns:wne="http://schemas.microsoft.com/office/word/2006/wordml" xmlns:wp14="http://schemas.microsoft.com/office/word/2010/wordprocessingDrawing" xmlns:wp="http://schemas.openxmlformats.org/drawingml/2006/wordprocessingDrawing" xmlns:wpc="http://schemas.microsoft.com/office/word/2010/wordprocessingCanvas" xmlns:wpg="http://schemas.microsoft.com/office/word/2010/wordprocessingGroup" xmlns:wpi="http://schemas.microsoft.com/office/word/2010/wordprocessingInk" xmlns:wps="http://schemas.microsoft.com/office/word/2010/wordprocessingShape" mc:Ignorable="w14 wp14">
+  <w:p>
+    <w:pPr>
+      <w:pStyle w:val="Header"/>
+    </w:pPr>
+  </w:p>
+</w:hdr>
 </file>
 
 <file path=word/numbering.xml><?xml version="1.0" encoding="utf-8"?>
@@ -2653,9 +4198,12 @@
     <w:name w:val="Normal"/>
     <w:qFormat/>
     <w:rsid w:val="00FC693F"/>
+    <w:pPr>
+      <w:spacing w:after="120" w:lineRule="auto" w:line="276"/>
+    </w:pPr>
     <w:rPr>
       <w:rFonts w:ascii="Calibri" w:hAnsi="Calibri"/>
-      <w:sz w:val="21"/>
+      <w:sz w:val="22"/>
     </w:rPr>
   </w:style>
   <w:style w:type="paragraph" w:styleId="Header">
@@ -2713,15 +4261,15 @@
     <w:pPr>
       <w:keepNext/>
       <w:keepLines/>
-      <w:spacing w:before="480" w:after="0"/>
+      <w:spacing w:before="360" w:after="120"/>
       <w:outlineLvl w:val="0"/>
     </w:pPr>
     <w:rPr>
-      <w:rFonts w:asciiTheme="majorHAnsi" w:eastAsiaTheme="majorEastAsia" w:hAnsiTheme="majorHAnsi" w:cstheme="majorBidi"/>
+      <w:rFonts w:asciiTheme="majorHAnsi" w:eastAsiaTheme="majorEastAsia" w:hAnsiTheme="majorHAnsi" w:cstheme="majorBidi" w:ascii="Calibri" w:hAnsi="Calibri"/>
       <w:b/>
       <w:bCs/>
-      <w:color w:val="365F91" w:themeColor="accent1" w:themeShade="BF"/>
-      <w:sz w:val="28"/>
+      <w:color w:val="003366"/>
+      <w:sz w:val="26"/>
       <w:szCs w:val="28"/>
     </w:rPr>
   </w:style>
@@ -2737,15 +4285,15 @@
     <w:pPr>
       <w:keepNext/>
       <w:keepLines/>
-      <w:spacing w:before="200" w:after="0"/>
+      <w:spacing w:before="240" w:after="80"/>
       <w:outlineLvl w:val="1"/>
     </w:pPr>
     <w:rPr>
-      <w:rFonts w:asciiTheme="majorHAnsi" w:eastAsiaTheme="majorEastAsia" w:hAnsiTheme="majorHAnsi" w:cstheme="majorBidi"/>
+      <w:rFonts w:asciiTheme="majorHAnsi" w:eastAsiaTheme="majorEastAsia" w:hAnsiTheme="majorHAnsi" w:cstheme="majorBidi" w:ascii="Calibri" w:hAnsi="Calibri"/>
       <w:b/>
       <w:bCs/>
-      <w:color w:val="4F81BD" w:themeColor="accent1"/>
-      <w:sz w:val="26"/>
+      <w:color w:val="1A5276"/>
+      <w:sz w:val="22"/>
       <w:szCs w:val="26"/>
     </w:rPr>
   </w:style>
@@ -2761,14 +4309,16 @@
     <w:pPr>
       <w:keepNext/>
       <w:keepLines/>
-      <w:spacing w:before="200" w:after="0"/>
+      <w:spacing w:before="160" w:after="40"/>
       <w:outlineLvl w:val="2"/>
     </w:pPr>
     <w:rPr>
-      <w:rFonts w:asciiTheme="majorHAnsi" w:eastAsiaTheme="majorEastAsia" w:hAnsiTheme="majorHAnsi" w:cstheme="majorBidi"/>
+      <w:rFonts w:asciiTheme="majorHAnsi" w:eastAsiaTheme="majorEastAsia" w:hAnsiTheme="majorHAnsi" w:cstheme="majorBidi" w:ascii="Calibri" w:hAnsi="Calibri"/>
       <w:b/>
       <w:bCs/>
-      <w:color w:val="4F81BD" w:themeColor="accent1"/>
+      <w:i/>
+      <w:color w:val="1A5276"/>
+      <w:sz w:val="22"/>
     </w:rPr>
   </w:style>
   <w:style w:type="paragraph" w:styleId="Heading4">

</xml_diff>

<commit_message>
docs(MilhasFacil): reconcilia registros ao estado real do GitLab
- Regenera 21 .docx a partir dos .md reconciliados (backup em bak_20260626/)
- ATA-001 (Kickoff): Azure DevOps/PowerShell@2 -> GitLab/Docker runner (v1.2)
- 0 referencias legadas reais (Azure/Mateus Veloso/PowerShell@2/PR#) em md/docx
- Adiciona ALINHAMENTO verificado: build api develop/homolog corrigido (MR !20/!21), 39 MRs com 2 revisores, 9 pipelines verdes

Co-Authored-By: Claude Opus 4.8 <noreply@anthropic.com>
</commit_message>
<xml_diff>
--- a/mps-nivel-c/oficial/04_registros/MilhasFacil_Busca-de-Milhas/ATA-MILHASFACIL01-002_Aprovacao-de-Arquitetura.docx
+++ b/mps-nivel-c/oficial/04_registros/MilhasFacil_Busca-de-Milhas/ATA-MILHASFACIL01-002_Aprovacao-de-Arquitetura.docx
@@ -4,89 +4,31 @@
   <w:body>
     <w:p>
       <w:pPr>
-        <w:pBdr>
-          <w:top w:val="single" w:sz="32" w:space="0" w:color="003366"/>
-        </w:pBdr>
-        <w:spacing w:before="0" w:after="0"/>
-      </w:pPr>
-    </w:p>
-    <w:p>
-      <w:pPr>
-        <w:spacing w:before="240" w:after="40"/>
+        <w:pStyle w:val="Heading1"/>
       </w:pPr>
       <w:r>
-        <w:rPr>
-          <w:rFonts w:ascii="Calibri" w:hAnsi="Calibri"/>
-          <w:b/>
-          <w:color w:val="003366"/>
-          <w:sz w:val="36"/>
-        </w:rPr>
-        <w:t>ATA DE REUNIÃO — DESIGN REVIEW / APROVAÇÃO DA ARQUITETURA · MILHASFACIL</w:t>
+        <w:t>Ata de Reunião — Design Review / Aprovação da Arquitetura · MilhasFacil</w:t>
       </w:r>
-    </w:p>
-    <w:p>
-      <w:pPr>
-        <w:spacing w:before="0" w:after="40"/>
-      </w:pPr>
-      <w:r>
-        <w:rPr>
-          <w:rFonts w:ascii="Calibri" w:hAnsi="Calibri"/>
-          <w:color w:val="555555"/>
-          <w:sz w:val="20"/>
-        </w:rPr>
-        <w:t>MILHASFACIL01   ·   Versão 1.1   ·   11/02/2026   ·   Timeware Brasil</w:t>
-      </w:r>
-    </w:p>
-    <w:p>
-      <w:pPr>
-        <w:pBdr>
-          <w:bottom w:val="single" w:sz="6" w:space="1" w:color="003366"/>
-        </w:pBdr>
-        <w:spacing w:before="120" w:after="280"/>
-      </w:pPr>
     </w:p>
     <w:tbl>
       <w:tblPr>
+        <w:tblStyle w:val="TableGrid"/>
         <w:tblW w:type="auto" w:w="0"/>
         <w:tblLook w:firstColumn="1" w:firstRow="1" w:lastColumn="0" w:lastRow="0" w:noHBand="0" w:noVBand="1" w:val="04A0"/>
-        <w:tblBorders>
-          <w:top w:val="single" w:sz="4" w:space="0" w:color="AAAAAA"/>
-          <w:left w:val="single" w:sz="4" w:space="0" w:color="AAAAAA"/>
-          <w:bottom w:val="single" w:sz="4" w:space="0" w:color="AAAAAA"/>
-          <w:right w:val="single" w:sz="4" w:space="0" w:color="AAAAAA"/>
-          <w:insideH w:val="single" w:sz="4" w:space="0" w:color="AAAAAA"/>
-          <w:insideV w:val="single" w:sz="4" w:space="0" w:color="AAAAAA"/>
-        </w:tblBorders>
       </w:tblPr>
       <w:tblGrid>
-        <w:gridCol w:w="4451"/>
-        <w:gridCol w:w="4451"/>
+        <w:gridCol w:w="4320"/>
+        <w:gridCol w:w="4320"/>
       </w:tblGrid>
       <w:tr>
-        <w:trPr>
-          <w:cantSplit w:val="1"/>
-        </w:trPr>
         <w:tc>
           <w:tcPr>
-            <w:tcW w:type="dxa" w:w="4451"/>
-            <w:tcMar>
-              <w:top w:w="60" w:type="dxa"/>
-              <w:bottom w:w="60" w:type="dxa"/>
-              <w:left w:w="100" w:type="dxa"/>
-              <w:right w:w="100" w:type="dxa"/>
-            </w:tcMar>
-            <w:shd w:val="clear" w:color="auto" w:fill="D6E4F0"/>
+            <w:tcW w:type="dxa" w:w="4320"/>
           </w:tcPr>
           <w:p>
-            <w:pPr>
-              <w:spacing w:before="40" w:after="40"/>
-            </w:pPr>
             <w:r>
               <w:rPr>
-                <w:rFonts w:ascii="Calibri" w:hAnsi="Calibri"/>
                 <w:b/>
-                <w:i w:val="0"/>
-                <w:sz w:val="20"/>
               </w:rPr>
               <w:t>Campo</w:t>
             </w:r>
@@ -94,25 +36,12 @@
         </w:tc>
         <w:tc>
           <w:tcPr>
-            <w:tcW w:type="dxa" w:w="4451"/>
-            <w:tcMar>
-              <w:top w:w="60" w:type="dxa"/>
-              <w:bottom w:w="60" w:type="dxa"/>
-              <w:left w:w="100" w:type="dxa"/>
-              <w:right w:w="100" w:type="dxa"/>
-            </w:tcMar>
-            <w:shd w:val="clear" w:color="auto" w:fill="D6E4F0"/>
+            <w:tcW w:type="dxa" w:w="4320"/>
           </w:tcPr>
           <w:p>
-            <w:pPr>
-              <w:spacing w:before="40" w:after="40"/>
-            </w:pPr>
             <w:r>
               <w:rPr>
-                <w:rFonts w:ascii="Calibri" w:hAnsi="Calibri"/>
                 <w:b/>
-                <w:i w:val="0"/>
-                <w:sz w:val="20"/>
               </w:rPr>
               <w:t>Valor</w:t>
             </w:r>
@@ -120,30 +49,14 @@
         </w:tc>
       </w:tr>
       <w:tr>
-        <w:trPr>
-          <w:cantSplit w:val="1"/>
-        </w:trPr>
         <w:tc>
           <w:tcPr>
-            <w:tcW w:type="dxa" w:w="4451"/>
-            <w:tcMar>
-              <w:top w:w="60" w:type="dxa"/>
-              <w:bottom w:w="60" w:type="dxa"/>
-              <w:left w:w="100" w:type="dxa"/>
-              <w:right w:w="100" w:type="dxa"/>
-            </w:tcMar>
-            <w:shd w:val="clear" w:color="auto" w:fill="F0F4F8"/>
+            <w:tcW w:type="dxa" w:w="4320"/>
           </w:tcPr>
           <w:p>
-            <w:pPr>
-              <w:spacing w:before="40" w:after="40"/>
-            </w:pPr>
             <w:r>
               <w:rPr>
-                <w:rFonts w:ascii="Calibri" w:hAnsi="Calibri"/>
                 <w:b/>
-                <w:i w:val="0"/>
-                <w:sz w:val="20"/>
               </w:rPr>
               <w:t>Documento</w:t>
             </w:r>
@@ -151,55 +64,24 @@
         </w:tc>
         <w:tc>
           <w:tcPr>
-            <w:tcW w:type="dxa" w:w="4451"/>
-            <w:tcMar>
-              <w:top w:w="60" w:type="dxa"/>
-              <w:bottom w:w="60" w:type="dxa"/>
-              <w:left w:w="100" w:type="dxa"/>
-              <w:right w:w="100" w:type="dxa"/>
-            </w:tcMar>
+            <w:tcW w:type="dxa" w:w="4320"/>
           </w:tcPr>
           <w:p>
-            <w:pPr>
-              <w:spacing w:before="40" w:after="40"/>
-            </w:pPr>
             <w:r>
-              <w:rPr>
-                <w:rFonts w:ascii="Calibri" w:hAnsi="Calibri"/>
-                <w:b w:val="0"/>
-                <w:i w:val="0"/>
-                <w:sz w:val="20"/>
-              </w:rPr>
               <w:t>ATA-MILHASFACIL01-002</w:t>
             </w:r>
           </w:p>
         </w:tc>
       </w:tr>
       <w:tr>
-        <w:trPr>
-          <w:cantSplit w:val="1"/>
-        </w:trPr>
         <w:tc>
           <w:tcPr>
-            <w:tcW w:type="dxa" w:w="4451"/>
-            <w:tcMar>
-              <w:top w:w="60" w:type="dxa"/>
-              <w:bottom w:w="60" w:type="dxa"/>
-              <w:left w:w="100" w:type="dxa"/>
-              <w:right w:w="100" w:type="dxa"/>
-            </w:tcMar>
-            <w:shd w:val="clear" w:color="auto" w:fill="F0F4F8"/>
+            <w:tcW w:type="dxa" w:w="4320"/>
           </w:tcPr>
           <w:p>
-            <w:pPr>
-              <w:spacing w:before="40" w:after="40"/>
-            </w:pPr>
             <w:r>
               <w:rPr>
-                <w:rFonts w:ascii="Calibri" w:hAnsi="Calibri"/>
                 <w:b/>
-                <w:i w:val="0"/>
-                <w:sz w:val="20"/>
               </w:rPr>
               <w:t>Projeto</w:t>
             </w:r>
@@ -207,55 +89,24 @@
         </w:tc>
         <w:tc>
           <w:tcPr>
-            <w:tcW w:type="dxa" w:w="4451"/>
-            <w:tcMar>
-              <w:top w:w="60" w:type="dxa"/>
-              <w:bottom w:w="60" w:type="dxa"/>
-              <w:left w:w="100" w:type="dxa"/>
-              <w:right w:w="100" w:type="dxa"/>
-            </w:tcMar>
+            <w:tcW w:type="dxa" w:w="4320"/>
           </w:tcPr>
           <w:p>
-            <w:pPr>
-              <w:spacing w:before="40" w:after="40"/>
-            </w:pPr>
             <w:r>
-              <w:rPr>
-                <w:rFonts w:ascii="Calibri" w:hAnsi="Calibri"/>
-                <w:b w:val="0"/>
-                <w:i w:val="0"/>
-                <w:sz w:val="20"/>
-              </w:rPr>
               <w:t>MilhasFacil — Plataforma de Busca e Alerta de Passagens por Milhas</w:t>
             </w:r>
           </w:p>
         </w:tc>
       </w:tr>
       <w:tr>
-        <w:trPr>
-          <w:cantSplit w:val="1"/>
-        </w:trPr>
         <w:tc>
           <w:tcPr>
-            <w:tcW w:type="dxa" w:w="4451"/>
-            <w:tcMar>
-              <w:top w:w="60" w:type="dxa"/>
-              <w:bottom w:w="60" w:type="dxa"/>
-              <w:left w:w="100" w:type="dxa"/>
-              <w:right w:w="100" w:type="dxa"/>
-            </w:tcMar>
-            <w:shd w:val="clear" w:color="auto" w:fill="F0F4F8"/>
+            <w:tcW w:type="dxa" w:w="4320"/>
           </w:tcPr>
           <w:p>
-            <w:pPr>
-              <w:spacing w:before="40" w:after="40"/>
-            </w:pPr>
             <w:r>
               <w:rPr>
-                <w:rFonts w:ascii="Calibri" w:hAnsi="Calibri"/>
                 <w:b/>
-                <w:i w:val="0"/>
-                <w:sz w:val="20"/>
               </w:rPr>
               <w:t>Código do projeto</w:t>
             </w:r>
@@ -263,55 +114,24 @@
         </w:tc>
         <w:tc>
           <w:tcPr>
-            <w:tcW w:type="dxa" w:w="4451"/>
-            <w:tcMar>
-              <w:top w:w="60" w:type="dxa"/>
-              <w:bottom w:w="60" w:type="dxa"/>
-              <w:left w:w="100" w:type="dxa"/>
-              <w:right w:w="100" w:type="dxa"/>
-            </w:tcMar>
+            <w:tcW w:type="dxa" w:w="4320"/>
           </w:tcPr>
           <w:p>
-            <w:pPr>
-              <w:spacing w:before="40" w:after="40"/>
-            </w:pPr>
             <w:r>
-              <w:rPr>
-                <w:rFonts w:ascii="Calibri" w:hAnsi="Calibri"/>
-                <w:b w:val="0"/>
-                <w:i w:val="0"/>
-                <w:sz w:val="20"/>
-              </w:rPr>
               <w:t>MILHASFACIL01</w:t>
             </w:r>
           </w:p>
         </w:tc>
       </w:tr>
       <w:tr>
-        <w:trPr>
-          <w:cantSplit w:val="1"/>
-        </w:trPr>
         <w:tc>
           <w:tcPr>
-            <w:tcW w:type="dxa" w:w="4451"/>
-            <w:tcMar>
-              <w:top w:w="60" w:type="dxa"/>
-              <w:bottom w:w="60" w:type="dxa"/>
-              <w:left w:w="100" w:type="dxa"/>
-              <w:right w:w="100" w:type="dxa"/>
-            </w:tcMar>
-            <w:shd w:val="clear" w:color="auto" w:fill="F0F4F8"/>
+            <w:tcW w:type="dxa" w:w="4320"/>
           </w:tcPr>
           <w:p>
-            <w:pPr>
-              <w:spacing w:before="40" w:after="40"/>
-            </w:pPr>
             <w:r>
               <w:rPr>
-                <w:rFonts w:ascii="Calibri" w:hAnsi="Calibri"/>
                 <w:b/>
-                <w:i w:val="0"/>
-                <w:sz w:val="20"/>
               </w:rPr>
               <w:t>Cliente</w:t>
             </w:r>
@@ -319,55 +139,24 @@
         </w:tc>
         <w:tc>
           <w:tcPr>
-            <w:tcW w:type="dxa" w:w="4451"/>
-            <w:tcMar>
-              <w:top w:w="60" w:type="dxa"/>
-              <w:bottom w:w="60" w:type="dxa"/>
-              <w:left w:w="100" w:type="dxa"/>
-              <w:right w:w="100" w:type="dxa"/>
-            </w:tcMar>
+            <w:tcW w:type="dxa" w:w="4320"/>
           </w:tcPr>
           <w:p>
-            <w:pPr>
-              <w:spacing w:before="40" w:after="40"/>
-            </w:pPr>
             <w:r>
-              <w:rPr>
-                <w:rFonts w:ascii="Calibri" w:hAnsi="Calibri"/>
-                <w:b w:val="0"/>
-                <w:i w:val="0"/>
-                <w:sz w:val="20"/>
-              </w:rPr>
               <w:t>Hub de Milhas</w:t>
             </w:r>
           </w:p>
         </w:tc>
       </w:tr>
       <w:tr>
-        <w:trPr>
-          <w:cantSplit w:val="1"/>
-        </w:trPr>
         <w:tc>
           <w:tcPr>
-            <w:tcW w:type="dxa" w:w="4451"/>
-            <w:tcMar>
-              <w:top w:w="60" w:type="dxa"/>
-              <w:bottom w:w="60" w:type="dxa"/>
-              <w:left w:w="100" w:type="dxa"/>
-              <w:right w:w="100" w:type="dxa"/>
-            </w:tcMar>
-            <w:shd w:val="clear" w:color="auto" w:fill="F0F4F8"/>
+            <w:tcW w:type="dxa" w:w="4320"/>
           </w:tcPr>
           <w:p>
-            <w:pPr>
-              <w:spacing w:before="40" w:after="40"/>
-            </w:pPr>
             <w:r>
               <w:rPr>
-                <w:rFonts w:ascii="Calibri" w:hAnsi="Calibri"/>
                 <w:b/>
-                <w:i w:val="0"/>
-                <w:sz w:val="20"/>
               </w:rPr>
               <w:t>Organização</w:t>
             </w:r>
@@ -375,55 +164,24 @@
         </w:tc>
         <w:tc>
           <w:tcPr>
-            <w:tcW w:type="dxa" w:w="4451"/>
-            <w:tcMar>
-              <w:top w:w="60" w:type="dxa"/>
-              <w:bottom w:w="60" w:type="dxa"/>
-              <w:left w:w="100" w:type="dxa"/>
-              <w:right w:w="100" w:type="dxa"/>
-            </w:tcMar>
+            <w:tcW w:type="dxa" w:w="4320"/>
           </w:tcPr>
           <w:p>
-            <w:pPr>
-              <w:spacing w:before="40" w:after="40"/>
-            </w:pPr>
             <w:r>
-              <w:rPr>
-                <w:rFonts w:ascii="Calibri" w:hAnsi="Calibri"/>
-                <w:b w:val="0"/>
-                <w:i w:val="0"/>
-                <w:sz w:val="20"/>
-              </w:rPr>
               <w:t>Timeware Brasil Softwares e Serviços LTDA</w:t>
             </w:r>
           </w:p>
         </w:tc>
       </w:tr>
       <w:tr>
-        <w:trPr>
-          <w:cantSplit w:val="1"/>
-        </w:trPr>
         <w:tc>
           <w:tcPr>
-            <w:tcW w:type="dxa" w:w="4451"/>
-            <w:tcMar>
-              <w:top w:w="60" w:type="dxa"/>
-              <w:bottom w:w="60" w:type="dxa"/>
-              <w:left w:w="100" w:type="dxa"/>
-              <w:right w:w="100" w:type="dxa"/>
-            </w:tcMar>
-            <w:shd w:val="clear" w:color="auto" w:fill="F0F4F8"/>
+            <w:tcW w:type="dxa" w:w="4320"/>
           </w:tcPr>
           <w:p>
-            <w:pPr>
-              <w:spacing w:before="40" w:after="40"/>
-            </w:pPr>
             <w:r>
               <w:rPr>
-                <w:rFonts w:ascii="Calibri" w:hAnsi="Calibri"/>
                 <w:b/>
-                <w:i w:val="0"/>
-                <w:sz w:val="20"/>
               </w:rPr>
               <w:t>Reunião</w:t>
             </w:r>
@@ -431,55 +189,24 @@
         </w:tc>
         <w:tc>
           <w:tcPr>
-            <w:tcW w:type="dxa" w:w="4451"/>
-            <w:tcMar>
-              <w:top w:w="60" w:type="dxa"/>
-              <w:bottom w:w="60" w:type="dxa"/>
-              <w:left w:w="100" w:type="dxa"/>
-              <w:right w:w="100" w:type="dxa"/>
-            </w:tcMar>
+            <w:tcW w:type="dxa" w:w="4320"/>
           </w:tcPr>
           <w:p>
-            <w:pPr>
-              <w:spacing w:before="40" w:after="40"/>
-            </w:pPr>
             <w:r>
-              <w:rPr>
-                <w:rFonts w:ascii="Calibri" w:hAnsi="Calibri"/>
-                <w:b w:val="0"/>
-                <w:i w:val="0"/>
-                <w:sz w:val="20"/>
-              </w:rPr>
               <w:t>Design Review — Aprovação da Arquitetura técnica da solução</w:t>
             </w:r>
           </w:p>
         </w:tc>
       </w:tr>
       <w:tr>
-        <w:trPr>
-          <w:cantSplit w:val="1"/>
-        </w:trPr>
         <w:tc>
           <w:tcPr>
-            <w:tcW w:type="dxa" w:w="4451"/>
-            <w:tcMar>
-              <w:top w:w="60" w:type="dxa"/>
-              <w:bottom w:w="60" w:type="dxa"/>
-              <w:left w:w="100" w:type="dxa"/>
-              <w:right w:w="100" w:type="dxa"/>
-            </w:tcMar>
-            <w:shd w:val="clear" w:color="auto" w:fill="F0F4F8"/>
+            <w:tcW w:type="dxa" w:w="4320"/>
           </w:tcPr>
           <w:p>
-            <w:pPr>
-              <w:spacing w:before="40" w:after="40"/>
-            </w:pPr>
             <w:r>
               <w:rPr>
-                <w:rFonts w:ascii="Calibri" w:hAnsi="Calibri"/>
                 <w:b/>
-                <w:i w:val="0"/>
-                <w:sz w:val="20"/>
               </w:rPr>
               <w:t>Data</w:t>
             </w:r>
@@ -487,55 +214,24 @@
         </w:tc>
         <w:tc>
           <w:tcPr>
-            <w:tcW w:type="dxa" w:w="4451"/>
-            <w:tcMar>
-              <w:top w:w="60" w:type="dxa"/>
-              <w:bottom w:w="60" w:type="dxa"/>
-              <w:left w:w="100" w:type="dxa"/>
-              <w:right w:w="100" w:type="dxa"/>
-            </w:tcMar>
+            <w:tcW w:type="dxa" w:w="4320"/>
           </w:tcPr>
           <w:p>
-            <w:pPr>
-              <w:spacing w:before="40" w:after="40"/>
-            </w:pPr>
             <w:r>
-              <w:rPr>
-                <w:rFonts w:ascii="Calibri" w:hAnsi="Calibri"/>
-                <w:b w:val="0"/>
-                <w:i w:val="0"/>
-                <w:sz w:val="20"/>
-              </w:rPr>
               <w:t>11/02/2026</w:t>
             </w:r>
           </w:p>
         </w:tc>
       </w:tr>
       <w:tr>
-        <w:trPr>
-          <w:cantSplit w:val="1"/>
-        </w:trPr>
         <w:tc>
           <w:tcPr>
-            <w:tcW w:type="dxa" w:w="4451"/>
-            <w:tcMar>
-              <w:top w:w="60" w:type="dxa"/>
-              <w:bottom w:w="60" w:type="dxa"/>
-              <w:left w:w="100" w:type="dxa"/>
-              <w:right w:w="100" w:type="dxa"/>
-            </w:tcMar>
-            <w:shd w:val="clear" w:color="auto" w:fill="F0F4F8"/>
+            <w:tcW w:type="dxa" w:w="4320"/>
           </w:tcPr>
           <w:p>
-            <w:pPr>
-              <w:spacing w:before="40" w:after="40"/>
-            </w:pPr>
             <w:r>
               <w:rPr>
-                <w:rFonts w:ascii="Calibri" w:hAnsi="Calibri"/>
                 <w:b/>
-                <w:i w:val="0"/>
-                <w:sz w:val="20"/>
               </w:rPr>
               <w:t>Horário</w:t>
             </w:r>
@@ -543,55 +239,24 @@
         </w:tc>
         <w:tc>
           <w:tcPr>
-            <w:tcW w:type="dxa" w:w="4451"/>
-            <w:tcMar>
-              <w:top w:w="60" w:type="dxa"/>
-              <w:bottom w:w="60" w:type="dxa"/>
-              <w:left w:w="100" w:type="dxa"/>
-              <w:right w:w="100" w:type="dxa"/>
-            </w:tcMar>
+            <w:tcW w:type="dxa" w:w="4320"/>
           </w:tcPr>
           <w:p>
-            <w:pPr>
-              <w:spacing w:before="40" w:after="40"/>
-            </w:pPr>
             <w:r>
-              <w:rPr>
-                <w:rFonts w:ascii="Calibri" w:hAnsi="Calibri"/>
-                <w:b w:val="0"/>
-                <w:i w:val="0"/>
-                <w:sz w:val="20"/>
-              </w:rPr>
               <w:t>14h00 – 15h30</w:t>
             </w:r>
           </w:p>
         </w:tc>
       </w:tr>
       <w:tr>
-        <w:trPr>
-          <w:cantSplit w:val="1"/>
-        </w:trPr>
         <w:tc>
           <w:tcPr>
-            <w:tcW w:type="dxa" w:w="4451"/>
-            <w:tcMar>
-              <w:top w:w="60" w:type="dxa"/>
-              <w:bottom w:w="60" w:type="dxa"/>
-              <w:left w:w="100" w:type="dxa"/>
-              <w:right w:w="100" w:type="dxa"/>
-            </w:tcMar>
-            <w:shd w:val="clear" w:color="auto" w:fill="F0F4F8"/>
+            <w:tcW w:type="dxa" w:w="4320"/>
           </w:tcPr>
           <w:p>
-            <w:pPr>
-              <w:spacing w:before="40" w:after="40"/>
-            </w:pPr>
             <w:r>
               <w:rPr>
-                <w:rFonts w:ascii="Calibri" w:hAnsi="Calibri"/>
                 <w:b/>
-                <w:i w:val="0"/>
-                <w:sz w:val="20"/>
               </w:rPr>
               <w:t>Canal</w:t>
             </w:r>
@@ -599,55 +264,24 @@
         </w:tc>
         <w:tc>
           <w:tcPr>
-            <w:tcW w:type="dxa" w:w="4451"/>
-            <w:tcMar>
-              <w:top w:w="60" w:type="dxa"/>
-              <w:bottom w:w="60" w:type="dxa"/>
-              <w:left w:w="100" w:type="dxa"/>
-              <w:right w:w="100" w:type="dxa"/>
-            </w:tcMar>
+            <w:tcW w:type="dxa" w:w="4320"/>
           </w:tcPr>
           <w:p>
-            <w:pPr>
-              <w:spacing w:before="40" w:after="40"/>
-            </w:pPr>
             <w:r>
-              <w:rPr>
-                <w:rFonts w:ascii="Calibri" w:hAnsi="Calibri"/>
-                <w:b w:val="0"/>
-                <w:i w:val="0"/>
-                <w:sz w:val="20"/>
-              </w:rPr>
               <w:t>Microsoft Teams</w:t>
             </w:r>
           </w:p>
         </w:tc>
       </w:tr>
       <w:tr>
-        <w:trPr>
-          <w:cantSplit w:val="1"/>
-        </w:trPr>
         <w:tc>
           <w:tcPr>
-            <w:tcW w:type="dxa" w:w="4451"/>
-            <w:tcMar>
-              <w:top w:w="60" w:type="dxa"/>
-              <w:bottom w:w="60" w:type="dxa"/>
-              <w:left w:w="100" w:type="dxa"/>
-              <w:right w:w="100" w:type="dxa"/>
-            </w:tcMar>
-            <w:shd w:val="clear" w:color="auto" w:fill="F0F4F8"/>
+            <w:tcW w:type="dxa" w:w="4320"/>
           </w:tcPr>
           <w:p>
-            <w:pPr>
-              <w:spacing w:before="40" w:after="40"/>
-            </w:pPr>
             <w:r>
               <w:rPr>
-                <w:rFonts w:ascii="Calibri" w:hAnsi="Calibri"/>
                 <w:b/>
-                <w:i w:val="0"/>
-                <w:sz w:val="20"/>
               </w:rPr>
               <w:t>Facilitador</w:t>
             </w:r>
@@ -655,55 +289,24 @@
         </w:tc>
         <w:tc>
           <w:tcPr>
-            <w:tcW w:type="dxa" w:w="4451"/>
-            <w:tcMar>
-              <w:top w:w="60" w:type="dxa"/>
-              <w:bottom w:w="60" w:type="dxa"/>
-              <w:left w:w="100" w:type="dxa"/>
-              <w:right w:w="100" w:type="dxa"/>
-            </w:tcMar>
+            <w:tcW w:type="dxa" w:w="4320"/>
           </w:tcPr>
           <w:p>
-            <w:pPr>
-              <w:spacing w:before="40" w:after="40"/>
-            </w:pPr>
             <w:r>
-              <w:rPr>
-                <w:rFonts w:ascii="Calibri" w:hAnsi="Calibri"/>
-                <w:b w:val="0"/>
-                <w:i w:val="0"/>
-                <w:sz w:val="20"/>
-              </w:rPr>
               <w:t>Cézar Velazquez (Tech Lead / Arquiteto)</w:t>
             </w:r>
           </w:p>
         </w:tc>
       </w:tr>
       <w:tr>
-        <w:trPr>
-          <w:cantSplit w:val="1"/>
-        </w:trPr>
         <w:tc>
           <w:tcPr>
-            <w:tcW w:type="dxa" w:w="4451"/>
-            <w:tcMar>
-              <w:top w:w="60" w:type="dxa"/>
-              <w:bottom w:w="60" w:type="dxa"/>
-              <w:left w:w="100" w:type="dxa"/>
-              <w:right w:w="100" w:type="dxa"/>
-            </w:tcMar>
-            <w:shd w:val="clear" w:color="auto" w:fill="F0F4F8"/>
+            <w:tcW w:type="dxa" w:w="4320"/>
           </w:tcPr>
           <w:p>
-            <w:pPr>
-              <w:spacing w:before="40" w:after="40"/>
-            </w:pPr>
             <w:r>
               <w:rPr>
-                <w:rFonts w:ascii="Calibri" w:hAnsi="Calibri"/>
                 <w:b/>
-                <w:i w:val="0"/>
-                <w:sz w:val="20"/>
               </w:rPr>
               <w:t>Versão</w:t>
             </w:r>
@@ -711,44 +314,20 @@
         </w:tc>
         <w:tc>
           <w:tcPr>
-            <w:tcW w:type="dxa" w:w="4451"/>
-            <w:tcMar>
-              <w:top w:w="60" w:type="dxa"/>
-              <w:bottom w:w="60" w:type="dxa"/>
-              <w:left w:w="100" w:type="dxa"/>
-              <w:right w:w="100" w:type="dxa"/>
-            </w:tcMar>
+            <w:tcW w:type="dxa" w:w="4320"/>
           </w:tcPr>
           <w:p>
-            <w:pPr>
-              <w:spacing w:before="40" w:after="40"/>
-            </w:pPr>
             <w:r>
-              <w:rPr>
-                <w:rFonts w:ascii="Calibri" w:hAnsi="Calibri"/>
-                <w:b w:val="0"/>
-                <w:i w:val="0"/>
-                <w:sz w:val="20"/>
-              </w:rPr>
               <w:t>1.1</w:t>
             </w:r>
           </w:p>
         </w:tc>
       </w:tr>
     </w:tbl>
+    <w:p/>
     <w:p>
       <w:pPr>
-        <w:spacing w:before="0" w:after="160"/>
-      </w:pPr>
-    </w:p>
-    <w:p>
-      <w:pPr>
-        <w:pStyle w:val="Heading1"/>
-        <w:keepNext/>
-        <w:keepLines/>
-        <w:pBdr>
-          <w:bottom w:val="single" w:sz="4" w:space="2" w:color="D6E4F0"/>
-        </w:pBdr>
+        <w:pStyle w:val="Heading2"/>
       </w:pPr>
       <w:r>
         <w:t>1. Participantes</w:t>
@@ -756,48 +335,24 @@
     </w:p>
     <w:tbl>
       <w:tblPr>
+        <w:tblStyle w:val="TableGrid"/>
         <w:tblW w:type="auto" w:w="0"/>
         <w:tblLook w:firstColumn="1" w:firstRow="1" w:lastColumn="0" w:lastRow="0" w:noHBand="0" w:noVBand="1" w:val="04A0"/>
-        <w:tblBorders>
-          <w:top w:val="single" w:sz="4" w:space="0" w:color="003366"/>
-          <w:left w:val="single" w:sz="4" w:space="0" w:color="003366"/>
-          <w:bottom w:val="single" w:sz="4" w:space="0" w:color="003366"/>
-          <w:right w:val="single" w:sz="4" w:space="0" w:color="003366"/>
-          <w:insideH w:val="single" w:sz="4" w:space="0" w:color="003366"/>
-          <w:insideV w:val="single" w:sz="4" w:space="0" w:color="003366"/>
-        </w:tblBorders>
       </w:tblPr>
       <w:tblGrid>
-        <w:gridCol w:w="2967"/>
-        <w:gridCol w:w="2967"/>
-        <w:gridCol w:w="2967"/>
+        <w:gridCol w:w="2880"/>
+        <w:gridCol w:w="2880"/>
+        <w:gridCol w:w="2880"/>
       </w:tblGrid>
       <w:tr>
-        <w:trPr>
-          <w:cantSplit w:val="1"/>
-        </w:trPr>
         <w:tc>
           <w:tcPr>
-            <w:tcW w:type="dxa" w:w="2967"/>
-            <w:tcMar>
-              <w:top w:w="60" w:type="dxa"/>
-              <w:bottom w:w="60" w:type="dxa"/>
-              <w:left w:w="100" w:type="dxa"/>
-              <w:right w:w="100" w:type="dxa"/>
-            </w:tcMar>
-            <w:shd w:val="clear" w:color="auto" w:fill="003366"/>
+            <w:tcW w:type="dxa" w:w="2880"/>
           </w:tcPr>
           <w:p>
-            <w:pPr>
-              <w:spacing w:before="40" w:after="40"/>
-            </w:pPr>
             <w:r>
               <w:rPr>
-                <w:rFonts w:ascii="Calibri" w:hAnsi="Calibri"/>
                 <w:b/>
-                <w:i w:val="0"/>
-                <w:color w:val="FFFFFF"/>
-                <w:sz w:val="20"/>
               </w:rPr>
               <w:t>Nome</w:t>
             </w:r>
@@ -805,26 +360,12 @@
         </w:tc>
         <w:tc>
           <w:tcPr>
-            <w:tcW w:type="dxa" w:w="2967"/>
-            <w:tcMar>
-              <w:top w:w="60" w:type="dxa"/>
-              <w:bottom w:w="60" w:type="dxa"/>
-              <w:left w:w="100" w:type="dxa"/>
-              <w:right w:w="100" w:type="dxa"/>
-            </w:tcMar>
-            <w:shd w:val="clear" w:color="auto" w:fill="003366"/>
+            <w:tcW w:type="dxa" w:w="2880"/>
           </w:tcPr>
           <w:p>
-            <w:pPr>
-              <w:spacing w:before="40" w:after="40"/>
-            </w:pPr>
             <w:r>
               <w:rPr>
-                <w:rFonts w:ascii="Calibri" w:hAnsi="Calibri"/>
                 <w:b/>
-                <w:i w:val="0"/>
-                <w:color w:val="FFFFFF"/>
-                <w:sz w:val="20"/>
               </w:rPr>
               <w:t>Papel</w:t>
             </w:r>
@@ -832,26 +373,12 @@
         </w:tc>
         <w:tc>
           <w:tcPr>
-            <w:tcW w:type="dxa" w:w="2967"/>
-            <w:tcMar>
-              <w:top w:w="60" w:type="dxa"/>
-              <w:bottom w:w="60" w:type="dxa"/>
-              <w:left w:w="100" w:type="dxa"/>
-              <w:right w:w="100" w:type="dxa"/>
-            </w:tcMar>
-            <w:shd w:val="clear" w:color="auto" w:fill="003366"/>
+            <w:tcW w:type="dxa" w:w="2880"/>
           </w:tcPr>
           <w:p>
-            <w:pPr>
-              <w:spacing w:before="40" w:after="40"/>
-            </w:pPr>
             <w:r>
               <w:rPr>
-                <w:rFonts w:ascii="Calibri" w:hAnsi="Calibri"/>
                 <w:b/>
-                <w:i w:val="0"/>
-                <w:color w:val="FFFFFF"/>
-                <w:sz w:val="20"/>
               </w:rPr>
               <w:t>Presença</w:t>
             </w:r>
@@ -859,550 +386,227 @@
         </w:tc>
       </w:tr>
       <w:tr>
-        <w:trPr>
-          <w:cantSplit w:val="1"/>
-        </w:trPr>
         <w:tc>
           <w:tcPr>
-            <w:tcW w:type="dxa" w:w="2967"/>
-            <w:tcMar>
-              <w:top w:w="60" w:type="dxa"/>
-              <w:bottom w:w="60" w:type="dxa"/>
-              <w:left w:w="100" w:type="dxa"/>
-              <w:right w:w="100" w:type="dxa"/>
-            </w:tcMar>
-            <w:shd w:val="clear" w:color="auto" w:fill="EBF5FB"/>
+            <w:tcW w:type="dxa" w:w="2880"/>
           </w:tcPr>
           <w:p>
-            <w:pPr>
-              <w:spacing w:before="40" w:after="40"/>
-            </w:pPr>
             <w:r>
-              <w:rPr>
-                <w:rFonts w:ascii="Calibri" w:hAnsi="Calibri"/>
-                <w:b w:val="0"/>
-                <w:i w:val="0"/>
-                <w:sz w:val="20"/>
-              </w:rPr>
               <w:t>Abraão</w:t>
             </w:r>
           </w:p>
         </w:tc>
         <w:tc>
           <w:tcPr>
-            <w:tcW w:type="dxa" w:w="2967"/>
-            <w:tcMar>
-              <w:top w:w="60" w:type="dxa"/>
-              <w:bottom w:w="60" w:type="dxa"/>
-              <w:left w:w="100" w:type="dxa"/>
-              <w:right w:w="100" w:type="dxa"/>
-            </w:tcMar>
-            <w:shd w:val="clear" w:color="auto" w:fill="EBF5FB"/>
+            <w:tcW w:type="dxa" w:w="2880"/>
           </w:tcPr>
           <w:p>
-            <w:pPr>
-              <w:spacing w:before="40" w:after="40"/>
-            </w:pPr>
             <w:r>
-              <w:rPr>
-                <w:rFonts w:ascii="Calibri" w:hAnsi="Calibri"/>
-                <w:b w:val="0"/>
-                <w:i w:val="0"/>
-                <w:sz w:val="20"/>
-              </w:rPr>
               <w:t>Gerente de Projeto / PO</w:t>
             </w:r>
           </w:p>
         </w:tc>
         <w:tc>
           <w:tcPr>
-            <w:tcW w:type="dxa" w:w="2967"/>
-            <w:tcMar>
-              <w:top w:w="60" w:type="dxa"/>
-              <w:bottom w:w="60" w:type="dxa"/>
-              <w:left w:w="100" w:type="dxa"/>
-              <w:right w:w="100" w:type="dxa"/>
-            </w:tcMar>
-            <w:shd w:val="clear" w:color="auto" w:fill="EBF5FB"/>
+            <w:tcW w:type="dxa" w:w="2880"/>
           </w:tcPr>
           <w:p>
-            <w:pPr>
-              <w:spacing w:before="40" w:after="40"/>
-            </w:pPr>
             <w:r>
-              <w:rPr>
-                <w:rFonts w:ascii="Calibri" w:hAnsi="Calibri"/>
-                <w:b w:val="0"/>
-                <w:i w:val="0"/>
-                <w:sz w:val="20"/>
-              </w:rPr>
               <w:t>Presente</w:t>
             </w:r>
           </w:p>
         </w:tc>
       </w:tr>
       <w:tr>
-        <w:trPr>
-          <w:cantSplit w:val="1"/>
-        </w:trPr>
         <w:tc>
           <w:tcPr>
-            <w:tcW w:type="dxa" w:w="2967"/>
-            <w:tcMar>
-              <w:top w:w="60" w:type="dxa"/>
-              <w:bottom w:w="60" w:type="dxa"/>
-              <w:left w:w="100" w:type="dxa"/>
-              <w:right w:w="100" w:type="dxa"/>
-            </w:tcMar>
+            <w:tcW w:type="dxa" w:w="2880"/>
           </w:tcPr>
           <w:p>
-            <w:pPr>
-              <w:spacing w:before="40" w:after="40"/>
-            </w:pPr>
             <w:r>
-              <w:rPr>
-                <w:rFonts w:ascii="Calibri" w:hAnsi="Calibri"/>
-                <w:b w:val="0"/>
-                <w:i w:val="0"/>
-                <w:sz w:val="20"/>
-              </w:rPr>
               <w:t>Cézar Velazquez</w:t>
             </w:r>
           </w:p>
         </w:tc>
         <w:tc>
           <w:tcPr>
-            <w:tcW w:type="dxa" w:w="2967"/>
-            <w:tcMar>
-              <w:top w:w="60" w:type="dxa"/>
-              <w:bottom w:w="60" w:type="dxa"/>
-              <w:left w:w="100" w:type="dxa"/>
-              <w:right w:w="100" w:type="dxa"/>
-            </w:tcMar>
+            <w:tcW w:type="dxa" w:w="2880"/>
           </w:tcPr>
           <w:p>
-            <w:pPr>
-              <w:spacing w:before="40" w:after="40"/>
-            </w:pPr>
             <w:r>
-              <w:rPr>
-                <w:rFonts w:ascii="Calibri" w:hAnsi="Calibri"/>
-                <w:b w:val="0"/>
-                <w:i w:val="0"/>
-                <w:sz w:val="20"/>
-              </w:rPr>
               <w:t>Tech Lead / Arquiteto / DevOps</w:t>
             </w:r>
           </w:p>
         </w:tc>
         <w:tc>
           <w:tcPr>
-            <w:tcW w:type="dxa" w:w="2967"/>
-            <w:tcMar>
-              <w:top w:w="60" w:type="dxa"/>
-              <w:bottom w:w="60" w:type="dxa"/>
-              <w:left w:w="100" w:type="dxa"/>
-              <w:right w:w="100" w:type="dxa"/>
-            </w:tcMar>
+            <w:tcW w:type="dxa" w:w="2880"/>
           </w:tcPr>
           <w:p>
-            <w:pPr>
-              <w:spacing w:before="40" w:after="40"/>
-            </w:pPr>
             <w:r>
-              <w:rPr>
-                <w:rFonts w:ascii="Calibri" w:hAnsi="Calibri"/>
-                <w:b w:val="0"/>
-                <w:i w:val="0"/>
-                <w:sz w:val="20"/>
-              </w:rPr>
               <w:t>Presente (facilitador)</w:t>
             </w:r>
           </w:p>
         </w:tc>
       </w:tr>
       <w:tr>
-        <w:trPr>
-          <w:cantSplit w:val="1"/>
-        </w:trPr>
         <w:tc>
           <w:tcPr>
-            <w:tcW w:type="dxa" w:w="2967"/>
-            <w:tcMar>
-              <w:top w:w="60" w:type="dxa"/>
-              <w:bottom w:w="60" w:type="dxa"/>
-              <w:left w:w="100" w:type="dxa"/>
-              <w:right w:w="100" w:type="dxa"/>
-            </w:tcMar>
-            <w:shd w:val="clear" w:color="auto" w:fill="EBF5FB"/>
+            <w:tcW w:type="dxa" w:w="2880"/>
           </w:tcPr>
           <w:p>
-            <w:pPr>
-              <w:spacing w:before="40" w:after="40"/>
-            </w:pPr>
             <w:r>
-              <w:rPr>
-                <w:rFonts w:ascii="Calibri" w:hAnsi="Calibri"/>
-                <w:b w:val="0"/>
-                <w:i w:val="0"/>
-                <w:sz w:val="20"/>
-              </w:rPr>
               <w:t>Felipe Santos</w:t>
             </w:r>
           </w:p>
         </w:tc>
         <w:tc>
           <w:tcPr>
-            <w:tcW w:type="dxa" w:w="2967"/>
-            <w:tcMar>
-              <w:top w:w="60" w:type="dxa"/>
-              <w:bottom w:w="60" w:type="dxa"/>
-              <w:left w:w="100" w:type="dxa"/>
-              <w:right w:w="100" w:type="dxa"/>
-            </w:tcMar>
-            <w:shd w:val="clear" w:color="auto" w:fill="EBF5FB"/>
+            <w:tcW w:type="dxa" w:w="2880"/>
           </w:tcPr>
           <w:p>
-            <w:pPr>
-              <w:spacing w:before="40" w:after="40"/>
-            </w:pPr>
             <w:r>
-              <w:rPr>
-                <w:rFonts w:ascii="Calibri" w:hAnsi="Calibri"/>
-                <w:b w:val="0"/>
-                <w:i w:val="0"/>
-                <w:sz w:val="20"/>
-              </w:rPr>
               <w:t>Dev (Backend / Crawlers)</w:t>
             </w:r>
           </w:p>
         </w:tc>
         <w:tc>
           <w:tcPr>
-            <w:tcW w:type="dxa" w:w="2967"/>
-            <w:tcMar>
-              <w:top w:w="60" w:type="dxa"/>
-              <w:bottom w:w="60" w:type="dxa"/>
-              <w:left w:w="100" w:type="dxa"/>
-              <w:right w:w="100" w:type="dxa"/>
-            </w:tcMar>
-            <w:shd w:val="clear" w:color="auto" w:fill="EBF5FB"/>
+            <w:tcW w:type="dxa" w:w="2880"/>
           </w:tcPr>
           <w:p>
-            <w:pPr>
-              <w:spacing w:before="40" w:after="40"/>
-            </w:pPr>
             <w:r>
-              <w:rPr>
-                <w:rFonts w:ascii="Calibri" w:hAnsi="Calibri"/>
-                <w:b w:val="0"/>
-                <w:i w:val="0"/>
-                <w:sz w:val="20"/>
-              </w:rPr>
               <w:t>Presente</w:t>
             </w:r>
           </w:p>
         </w:tc>
       </w:tr>
       <w:tr>
-        <w:trPr>
-          <w:cantSplit w:val="1"/>
-        </w:trPr>
         <w:tc>
           <w:tcPr>
-            <w:tcW w:type="dxa" w:w="2967"/>
-            <w:tcMar>
-              <w:top w:w="60" w:type="dxa"/>
-              <w:bottom w:w="60" w:type="dxa"/>
-              <w:left w:w="100" w:type="dxa"/>
-              <w:right w:w="100" w:type="dxa"/>
-            </w:tcMar>
+            <w:tcW w:type="dxa" w:w="2880"/>
           </w:tcPr>
           <w:p>
-            <w:pPr>
-              <w:spacing w:before="40" w:after="40"/>
-            </w:pPr>
             <w:r>
-              <w:rPr>
-                <w:rFonts w:ascii="Calibri" w:hAnsi="Calibri"/>
-                <w:b w:val="0"/>
-                <w:i w:val="0"/>
-                <w:sz w:val="20"/>
-              </w:rPr>
               <w:t>Lucas Batista</w:t>
             </w:r>
           </w:p>
         </w:tc>
         <w:tc>
           <w:tcPr>
-            <w:tcW w:type="dxa" w:w="2967"/>
-            <w:tcMar>
-              <w:top w:w="60" w:type="dxa"/>
-              <w:bottom w:w="60" w:type="dxa"/>
-              <w:left w:w="100" w:type="dxa"/>
-              <w:right w:w="100" w:type="dxa"/>
-            </w:tcMar>
+            <w:tcW w:type="dxa" w:w="2880"/>
           </w:tcPr>
           <w:p>
-            <w:pPr>
-              <w:spacing w:before="40" w:after="40"/>
-            </w:pPr>
             <w:r>
-              <w:rPr>
-                <w:rFonts w:ascii="Calibri" w:hAnsi="Calibri"/>
-                <w:b w:val="0"/>
-                <w:i w:val="0"/>
-                <w:sz w:val="20"/>
-              </w:rPr>
               <w:t>Dev (Full Stack)</w:t>
             </w:r>
           </w:p>
         </w:tc>
         <w:tc>
           <w:tcPr>
-            <w:tcW w:type="dxa" w:w="2967"/>
-            <w:tcMar>
-              <w:top w:w="60" w:type="dxa"/>
-              <w:bottom w:w="60" w:type="dxa"/>
-              <w:left w:w="100" w:type="dxa"/>
-              <w:right w:w="100" w:type="dxa"/>
-            </w:tcMar>
+            <w:tcW w:type="dxa" w:w="2880"/>
           </w:tcPr>
           <w:p>
-            <w:pPr>
-              <w:spacing w:before="40" w:after="40"/>
-            </w:pPr>
             <w:r>
-              <w:rPr>
-                <w:rFonts w:ascii="Calibri" w:hAnsi="Calibri"/>
-                <w:b w:val="0"/>
-                <w:i w:val="0"/>
-                <w:sz w:val="20"/>
-              </w:rPr>
               <w:t>Presente</w:t>
             </w:r>
           </w:p>
         </w:tc>
       </w:tr>
       <w:tr>
-        <w:trPr>
-          <w:cantSplit w:val="1"/>
-        </w:trPr>
         <w:tc>
           <w:tcPr>
-            <w:tcW w:type="dxa" w:w="2967"/>
-            <w:tcMar>
-              <w:top w:w="60" w:type="dxa"/>
-              <w:bottom w:w="60" w:type="dxa"/>
-              <w:left w:w="100" w:type="dxa"/>
-              <w:right w:w="100" w:type="dxa"/>
-            </w:tcMar>
-            <w:shd w:val="clear" w:color="auto" w:fill="EBF5FB"/>
+            <w:tcW w:type="dxa" w:w="2880"/>
           </w:tcPr>
           <w:p>
-            <w:pPr>
-              <w:spacing w:before="40" w:after="40"/>
-            </w:pPr>
             <w:r>
-              <w:rPr>
-                <w:rFonts w:ascii="Calibri" w:hAnsi="Calibri"/>
-                <w:b w:val="0"/>
-                <w:i w:val="0"/>
-                <w:sz w:val="20"/>
-              </w:rPr>
               <w:t>Henry Oliveira</w:t>
             </w:r>
           </w:p>
         </w:tc>
         <w:tc>
           <w:tcPr>
-            <w:tcW w:type="dxa" w:w="2967"/>
-            <w:tcMar>
-              <w:top w:w="60" w:type="dxa"/>
-              <w:bottom w:w="60" w:type="dxa"/>
-              <w:left w:w="100" w:type="dxa"/>
-              <w:right w:w="100" w:type="dxa"/>
-            </w:tcMar>
-            <w:shd w:val="clear" w:color="auto" w:fill="EBF5FB"/>
+            <w:tcW w:type="dxa" w:w="2880"/>
           </w:tcPr>
           <w:p>
-            <w:pPr>
-              <w:spacing w:before="40" w:after="40"/>
-            </w:pPr>
             <w:r>
-              <w:rPr>
-                <w:rFonts w:ascii="Calibri" w:hAnsi="Calibri"/>
-                <w:b w:val="0"/>
-                <w:i w:val="0"/>
-                <w:sz w:val="20"/>
-              </w:rPr>
               <w:t>Dev (Full Stack)</w:t>
             </w:r>
           </w:p>
         </w:tc>
         <w:tc>
           <w:tcPr>
-            <w:tcW w:type="dxa" w:w="2967"/>
-            <w:tcMar>
-              <w:top w:w="60" w:type="dxa"/>
-              <w:bottom w:w="60" w:type="dxa"/>
-              <w:left w:w="100" w:type="dxa"/>
-              <w:right w:w="100" w:type="dxa"/>
-            </w:tcMar>
-            <w:shd w:val="clear" w:color="auto" w:fill="EBF5FB"/>
+            <w:tcW w:type="dxa" w:w="2880"/>
           </w:tcPr>
           <w:p>
-            <w:pPr>
-              <w:spacing w:before="40" w:after="40"/>
-            </w:pPr>
             <w:r>
-              <w:rPr>
-                <w:rFonts w:ascii="Calibri" w:hAnsi="Calibri"/>
-                <w:b w:val="0"/>
-                <w:i w:val="0"/>
-                <w:sz w:val="20"/>
-              </w:rPr>
               <w:t>Presente</w:t>
             </w:r>
           </w:p>
         </w:tc>
       </w:tr>
     </w:tbl>
+    <w:p/>
     <w:p>
       <w:pPr>
-        <w:spacing w:before="0" w:after="160"/>
-      </w:pPr>
-    </w:p>
-    <w:p>
-      <w:pPr>
-        <w:spacing w:before="40" w:after="120"/>
-        <w:ind w:left="454"/>
-        <w:pBdr>
-          <w:left w:val="single" w:sz="12" w:space="8" w:color="003366"/>
-        </w:pBdr>
+        <w:pStyle w:val="IntenseQuote"/>
       </w:pPr>
       <w:r>
-        <w:rPr>
-          <w:rFonts w:ascii="Calibri" w:hAnsi="Calibri"/>
-          <w:b w:val="0"/>
-          <w:i w:val="0"/>
-          <w:color w:val="1A5276"/>
-          <w:sz w:val="22"/>
-        </w:rPr>
         <w:t xml:space="preserve">A aprovação da arquitetura é responsabilidade conjunta do </w:t>
       </w:r>
       <w:r>
         <w:rPr>
-          <w:rFonts w:ascii="Calibri" w:hAnsi="Calibri"/>
           <w:b/>
-          <w:i w:val="0"/>
-          <w:color w:val="1A5276"/>
-          <w:sz w:val="22"/>
         </w:rPr>
         <w:t>Gerente de Projeto / PO (Abraão)</w:t>
       </w:r>
       <w:r>
-        <w:rPr>
-          <w:rFonts w:ascii="Calibri" w:hAnsi="Calibri"/>
-          <w:b w:val="0"/>
-          <w:i w:val="0"/>
-          <w:color w:val="1A5276"/>
-          <w:sz w:val="22"/>
-        </w:rPr>
         <w:t xml:space="preserve"> e do </w:t>
       </w:r>
       <w:r>
         <w:rPr>
-          <w:rFonts w:ascii="Calibri" w:hAnsi="Calibri"/>
           <w:b/>
-          <w:i w:val="0"/>
-          <w:color w:val="1A5276"/>
-          <w:sz w:val="22"/>
         </w:rPr>
         <w:t>Tech Lead / Arquiteto (Cézar Velazquez)</w:t>
       </w:r>
       <w:r>
-        <w:rPr>
-          <w:rFonts w:ascii="Calibri" w:hAnsi="Calibri"/>
-          <w:b w:val="0"/>
-          <w:i w:val="0"/>
-          <w:color w:val="1A5276"/>
-          <w:sz w:val="22"/>
-        </w:rPr>
         <w:t>; os desenvolvedores participam como apoio técnico. A QA (Jonathan Alves) e a GQA independente (Carol/Caroline) não participam da decisão de arquitetura.</w:t>
       </w:r>
     </w:p>
     <w:p>
       <w:pPr>
-        <w:pStyle w:val="Heading1"/>
-        <w:keepNext/>
-        <w:keepLines/>
-        <w:pBdr>
-          <w:bottom w:val="single" w:sz="4" w:space="2" w:color="D6E4F0"/>
-        </w:pBdr>
+        <w:pStyle w:val="Heading2"/>
       </w:pPr>
       <w:r>
         <w:t>2. Objetivo</w:t>
       </w:r>
     </w:p>
     <w:p>
-      <w:pPr>
-        <w:spacing w:before="0" w:after="120"/>
-      </w:pPr>
       <w:r>
-        <w:rPr>
-          <w:rFonts w:ascii="Calibri" w:hAnsi="Calibri"/>
-          <w:b w:val="0"/>
-          <w:i w:val="0"/>
-          <w:sz w:val="22"/>
-        </w:rPr>
         <w:t xml:space="preserve">Revisar e </w:t>
       </w:r>
       <w:r>
         <w:rPr>
-          <w:rFonts w:ascii="Calibri" w:hAnsi="Calibri"/>
           <w:b/>
-          <w:i w:val="0"/>
-          <w:sz w:val="22"/>
         </w:rPr>
         <w:t>aprovar formalmente a arquitetura técnica</w:t>
       </w:r>
       <w:r>
-        <w:rPr>
-          <w:rFonts w:ascii="Calibri" w:hAnsi="Calibri"/>
-          <w:b w:val="0"/>
-          <w:i w:val="0"/>
-          <w:sz w:val="22"/>
-        </w:rPr>
         <w:t xml:space="preserve"> da plataforma MilhasFacil antes do início do desenvolvimento incremental, conforme o processo de Projeto e Construção do Produto (PCP) e a Gerência de Decisões (GDE). A arquitetura aprovada é a baseline de design registrada em </w:t>
       </w:r>
       <w:r>
         <w:rPr>
-          <w:rFonts w:ascii="Calibri" w:hAnsi="Calibri"/>
           <w:b/>
-          <w:i w:val="0"/>
-          <w:sz w:val="22"/>
         </w:rPr>
         <w:t>PCP-MILHASFACIL01-001</w:t>
       </w:r>
       <w:r>
-        <w:rPr>
-          <w:rFonts w:ascii="Calibri" w:hAnsi="Calibri"/>
-          <w:b w:val="0"/>
-          <w:i w:val="0"/>
-          <w:sz w:val="22"/>
-        </w:rPr>
         <w:t>.</w:t>
       </w:r>
     </w:p>
     <w:p>
       <w:pPr>
-        <w:pStyle w:val="Heading1"/>
-        <w:keepNext/>
-        <w:keepLines/>
-        <w:pBdr>
-          <w:bottom w:val="single" w:sz="4" w:space="2" w:color="D6E4F0"/>
-        </w:pBdr>
+        <w:pStyle w:val="Heading2"/>
       </w:pPr>
       <w:r>
         <w:t>3. Escopo da aprovação de design</w:t>
@@ -1410,48 +614,24 @@
     </w:p>
     <w:tbl>
       <w:tblPr>
+        <w:tblStyle w:val="TableGrid"/>
         <w:tblW w:type="auto" w:w="0"/>
         <w:tblLook w:firstColumn="1" w:firstRow="1" w:lastColumn="0" w:lastRow="0" w:noHBand="0" w:noVBand="1" w:val="04A0"/>
-        <w:tblBorders>
-          <w:top w:val="single" w:sz="4" w:space="0" w:color="003366"/>
-          <w:left w:val="single" w:sz="4" w:space="0" w:color="003366"/>
-          <w:bottom w:val="single" w:sz="4" w:space="0" w:color="003366"/>
-          <w:right w:val="single" w:sz="4" w:space="0" w:color="003366"/>
-          <w:insideH w:val="single" w:sz="4" w:space="0" w:color="003366"/>
-          <w:insideV w:val="single" w:sz="4" w:space="0" w:color="003366"/>
-        </w:tblBorders>
       </w:tblPr>
       <w:tblGrid>
-        <w:gridCol w:w="2967"/>
-        <w:gridCol w:w="2967"/>
-        <w:gridCol w:w="2967"/>
+        <w:gridCol w:w="2880"/>
+        <w:gridCol w:w="2880"/>
+        <w:gridCol w:w="2880"/>
       </w:tblGrid>
       <w:tr>
-        <w:trPr>
-          <w:cantSplit w:val="1"/>
-        </w:trPr>
         <w:tc>
           <w:tcPr>
-            <w:tcW w:type="dxa" w:w="2967"/>
-            <w:tcMar>
-              <w:top w:w="60" w:type="dxa"/>
-              <w:bottom w:w="60" w:type="dxa"/>
-              <w:left w:w="100" w:type="dxa"/>
-              <w:right w:w="100" w:type="dxa"/>
-            </w:tcMar>
-            <w:shd w:val="clear" w:color="auto" w:fill="003366"/>
+            <w:tcW w:type="dxa" w:w="2880"/>
           </w:tcPr>
           <w:p>
-            <w:pPr>
-              <w:spacing w:before="40" w:after="40"/>
-            </w:pPr>
             <w:r>
               <w:rPr>
-                <w:rFonts w:ascii="Calibri" w:hAnsi="Calibri"/>
                 <w:b/>
-                <w:i w:val="0"/>
-                <w:color w:val="FFFFFF"/>
-                <w:sz w:val="20"/>
               </w:rPr>
               <w:t>Item de design</w:t>
             </w:r>
@@ -1459,26 +639,12 @@
         </w:tc>
         <w:tc>
           <w:tcPr>
-            <w:tcW w:type="dxa" w:w="2967"/>
-            <w:tcMar>
-              <w:top w:w="60" w:type="dxa"/>
-              <w:bottom w:w="60" w:type="dxa"/>
-              <w:left w:w="100" w:type="dxa"/>
-              <w:right w:w="100" w:type="dxa"/>
-            </w:tcMar>
-            <w:shd w:val="clear" w:color="auto" w:fill="003366"/>
+            <w:tcW w:type="dxa" w:w="2880"/>
           </w:tcPr>
           <w:p>
-            <w:pPr>
-              <w:spacing w:before="40" w:after="40"/>
-            </w:pPr>
             <w:r>
               <w:rPr>
-                <w:rFonts w:ascii="Calibri" w:hAnsi="Calibri"/>
                 <w:b/>
-                <w:i w:val="0"/>
-                <w:color w:val="FFFFFF"/>
-                <w:sz w:val="20"/>
               </w:rPr>
               <w:t>Aplicável?</w:t>
             </w:r>
@@ -1486,26 +652,12 @@
         </w:tc>
         <w:tc>
           <w:tcPr>
-            <w:tcW w:type="dxa" w:w="2967"/>
-            <w:tcMar>
-              <w:top w:w="60" w:type="dxa"/>
-              <w:bottom w:w="60" w:type="dxa"/>
-              <w:left w:w="100" w:type="dxa"/>
-              <w:right w:w="100" w:type="dxa"/>
-            </w:tcMar>
-            <w:shd w:val="clear" w:color="auto" w:fill="003366"/>
+            <w:tcW w:type="dxa" w:w="2880"/>
           </w:tcPr>
           <w:p>
-            <w:pPr>
-              <w:spacing w:before="40" w:after="40"/>
-            </w:pPr>
             <w:r>
               <w:rPr>
-                <w:rFonts w:ascii="Calibri" w:hAnsi="Calibri"/>
                 <w:b/>
-                <w:i w:val="0"/>
-                <w:color w:val="FFFFFF"/>
-                <w:sz w:val="20"/>
               </w:rPr>
               <w:t>Decisão</w:t>
             </w:r>
@@ -1513,65 +665,30 @@
         </w:tc>
       </w:tr>
       <w:tr>
-        <w:trPr>
-          <w:cantSplit w:val="1"/>
-        </w:trPr>
         <w:tc>
           <w:tcPr>
-            <w:tcW w:type="dxa" w:w="2967"/>
-            <w:tcMar>
-              <w:top w:w="60" w:type="dxa"/>
-              <w:bottom w:w="60" w:type="dxa"/>
-              <w:left w:w="100" w:type="dxa"/>
-              <w:right w:w="100" w:type="dxa"/>
-            </w:tcMar>
-            <w:shd w:val="clear" w:color="auto" w:fill="EBF5FB"/>
+            <w:tcW w:type="dxa" w:w="2880"/>
           </w:tcPr>
           <w:p>
-            <w:pPr>
-              <w:spacing w:before="40" w:after="40"/>
-            </w:pPr>
             <w:r>
               <w:rPr>
-                <w:rFonts w:ascii="Calibri" w:hAnsi="Calibri"/>
                 <w:b/>
-                <w:i w:val="0"/>
-                <w:sz w:val="20"/>
               </w:rPr>
               <w:t>Arquitetura técnica</w:t>
             </w:r>
             <w:r>
-              <w:rPr>
-                <w:rFonts w:ascii="Calibri" w:hAnsi="Calibri"/>
-                <w:b w:val="0"/>
-                <w:i w:val="0"/>
-                <w:sz w:val="20"/>
-              </w:rPr>
               <w:t xml:space="preserve"> (serviços, segurança, integração, dados)</w:t>
             </w:r>
           </w:p>
         </w:tc>
         <w:tc>
           <w:tcPr>
-            <w:tcW w:type="dxa" w:w="2967"/>
-            <w:tcMar>
-              <w:top w:w="60" w:type="dxa"/>
-              <w:bottom w:w="60" w:type="dxa"/>
-              <w:left w:w="100" w:type="dxa"/>
-              <w:right w:w="100" w:type="dxa"/>
-            </w:tcMar>
-            <w:shd w:val="clear" w:color="auto" w:fill="EBF5FB"/>
+            <w:tcW w:type="dxa" w:w="2880"/>
           </w:tcPr>
           <w:p>
-            <w:pPr>
-              <w:spacing w:before="40" w:after="40"/>
-            </w:pPr>
             <w:r>
               <w:rPr>
-                <w:rFonts w:ascii="Calibri" w:hAnsi="Calibri"/>
                 <w:b/>
-                <w:i w:val="0"/>
-                <w:sz w:val="20"/>
               </w:rPr>
               <w:t>Sim</w:t>
             </w:r>
@@ -1579,55 +696,24 @@
         </w:tc>
         <w:tc>
           <w:tcPr>
-            <w:tcW w:type="dxa" w:w="2967"/>
-            <w:tcMar>
-              <w:top w:w="60" w:type="dxa"/>
-              <w:bottom w:w="60" w:type="dxa"/>
-              <w:left w:w="100" w:type="dxa"/>
-              <w:right w:w="100" w:type="dxa"/>
-            </w:tcMar>
-            <w:shd w:val="clear" w:color="auto" w:fill="EBF5FB"/>
+            <w:tcW w:type="dxa" w:w="2880"/>
           </w:tcPr>
           <w:p>
-            <w:pPr>
-              <w:spacing w:before="40" w:after="40"/>
-            </w:pPr>
             <w:r>
-              <w:rPr>
-                <w:rFonts w:ascii="Calibri" w:hAnsi="Calibri"/>
-                <w:b w:val="0"/>
-                <w:i w:val="0"/>
-                <w:sz w:val="20"/>
-              </w:rPr>
               <w:t>Objeto desta ata — aprovada pelo PO + Tech Lead</w:t>
             </w:r>
           </w:p>
         </w:tc>
       </w:tr>
       <w:tr>
-        <w:trPr>
-          <w:cantSplit w:val="1"/>
-        </w:trPr>
         <w:tc>
           <w:tcPr>
-            <w:tcW w:type="dxa" w:w="2967"/>
-            <w:tcMar>
-              <w:top w:w="60" w:type="dxa"/>
-              <w:bottom w:w="60" w:type="dxa"/>
-              <w:left w:w="100" w:type="dxa"/>
-              <w:right w:w="100" w:type="dxa"/>
-            </w:tcMar>
+            <w:tcW w:type="dxa" w:w="2880"/>
           </w:tcPr>
           <w:p>
-            <w:pPr>
-              <w:spacing w:before="40" w:after="40"/>
-            </w:pPr>
             <w:r>
               <w:rPr>
-                <w:rFonts w:ascii="Calibri" w:hAnsi="Calibri"/>
                 <w:b/>
-                <w:i w:val="0"/>
-                <w:sz w:val="20"/>
               </w:rPr>
               <w:t>Design de UI / UX (layout, identidade visual, telas)</w:t>
             </w:r>
@@ -1635,24 +721,12 @@
         </w:tc>
         <w:tc>
           <w:tcPr>
-            <w:tcW w:type="dxa" w:w="2967"/>
-            <w:tcMar>
-              <w:top w:w="60" w:type="dxa"/>
-              <w:bottom w:w="60" w:type="dxa"/>
-              <w:left w:w="100" w:type="dxa"/>
-              <w:right w:w="100" w:type="dxa"/>
-            </w:tcMar>
+            <w:tcW w:type="dxa" w:w="2880"/>
           </w:tcPr>
           <w:p>
-            <w:pPr>
-              <w:spacing w:before="40" w:after="40"/>
-            </w:pPr>
             <w:r>
               <w:rPr>
-                <w:rFonts w:ascii="Calibri" w:hAnsi="Calibri"/>
                 <w:b/>
-                <w:i w:val="0"/>
-                <w:sz w:val="20"/>
               </w:rPr>
               <w:t>Não aplicável</w:t>
             </w:r>
@@ -1660,576 +734,272 @@
         </w:tc>
         <w:tc>
           <w:tcPr>
-            <w:tcW w:type="dxa" w:w="2967"/>
-            <w:tcMar>
-              <w:top w:w="60" w:type="dxa"/>
-              <w:bottom w:w="60" w:type="dxa"/>
-              <w:left w:w="100" w:type="dxa"/>
-              <w:right w:w="100" w:type="dxa"/>
-            </w:tcMar>
+            <w:tcW w:type="dxa" w:w="2880"/>
           </w:tcPr>
           <w:p>
-            <w:pPr>
-              <w:spacing w:before="40" w:after="40"/>
-            </w:pPr>
             <w:r>
-              <w:rPr>
-                <w:rFonts w:ascii="Calibri" w:hAnsi="Calibri"/>
-                <w:b w:val="0"/>
-                <w:i w:val="0"/>
-                <w:sz w:val="20"/>
-              </w:rPr>
               <w:t xml:space="preserve">O </w:t>
             </w:r>
             <w:r>
               <w:rPr>
-                <w:rFonts w:ascii="Calibri" w:hAnsi="Calibri"/>
                 <w:b/>
-                <w:i w:val="0"/>
-                <w:sz w:val="20"/>
               </w:rPr>
               <w:t>layout e a identidade visual são fornecidos pelo cliente (Hub de Milhas)</w:t>
             </w:r>
             <w:r>
-              <w:rPr>
-                <w:rFonts w:ascii="Calibri" w:hAnsi="Calibri"/>
-                <w:b w:val="0"/>
-                <w:i w:val="0"/>
-                <w:sz w:val="20"/>
-              </w:rPr>
               <w:t xml:space="preserve">; o projeto </w:t>
             </w:r>
             <w:r>
               <w:rPr>
-                <w:rFonts w:ascii="Calibri" w:hAnsi="Calibri"/>
                 <w:b/>
-                <w:i w:val="0"/>
-                <w:sz w:val="20"/>
               </w:rPr>
               <w:t>não inclui design de UI/UX</w:t>
             </w:r>
             <w:r>
-              <w:rPr>
-                <w:rFonts w:ascii="Calibri" w:hAnsi="Calibri"/>
-                <w:b w:val="0"/>
-                <w:i w:val="0"/>
-                <w:sz w:val="20"/>
-              </w:rPr>
               <w:t xml:space="preserve">. A camada web (Angular + TailwindCSS) apenas </w:t>
             </w:r>
             <w:r>
               <w:rPr>
-                <w:rFonts w:ascii="Calibri" w:hAnsi="Calibri"/>
                 <w:b/>
-                <w:i w:val="0"/>
-                <w:sz w:val="20"/>
               </w:rPr>
               <w:t>implementa</w:t>
             </w:r>
             <w:r>
-              <w:rPr>
-                <w:rFonts w:ascii="Calibri" w:hAnsi="Calibri"/>
-                <w:b w:val="0"/>
-                <w:i w:val="0"/>
-                <w:sz w:val="20"/>
-              </w:rPr>
               <w:t xml:space="preserve"> o layout entregue pelo cliente, com aprovação visual nas Sprint Reviews. Não há, portanto, etapa de aprovação de design de interface.</w:t>
             </w:r>
           </w:p>
         </w:tc>
       </w:tr>
     </w:tbl>
+    <w:p/>
     <w:p>
       <w:pPr>
-        <w:spacing w:before="0" w:after="160"/>
-      </w:pPr>
-    </w:p>
-    <w:p>
-      <w:pPr>
-        <w:pStyle w:val="Heading1"/>
-        <w:keepNext/>
-        <w:keepLines/>
-        <w:pBdr>
-          <w:bottom w:val="single" w:sz="4" w:space="2" w:color="D6E4F0"/>
-        </w:pBdr>
+        <w:pStyle w:val="Heading2"/>
       </w:pPr>
       <w:r>
         <w:t>4. Arquitetura revisada e aprovada</w:t>
       </w:r>
     </w:p>
     <w:p>
-      <w:pPr>
-        <w:spacing w:before="0" w:after="120"/>
-      </w:pPr>
       <w:r>
-        <w:rPr>
-          <w:rFonts w:ascii="Calibri" w:hAnsi="Calibri"/>
-          <w:b w:val="0"/>
-          <w:i w:val="0"/>
-          <w:sz w:val="22"/>
-        </w:rPr>
         <w:t xml:space="preserve">Arquitetura distribuída em </w:t>
       </w:r>
       <w:r>
         <w:rPr>
-          <w:rFonts w:ascii="Calibri" w:hAnsi="Calibri"/>
           <w:b/>
-          <w:i w:val="0"/>
-          <w:sz w:val="22"/>
         </w:rPr>
         <w:t>três serviços conteinerizados</w:t>
       </w:r>
       <w:r>
-        <w:rPr>
-          <w:rFonts w:ascii="Calibri" w:hAnsi="Calibri"/>
-          <w:b w:val="0"/>
-          <w:i w:val="0"/>
-          <w:sz w:val="22"/>
-        </w:rPr>
         <w:t>, orquestrados por Docker Compose (lida do código-fonte; detalhada em PCP-MILHASFACIL01-001):</w:t>
       </w:r>
     </w:p>
     <w:p>
       <w:pPr>
         <w:pStyle w:val="ListBullet"/>
-        <w:spacing w:before="20" w:after="40"/>
       </w:pPr>
       <w:r>
         <w:rPr>
-          <w:rFonts w:ascii="Calibri" w:hAnsi="Calibri"/>
           <w:b/>
-          <w:i w:val="0"/>
-          <w:sz w:val="22"/>
         </w:rPr>
         <w:t>API (MilhasFacil_api)</w:t>
       </w:r>
       <w:r>
-        <w:rPr>
-          <w:rFonts w:ascii="Calibri" w:hAnsi="Calibri"/>
-          <w:b w:val="0"/>
-          <w:i w:val="0"/>
-          <w:sz w:val="22"/>
-        </w:rPr>
         <w:t xml:space="preserve"> — Spring Boot 3.2.5 / Java 21, padrão MVC em camadas (Controller → Service → Repository); persistência em </w:t>
       </w:r>
       <w:r>
         <w:rPr>
-          <w:rFonts w:ascii="Calibri" w:hAnsi="Calibri"/>
           <w:b/>
-          <w:i w:val="0"/>
-          <w:sz w:val="22"/>
         </w:rPr>
         <w:t>PostgreSQL</w:t>
       </w:r>
       <w:r>
-        <w:rPr>
-          <w:rFonts w:ascii="Calibri" w:hAnsi="Calibri"/>
-          <w:b w:val="0"/>
-          <w:i w:val="0"/>
-          <w:sz w:val="22"/>
-        </w:rPr>
         <w:t xml:space="preserve"> (migrations Flyway) e cache/segurança em </w:t>
       </w:r>
       <w:r>
         <w:rPr>
-          <w:rFonts w:ascii="Calibri" w:hAnsi="Calibri"/>
           <w:b/>
-          <w:i w:val="0"/>
-          <w:sz w:val="22"/>
         </w:rPr>
         <w:t>Redis</w:t>
       </w:r>
       <w:r>
-        <w:rPr>
-          <w:rFonts w:ascii="Calibri" w:hAnsi="Calibri"/>
-          <w:b w:val="0"/>
-          <w:i w:val="0"/>
-          <w:sz w:val="22"/>
-        </w:rPr>
         <w:t>.</w:t>
       </w:r>
     </w:p>
     <w:p>
       <w:pPr>
         <w:pStyle w:val="ListBullet"/>
-        <w:spacing w:before="20" w:after="40"/>
       </w:pPr>
       <w:r>
         <w:rPr>
-          <w:rFonts w:ascii="Calibri" w:hAnsi="Calibri"/>
           <w:b/>
-          <w:i w:val="0"/>
-          <w:sz w:val="22"/>
         </w:rPr>
         <w:t>Web (MilhasFacil_web)</w:t>
       </w:r>
       <w:r>
-        <w:rPr>
-          <w:rFonts w:ascii="Calibri" w:hAnsi="Calibri"/>
-          <w:b w:val="0"/>
-          <w:i w:val="0"/>
-          <w:sz w:val="22"/>
-        </w:rPr>
         <w:t xml:space="preserve"> — Angular 17.3 standalone + TailwindCSS 3.4, com lazy loading; consome a API via REST.</w:t>
       </w:r>
     </w:p>
     <w:p>
       <w:pPr>
         <w:pStyle w:val="ListBullet"/>
-        <w:spacing w:before="20" w:after="40"/>
       </w:pPr>
       <w:r>
         <w:rPr>
-          <w:rFonts w:ascii="Calibri" w:hAnsi="Calibri"/>
           <w:b/>
-          <w:i w:val="0"/>
-          <w:sz w:val="22"/>
         </w:rPr>
         <w:t>Crawler (MilhasFacil_crawler)</w:t>
       </w:r>
       <w:r>
-        <w:rPr>
-          <w:rFonts w:ascii="Calibri" w:hAnsi="Calibri"/>
-          <w:b w:val="0"/>
-          <w:i w:val="0"/>
-          <w:sz w:val="22"/>
-        </w:rPr>
         <w:t xml:space="preserve"> — FastAPI 0.111 + SeleniumBase 4.27.4, com três parsers (Smiles/Azul/Latam); serviço isolado da API.</w:t>
       </w:r>
     </w:p>
     <w:p>
-      <w:pPr>
-        <w:spacing w:before="0" w:after="120"/>
-      </w:pPr>
       <w:r>
-        <w:rPr>
-          <w:rFonts w:ascii="Calibri" w:hAnsi="Calibri"/>
-          <w:b w:val="0"/>
-          <w:i w:val="0"/>
-          <w:sz w:val="22"/>
-        </w:rPr>
         <w:t xml:space="preserve">Decisões arquiteturais aprovadas (registradas em </w:t>
       </w:r>
       <w:r>
         <w:rPr>
-          <w:rFonts w:ascii="Calibri" w:hAnsi="Calibri"/>
           <w:b/>
-          <w:i w:val="0"/>
-          <w:sz w:val="22"/>
         </w:rPr>
         <w:t>GDE-MILHASFACIL01-001</w:t>
       </w:r>
       <w:r>
-        <w:rPr>
-          <w:rFonts w:ascii="Calibri" w:hAnsi="Calibri"/>
-          <w:b w:val="0"/>
-          <w:i w:val="0"/>
-          <w:sz w:val="22"/>
-        </w:rPr>
         <w:t>):</w:t>
       </w:r>
     </w:p>
     <w:p>
       <w:pPr>
         <w:pStyle w:val="ListBullet"/>
-        <w:spacing w:before="20" w:after="40"/>
       </w:pPr>
       <w:r>
         <w:rPr>
-          <w:rFonts w:ascii="Calibri" w:hAnsi="Calibri"/>
           <w:b/>
-          <w:i w:val="0"/>
-          <w:sz w:val="22"/>
         </w:rPr>
         <w:t>GDE-1 — Autenticação JWT stateless</w:t>
       </w:r>
       <w:r>
-        <w:rPr>
-          <w:rFonts w:ascii="Calibri" w:hAnsi="Calibri"/>
-          <w:b w:val="0"/>
-          <w:i w:val="0"/>
-          <w:sz w:val="22"/>
-        </w:rPr>
         <w:t xml:space="preserve"> (HS256, access 30 min + refresh 7 dias) com </w:t>
       </w:r>
       <w:r>
         <w:rPr>
-          <w:rFonts w:ascii="Calibri" w:hAnsi="Calibri"/>
           <w:b/>
-          <w:i w:val="0"/>
-          <w:sz w:val="22"/>
         </w:rPr>
         <w:t>blacklist de jti no Redis</w:t>
       </w:r>
       <w:r>
-        <w:rPr>
-          <w:rFonts w:ascii="Calibri" w:hAnsi="Calibri"/>
-          <w:b w:val="0"/>
-          <w:i w:val="0"/>
-          <w:sz w:val="22"/>
-        </w:rPr>
         <w:t xml:space="preserve"> para logout seguro, mantendo escalabilidade horizontal sem sessão de servidor.</w:t>
       </w:r>
     </w:p>
     <w:p>
       <w:pPr>
         <w:pStyle w:val="ListBullet"/>
-        <w:spacing w:before="20" w:after="40"/>
       </w:pPr>
       <w:r>
         <w:rPr>
-          <w:rFonts w:ascii="Calibri" w:hAnsi="Calibri"/>
           <w:b/>
-          <w:i w:val="0"/>
-          <w:sz w:val="22"/>
         </w:rPr>
         <w:t>GDE-2 — Busca paralela</w:t>
       </w:r>
       <w:r>
-        <w:rPr>
-          <w:rFonts w:ascii="Calibri" w:hAnsi="Calibri"/>
-          <w:b w:val="0"/>
-          <w:i w:val="0"/>
-          <w:sz w:val="22"/>
-        </w:rPr>
         <w:t xml:space="preserve"> das três companhias com </w:t>
       </w:r>
       <w:r>
         <w:rPr>
-          <w:rFonts w:ascii="Courier New" w:hAnsi="Courier New"/>
-          <w:b w:val="0"/>
-          <w:i w:val="0"/>
-          <w:color w:val="333333"/>
-          <w:sz w:val="20"/>
+          <w:rFonts w:ascii="Consolas" w:hAnsi="Consolas"/>
         </w:rPr>
         <w:t>CompletableFuture</w:t>
       </w:r>
       <w:r>
-        <w:rPr>
-          <w:rFonts w:ascii="Calibri" w:hAnsi="Calibri"/>
-          <w:b w:val="0"/>
-          <w:i w:val="0"/>
-          <w:sz w:val="22"/>
-        </w:rPr>
         <w:t xml:space="preserve"> (timeout de 40 s por crawler), consolidando resultados sem duplicatas e ordenando por milhas (atende RNF01).</w:t>
       </w:r>
     </w:p>
     <w:p>
       <w:pPr>
         <w:pStyle w:val="ListBullet"/>
-        <w:spacing w:before="20" w:after="40"/>
       </w:pPr>
       <w:r>
         <w:rPr>
-          <w:rFonts w:ascii="Calibri" w:hAnsi="Calibri"/>
           <w:b/>
-          <w:i w:val="0"/>
-          <w:sz w:val="22"/>
         </w:rPr>
         <w:t>GDE-3 — Crawler em serviço separado</w:t>
       </w:r>
       <w:r>
-        <w:rPr>
-          <w:rFonts w:ascii="Calibri" w:hAnsi="Calibri"/>
-          <w:b w:val="0"/>
-          <w:i w:val="0"/>
-          <w:sz w:val="22"/>
-        </w:rPr>
         <w:t xml:space="preserve"> (FastAPI + SeleniumBase) em vez de scraping embarcado na API — isola a volatilidade dos portais das cias (risco R-01) e permite evolução independente.</w:t>
       </w:r>
     </w:p>
     <w:p>
       <w:pPr>
         <w:pStyle w:val="ListBullet"/>
-        <w:spacing w:before="20" w:after="40"/>
       </w:pPr>
       <w:r>
         <w:rPr>
-          <w:rFonts w:ascii="Calibri" w:hAnsi="Calibri"/>
           <w:b/>
-          <w:i w:val="0"/>
-          <w:sz w:val="22"/>
         </w:rPr>
         <w:t>GDE-4 — Senhas com BCrypt</w:t>
       </w:r>
       <w:r>
-        <w:rPr>
-          <w:rFonts w:ascii="Calibri" w:hAnsi="Calibri"/>
-          <w:b w:val="0"/>
-          <w:i w:val="0"/>
-          <w:sz w:val="22"/>
-        </w:rPr>
         <w:t xml:space="preserve"> e CORS restrito; </w:t>
       </w:r>
       <w:r>
         <w:rPr>
-          <w:rFonts w:ascii="Calibri" w:hAnsi="Calibri"/>
           <w:b/>
-          <w:i w:val="0"/>
-          <w:sz w:val="22"/>
         </w:rPr>
         <w:t>GDE-5 — exclusão lógica</w:t>
       </w:r>
       <w:r>
-        <w:rPr>
-          <w:rFonts w:ascii="Calibri" w:hAnsi="Calibri"/>
-          <w:b w:val="0"/>
-          <w:i w:val="0"/>
-          <w:sz w:val="22"/>
-        </w:rPr>
         <w:t xml:space="preserve"> (flag </w:t>
       </w:r>
       <w:r>
         <w:rPr>
-          <w:rFonts w:ascii="Courier New" w:hAnsi="Courier New"/>
-          <w:b w:val="0"/>
-          <w:i w:val="0"/>
-          <w:color w:val="333333"/>
-          <w:sz w:val="20"/>
+          <w:rFonts w:ascii="Consolas" w:hAnsi="Consolas"/>
         </w:rPr>
         <w:t>active</w:t>
       </w:r>
       <w:r>
-        <w:rPr>
-          <w:rFonts w:ascii="Calibri" w:hAnsi="Calibri"/>
-          <w:b w:val="0"/>
-          <w:i w:val="0"/>
-          <w:sz w:val="22"/>
-        </w:rPr>
         <w:t>) em rotas favoritas para preservar rastreabilidade.</w:t>
       </w:r>
     </w:p>
     <w:p>
-      <w:pPr>
-        <w:spacing w:before="120" w:after="40"/>
-        <w:jc w:val="center"/>
-      </w:pPr>
       <w:r>
-        <w:drawing>
-          <wp:inline xmlns:a="http://schemas.openxmlformats.org/drawingml/2006/main" xmlns:pic="http://schemas.openxmlformats.org/drawingml/2006/picture">
-            <wp:extent cx="5029200" cy="3243685"/>
-            <wp:docPr id="1" name="Picture 1"/>
-            <wp:cNvGraphicFramePr>
-              <a:graphicFrameLocks noChangeAspect="1"/>
-            </wp:cNvGraphicFramePr>
-            <a:graphic>
-              <a:graphicData uri="http://schemas.openxmlformats.org/drawingml/2006/picture">
-                <pic:pic>
-                  <pic:nvPicPr>
-                    <pic:cNvPr id="0" name="IMG-ARQ-01_diagrama-arquitetura.png"/>
-                    <pic:cNvPicPr/>
-                  </pic:nvPicPr>
-                  <pic:blipFill>
-                    <a:blip r:embed="rId13"/>
-                    <a:stretch>
-                      <a:fillRect/>
-                    </a:stretch>
-                  </pic:blipFill>
-                  <pic:spPr>
-                    <a:xfrm>
-                      <a:off x="0" y="0"/>
-                      <a:ext cx="5029200" cy="3243685"/>
-                    </a:xfrm>
-                    <a:prstGeom prst="rect"/>
-                  </pic:spPr>
-                </pic:pic>
-              </a:graphicData>
-            </a:graphic>
-          </wp:inline>
-        </w:drawing>
+        <w:t>![IMG-ARQ-01 — diagrama de arquitetura da solução](evidencias/IMG-ARQ-01_diagrama-arquitetura.png)</w:t>
+      </w:r>
+    </w:p>
+    <w:p>
+      <w:r>
+        <w:t xml:space="preserve">*Figura — Diagrama de arquitetura da solução, mantido no </w:t>
+      </w:r>
+      <w:r>
+        <w:rPr>
+          <w:b/>
+        </w:rPr>
+        <w:t>Lucidchart</w:t>
+      </w:r>
+      <w:r>
+        <w:t xml:space="preserve">: &lt;https://lucid.app/lucidchart/a51c0f84-cc01-4468-bfdd-6e94aa7a3ae3&gt;. O </w:t>
+      </w:r>
+      <w:r>
+        <w:rPr>
+          <w:b/>
+        </w:rPr>
+        <w:t>IMG-ARQ-01</w:t>
+      </w:r>
+      <w:r>
+        <w:t xml:space="preserve"> é a exportação (PNG) desse diagrama. A arquitetura textual acima e o </w:t>
+      </w:r>
+      <w:r>
+        <w:rPr>
+          <w:b/>
+        </w:rPr>
+        <w:t>PCP-MILHASFACIL01-001</w:t>
+      </w:r>
+      <w:r>
+        <w:t xml:space="preserve"> detalham a referência aprovada.*</w:t>
       </w:r>
     </w:p>
     <w:p>
       <w:pPr>
-        <w:spacing w:before="0" w:after="200"/>
-        <w:jc w:val="center"/>
-      </w:pPr>
-      <w:r>
-        <w:rPr>
-          <w:rFonts w:ascii="Calibri" w:hAnsi="Calibri"/>
-          <w:i/>
-          <w:color w:val="555555"/>
-          <w:sz w:val="18"/>
-        </w:rPr>
-        <w:t>IMG-ARQ-01 — diagrama de arquitetura da solução</w:t>
-      </w:r>
-    </w:p>
-    <w:p>
-      <w:pPr>
-        <w:spacing w:before="0" w:after="120"/>
-      </w:pPr>
-      <w:r>
-        <w:rPr>
-          <w:rFonts w:ascii="Calibri" w:hAnsi="Calibri"/>
-          <w:b w:val="0"/>
-          <w:i/>
-          <w:sz w:val="22"/>
-        </w:rPr>
-        <w:t xml:space="preserve">Figura — Diagrama de arquitetura da solução, mantido no </w:t>
-      </w:r>
-      <w:r>
-        <w:rPr>
-          <w:rFonts w:ascii="Calibri" w:hAnsi="Calibri"/>
-          <w:b w:val="0"/>
-          <w:i/>
-          <w:sz w:val="22"/>
-        </w:rPr>
-        <w:t>Lucidchart</w:t>
-      </w:r>
-      <w:r>
-        <w:rPr>
-          <w:rFonts w:ascii="Calibri" w:hAnsi="Calibri"/>
-          <w:b w:val="0"/>
-          <w:i/>
-          <w:sz w:val="22"/>
-        </w:rPr>
-        <w:t xml:space="preserve">: &lt;https://lucid.app/lucidchart/a51c0f84-cc01-4468-bfdd-6e94aa7a3ae3&gt;. O </w:t>
-      </w:r>
-      <w:r>
-        <w:rPr>
-          <w:rFonts w:ascii="Calibri" w:hAnsi="Calibri"/>
-          <w:b w:val="0"/>
-          <w:i/>
-          <w:sz w:val="22"/>
-        </w:rPr>
-        <w:t>IMG-ARQ-01</w:t>
-      </w:r>
-      <w:r>
-        <w:rPr>
-          <w:rFonts w:ascii="Calibri" w:hAnsi="Calibri"/>
-          <w:b w:val="0"/>
-          <w:i/>
-          <w:sz w:val="22"/>
-        </w:rPr>
-        <w:t xml:space="preserve"> é a exportação (PNG) desse diagrama. A arquitetura textual acima e o </w:t>
-      </w:r>
-      <w:r>
-        <w:rPr>
-          <w:rFonts w:ascii="Calibri" w:hAnsi="Calibri"/>
-          <w:b w:val="0"/>
-          <w:i/>
-          <w:sz w:val="22"/>
-        </w:rPr>
-        <w:t>PCP-MILHASFACIL01-001</w:t>
-      </w:r>
-      <w:r>
-        <w:rPr>
-          <w:rFonts w:ascii="Calibri" w:hAnsi="Calibri"/>
-          <w:b w:val="0"/>
-          <w:i/>
-          <w:sz w:val="22"/>
-        </w:rPr>
-        <w:t xml:space="preserve"> detalham a referência aprovada.</w:t>
-      </w:r>
-    </w:p>
-    <w:p>
-      <w:pPr>
-        <w:pStyle w:val="Heading1"/>
-        <w:keepNext/>
-        <w:keepLines/>
-        <w:pBdr>
-          <w:bottom w:val="single" w:sz="4" w:space="2" w:color="D6E4F0"/>
-        </w:pBdr>
+        <w:pStyle w:val="Heading2"/>
       </w:pPr>
       <w:r>
         <w:t>5. Deliberações</w:t>
@@ -2237,48 +1007,24 @@
     </w:p>
     <w:tbl>
       <w:tblPr>
+        <w:tblStyle w:val="TableGrid"/>
         <w:tblW w:type="auto" w:w="0"/>
         <w:tblLook w:firstColumn="1" w:firstRow="1" w:lastColumn="0" w:lastRow="0" w:noHBand="0" w:noVBand="1" w:val="04A0"/>
-        <w:tblBorders>
-          <w:top w:val="single" w:sz="4" w:space="0" w:color="003366"/>
-          <w:left w:val="single" w:sz="4" w:space="0" w:color="003366"/>
-          <w:bottom w:val="single" w:sz="4" w:space="0" w:color="003366"/>
-          <w:right w:val="single" w:sz="4" w:space="0" w:color="003366"/>
-          <w:insideH w:val="single" w:sz="4" w:space="0" w:color="003366"/>
-          <w:insideV w:val="single" w:sz="4" w:space="0" w:color="003366"/>
-        </w:tblBorders>
       </w:tblPr>
       <w:tblGrid>
-        <w:gridCol w:w="2967"/>
-        <w:gridCol w:w="2967"/>
-        <w:gridCol w:w="2967"/>
+        <w:gridCol w:w="2880"/>
+        <w:gridCol w:w="2880"/>
+        <w:gridCol w:w="2880"/>
       </w:tblGrid>
       <w:tr>
-        <w:trPr>
-          <w:cantSplit w:val="1"/>
-        </w:trPr>
         <w:tc>
           <w:tcPr>
-            <w:tcW w:type="dxa" w:w="2967"/>
-            <w:tcMar>
-              <w:top w:w="60" w:type="dxa"/>
-              <w:bottom w:w="60" w:type="dxa"/>
-              <w:left w:w="100" w:type="dxa"/>
-              <w:right w:w="100" w:type="dxa"/>
-            </w:tcMar>
-            <w:shd w:val="clear" w:color="auto" w:fill="003366"/>
+            <w:tcW w:type="dxa" w:w="2880"/>
           </w:tcPr>
           <w:p>
-            <w:pPr>
-              <w:spacing w:before="40" w:after="40"/>
-            </w:pPr>
             <w:r>
               <w:rPr>
-                <w:rFonts w:ascii="Calibri" w:hAnsi="Calibri"/>
                 <w:b/>
-                <w:i w:val="0"/>
-                <w:color w:val="FFFFFF"/>
-                <w:sz w:val="20"/>
               </w:rPr>
               <w:t>#</w:t>
             </w:r>
@@ -2286,26 +1032,12 @@
         </w:tc>
         <w:tc>
           <w:tcPr>
-            <w:tcW w:type="dxa" w:w="2967"/>
-            <w:tcMar>
-              <w:top w:w="60" w:type="dxa"/>
-              <w:bottom w:w="60" w:type="dxa"/>
-              <w:left w:w="100" w:type="dxa"/>
-              <w:right w:w="100" w:type="dxa"/>
-            </w:tcMar>
-            <w:shd w:val="clear" w:color="auto" w:fill="003366"/>
+            <w:tcW w:type="dxa" w:w="2880"/>
           </w:tcPr>
           <w:p>
-            <w:pPr>
-              <w:spacing w:before="40" w:after="40"/>
-            </w:pPr>
             <w:r>
               <w:rPr>
-                <w:rFonts w:ascii="Calibri" w:hAnsi="Calibri"/>
                 <w:b/>
-                <w:i w:val="0"/>
-                <w:color w:val="FFFFFF"/>
-                <w:sz w:val="20"/>
               </w:rPr>
               <w:t>Deliberação</w:t>
             </w:r>
@@ -2313,26 +1045,12 @@
         </w:tc>
         <w:tc>
           <w:tcPr>
-            <w:tcW w:type="dxa" w:w="2967"/>
-            <w:tcMar>
-              <w:top w:w="60" w:type="dxa"/>
-              <w:bottom w:w="60" w:type="dxa"/>
-              <w:left w:w="100" w:type="dxa"/>
-              <w:right w:w="100" w:type="dxa"/>
-            </w:tcMar>
-            <w:shd w:val="clear" w:color="auto" w:fill="003366"/>
+            <w:tcW w:type="dxa" w:w="2880"/>
           </w:tcPr>
           <w:p>
-            <w:pPr>
-              <w:spacing w:before="40" w:after="40"/>
-            </w:pPr>
             <w:r>
               <w:rPr>
-                <w:rFonts w:ascii="Calibri" w:hAnsi="Calibri"/>
                 <w:b/>
-                <w:i w:val="0"/>
-                <w:color w:val="FFFFFF"/>
-                <w:sz w:val="20"/>
               </w:rPr>
               <w:t>Responsável</w:t>
             </w:r>
@@ -2340,516 +1058,222 @@
         </w:tc>
       </w:tr>
       <w:tr>
-        <w:trPr>
-          <w:cantSplit w:val="1"/>
-        </w:trPr>
         <w:tc>
           <w:tcPr>
-            <w:tcW w:type="dxa" w:w="2967"/>
-            <w:tcMar>
-              <w:top w:w="60" w:type="dxa"/>
-              <w:bottom w:w="60" w:type="dxa"/>
-              <w:left w:w="100" w:type="dxa"/>
-              <w:right w:w="100" w:type="dxa"/>
-            </w:tcMar>
-            <w:shd w:val="clear" w:color="auto" w:fill="EBF5FB"/>
+            <w:tcW w:type="dxa" w:w="2880"/>
           </w:tcPr>
           <w:p>
-            <w:pPr>
-              <w:spacing w:before="40" w:after="40"/>
-            </w:pPr>
             <w:r>
-              <w:rPr>
-                <w:rFonts w:ascii="Calibri" w:hAnsi="Calibri"/>
-                <w:b w:val="0"/>
-                <w:i w:val="0"/>
-                <w:sz w:val="20"/>
-              </w:rPr>
               <w:t>D-01</w:t>
             </w:r>
           </w:p>
         </w:tc>
         <w:tc>
           <w:tcPr>
-            <w:tcW w:type="dxa" w:w="2967"/>
-            <w:tcMar>
-              <w:top w:w="60" w:type="dxa"/>
-              <w:bottom w:w="60" w:type="dxa"/>
-              <w:left w:w="100" w:type="dxa"/>
-              <w:right w:w="100" w:type="dxa"/>
-            </w:tcMar>
-            <w:shd w:val="clear" w:color="auto" w:fill="EBF5FB"/>
+            <w:tcW w:type="dxa" w:w="2880"/>
           </w:tcPr>
           <w:p>
-            <w:pPr>
-              <w:spacing w:before="40" w:after="40"/>
-            </w:pPr>
             <w:r>
-              <w:rPr>
-                <w:rFonts w:ascii="Calibri" w:hAnsi="Calibri"/>
-                <w:b w:val="0"/>
-                <w:i w:val="0"/>
-                <w:sz w:val="20"/>
-              </w:rPr>
               <w:t xml:space="preserve">Arquitetura técnica (3 serviços, JWT stateless + Redis, busca paralela, crawler isolado) </w:t>
             </w:r>
             <w:r>
               <w:rPr>
-                <w:rFonts w:ascii="Calibri" w:hAnsi="Calibri"/>
                 <w:b/>
-                <w:i w:val="0"/>
-                <w:sz w:val="20"/>
               </w:rPr>
               <w:t>APROVADA</w:t>
             </w:r>
             <w:r>
-              <w:rPr>
-                <w:rFonts w:ascii="Calibri" w:hAnsi="Calibri"/>
-                <w:b w:val="0"/>
-                <w:i w:val="0"/>
-                <w:sz w:val="20"/>
-              </w:rPr>
               <w:t xml:space="preserve"> como baseline de design</w:t>
             </w:r>
           </w:p>
         </w:tc>
         <w:tc>
           <w:tcPr>
-            <w:tcW w:type="dxa" w:w="2967"/>
-            <w:tcMar>
-              <w:top w:w="60" w:type="dxa"/>
-              <w:bottom w:w="60" w:type="dxa"/>
-              <w:left w:w="100" w:type="dxa"/>
-              <w:right w:w="100" w:type="dxa"/>
-            </w:tcMar>
-            <w:shd w:val="clear" w:color="auto" w:fill="EBF5FB"/>
+            <w:tcW w:type="dxa" w:w="2880"/>
           </w:tcPr>
           <w:p>
-            <w:pPr>
-              <w:spacing w:before="40" w:after="40"/>
-            </w:pPr>
             <w:r>
-              <w:rPr>
-                <w:rFonts w:ascii="Calibri" w:hAnsi="Calibri"/>
-                <w:b w:val="0"/>
-                <w:i w:val="0"/>
-                <w:sz w:val="20"/>
-              </w:rPr>
               <w:t>Abraão (PO) + Cézar Velazquez (Tech Lead)</w:t>
             </w:r>
           </w:p>
         </w:tc>
       </w:tr>
       <w:tr>
-        <w:trPr>
-          <w:cantSplit w:val="1"/>
-        </w:trPr>
         <w:tc>
           <w:tcPr>
-            <w:tcW w:type="dxa" w:w="2967"/>
-            <w:tcMar>
-              <w:top w:w="60" w:type="dxa"/>
-              <w:bottom w:w="60" w:type="dxa"/>
-              <w:left w:w="100" w:type="dxa"/>
-              <w:right w:w="100" w:type="dxa"/>
-            </w:tcMar>
+            <w:tcW w:type="dxa" w:w="2880"/>
           </w:tcPr>
           <w:p>
-            <w:pPr>
-              <w:spacing w:before="40" w:after="40"/>
-            </w:pPr>
             <w:r>
-              <w:rPr>
-                <w:rFonts w:ascii="Calibri" w:hAnsi="Calibri"/>
-                <w:b w:val="0"/>
-                <w:i w:val="0"/>
-                <w:sz w:val="20"/>
-              </w:rPr>
               <w:t>D-02</w:t>
             </w:r>
           </w:p>
         </w:tc>
         <w:tc>
           <w:tcPr>
-            <w:tcW w:type="dxa" w:w="2967"/>
-            <w:tcMar>
-              <w:top w:w="60" w:type="dxa"/>
-              <w:bottom w:w="60" w:type="dxa"/>
-              <w:left w:w="100" w:type="dxa"/>
-              <w:right w:w="100" w:type="dxa"/>
-            </w:tcMar>
+            <w:tcW w:type="dxa" w:w="2880"/>
           </w:tcPr>
           <w:p>
-            <w:pPr>
-              <w:spacing w:before="40" w:after="40"/>
-            </w:pPr>
             <w:r>
-              <w:rPr>
-                <w:rFonts w:ascii="Calibri" w:hAnsi="Calibri"/>
-                <w:b w:val="0"/>
-                <w:i w:val="0"/>
-                <w:sz w:val="20"/>
-              </w:rPr>
               <w:t xml:space="preserve">Design de UI/UX </w:t>
             </w:r>
             <w:r>
               <w:rPr>
-                <w:rFonts w:ascii="Calibri" w:hAnsi="Calibri"/>
                 <w:b/>
-                <w:i w:val="0"/>
-                <w:sz w:val="20"/>
               </w:rPr>
               <w:t>não se aplica</w:t>
             </w:r>
             <w:r>
-              <w:rPr>
-                <w:rFonts w:ascii="Calibri" w:hAnsi="Calibri"/>
-                <w:b w:val="0"/>
-                <w:i w:val="0"/>
-                <w:sz w:val="20"/>
-              </w:rPr>
               <w:t xml:space="preserve"> ao escopo — layout fornecido pelo cliente; validação visual ocorre nas Sprint Reviews</w:t>
             </w:r>
           </w:p>
         </w:tc>
         <w:tc>
           <w:tcPr>
-            <w:tcW w:type="dxa" w:w="2967"/>
-            <w:tcMar>
-              <w:top w:w="60" w:type="dxa"/>
-              <w:bottom w:w="60" w:type="dxa"/>
-              <w:left w:w="100" w:type="dxa"/>
-              <w:right w:w="100" w:type="dxa"/>
-            </w:tcMar>
+            <w:tcW w:type="dxa" w:w="2880"/>
           </w:tcPr>
           <w:p>
-            <w:pPr>
-              <w:spacing w:before="40" w:after="40"/>
-            </w:pPr>
             <w:r>
-              <w:rPr>
-                <w:rFonts w:ascii="Calibri" w:hAnsi="Calibri"/>
-                <w:b w:val="0"/>
-                <w:i w:val="0"/>
-                <w:sz w:val="20"/>
-              </w:rPr>
               <w:t>Abraão (PO)</w:t>
             </w:r>
           </w:p>
         </w:tc>
       </w:tr>
       <w:tr>
-        <w:trPr>
-          <w:cantSplit w:val="1"/>
-        </w:trPr>
         <w:tc>
           <w:tcPr>
-            <w:tcW w:type="dxa" w:w="2967"/>
-            <w:tcMar>
-              <w:top w:w="60" w:type="dxa"/>
-              <w:bottom w:w="60" w:type="dxa"/>
-              <w:left w:w="100" w:type="dxa"/>
-              <w:right w:w="100" w:type="dxa"/>
-            </w:tcMar>
-            <w:shd w:val="clear" w:color="auto" w:fill="EBF5FB"/>
+            <w:tcW w:type="dxa" w:w="2880"/>
           </w:tcPr>
           <w:p>
-            <w:pPr>
-              <w:spacing w:before="40" w:after="40"/>
-            </w:pPr>
             <w:r>
-              <w:rPr>
-                <w:rFonts w:ascii="Calibri" w:hAnsi="Calibri"/>
-                <w:b w:val="0"/>
-                <w:i w:val="0"/>
-                <w:sz w:val="20"/>
-              </w:rPr>
               <w:t>D-03</w:t>
             </w:r>
           </w:p>
         </w:tc>
         <w:tc>
           <w:tcPr>
-            <w:tcW w:type="dxa" w:w="2967"/>
-            <w:tcMar>
-              <w:top w:w="60" w:type="dxa"/>
-              <w:bottom w:w="60" w:type="dxa"/>
-              <w:left w:w="100" w:type="dxa"/>
-              <w:right w:w="100" w:type="dxa"/>
-            </w:tcMar>
-            <w:shd w:val="clear" w:color="auto" w:fill="EBF5FB"/>
+            <w:tcW w:type="dxa" w:w="2880"/>
           </w:tcPr>
           <w:p>
-            <w:pPr>
-              <w:spacing w:before="40" w:after="40"/>
-            </w:pPr>
             <w:r>
-              <w:rPr>
-                <w:rFonts w:ascii="Calibri" w:hAnsi="Calibri"/>
-                <w:b w:val="0"/>
-                <w:i w:val="0"/>
-                <w:sz w:val="20"/>
-              </w:rPr>
               <w:t>Decisões arquiteturais registradas em GDE-MILHASFACIL01-001; alterações estruturais seguem o fluxo de change request</w:t>
             </w:r>
           </w:p>
         </w:tc>
         <w:tc>
           <w:tcPr>
-            <w:tcW w:type="dxa" w:w="2967"/>
-            <w:tcMar>
-              <w:top w:w="60" w:type="dxa"/>
-              <w:bottom w:w="60" w:type="dxa"/>
-              <w:left w:w="100" w:type="dxa"/>
-              <w:right w:w="100" w:type="dxa"/>
-            </w:tcMar>
-            <w:shd w:val="clear" w:color="auto" w:fill="EBF5FB"/>
+            <w:tcW w:type="dxa" w:w="2880"/>
           </w:tcPr>
           <w:p>
-            <w:pPr>
-              <w:spacing w:before="40" w:after="40"/>
-            </w:pPr>
             <w:r>
-              <w:rPr>
-                <w:rFonts w:ascii="Calibri" w:hAnsi="Calibri"/>
-                <w:b w:val="0"/>
-                <w:i w:val="0"/>
-                <w:sz w:val="20"/>
-              </w:rPr>
               <w:t>Cézar Velazquez (Tech Lead)</w:t>
             </w:r>
           </w:p>
         </w:tc>
       </w:tr>
       <w:tr>
-        <w:trPr>
-          <w:cantSplit w:val="1"/>
-        </w:trPr>
         <w:tc>
           <w:tcPr>
-            <w:tcW w:type="dxa" w:w="2967"/>
-            <w:tcMar>
-              <w:top w:w="60" w:type="dxa"/>
-              <w:bottom w:w="60" w:type="dxa"/>
-              <w:left w:w="100" w:type="dxa"/>
-              <w:right w:w="100" w:type="dxa"/>
-            </w:tcMar>
+            <w:tcW w:type="dxa" w:w="2880"/>
           </w:tcPr>
           <w:p>
-            <w:pPr>
-              <w:spacing w:before="40" w:after="40"/>
-            </w:pPr>
             <w:r>
-              <w:rPr>
-                <w:rFonts w:ascii="Calibri" w:hAnsi="Calibri"/>
-                <w:b w:val="0"/>
-                <w:i w:val="0"/>
-                <w:sz w:val="20"/>
-              </w:rPr>
               <w:t>D-04</w:t>
             </w:r>
           </w:p>
         </w:tc>
         <w:tc>
           <w:tcPr>
-            <w:tcW w:type="dxa" w:w="2967"/>
-            <w:tcMar>
-              <w:top w:w="60" w:type="dxa"/>
-              <w:bottom w:w="60" w:type="dxa"/>
-              <w:left w:w="100" w:type="dxa"/>
-              <w:right w:w="100" w:type="dxa"/>
-            </w:tcMar>
+            <w:tcW w:type="dxa" w:w="2880"/>
           </w:tcPr>
           <w:p>
-            <w:pPr>
-              <w:spacing w:before="40" w:after="40"/>
-            </w:pPr>
             <w:r>
-              <w:rPr>
-                <w:rFonts w:ascii="Calibri" w:hAnsi="Calibri"/>
-                <w:b w:val="0"/>
-                <w:i w:val="0"/>
-                <w:sz w:val="20"/>
-              </w:rPr>
               <w:t>Revisão técnica contínua via Pull Request, com o Tech Lead como revisor obrigatório (branch policy)</w:t>
             </w:r>
           </w:p>
         </w:tc>
         <w:tc>
           <w:tcPr>
-            <w:tcW w:type="dxa" w:w="2967"/>
-            <w:tcMar>
-              <w:top w:w="60" w:type="dxa"/>
-              <w:bottom w:w="60" w:type="dxa"/>
-              <w:left w:w="100" w:type="dxa"/>
-              <w:right w:w="100" w:type="dxa"/>
-            </w:tcMar>
+            <w:tcW w:type="dxa" w:w="2880"/>
           </w:tcPr>
           <w:p>
-            <w:pPr>
-              <w:spacing w:before="40" w:after="40"/>
-            </w:pPr>
             <w:r>
-              <w:rPr>
-                <w:rFonts w:ascii="Calibri" w:hAnsi="Calibri"/>
-                <w:b w:val="0"/>
-                <w:i w:val="0"/>
-                <w:sz w:val="20"/>
-              </w:rPr>
               <w:t>Cézar Velazquez (Tech Lead)</w:t>
             </w:r>
           </w:p>
         </w:tc>
       </w:tr>
     </w:tbl>
+    <w:p/>
     <w:p>
       <w:pPr>
-        <w:spacing w:before="0" w:after="160"/>
-      </w:pPr>
-    </w:p>
-    <w:p>
-      <w:pPr>
-        <w:pStyle w:val="Heading1"/>
-        <w:keepNext/>
-        <w:keepLines/>
-        <w:pBdr>
-          <w:bottom w:val="single" w:sz="4" w:space="2" w:color="D6E4F0"/>
-        </w:pBdr>
+        <w:pStyle w:val="Heading2"/>
       </w:pPr>
       <w:r>
         <w:t>6. Aprovação</w:t>
       </w:r>
     </w:p>
     <w:p>
-      <w:pPr>
-        <w:spacing w:before="0" w:after="120"/>
-      </w:pPr>
       <w:r>
-        <w:rPr>
-          <w:rFonts w:ascii="Calibri" w:hAnsi="Calibri"/>
-          <w:b w:val="0"/>
-          <w:i w:val="0"/>
-          <w:sz w:val="22"/>
-        </w:rPr>
         <w:t xml:space="preserve">A arquitetura técnica da plataforma MilhasFacil foi </w:t>
       </w:r>
       <w:r>
         <w:rPr>
-          <w:rFonts w:ascii="Calibri" w:hAnsi="Calibri"/>
           <w:b/>
-          <w:i w:val="0"/>
-          <w:sz w:val="22"/>
         </w:rPr>
         <w:t>revisada e aprovada</w:t>
       </w:r>
       <w:r>
-        <w:rPr>
-          <w:rFonts w:ascii="Calibri" w:hAnsi="Calibri"/>
-          <w:b w:val="0"/>
-          <w:i w:val="0"/>
-          <w:sz w:val="22"/>
-        </w:rPr>
         <w:t xml:space="preserve"> nesta reunião pelo </w:t>
       </w:r>
       <w:r>
         <w:rPr>
-          <w:rFonts w:ascii="Calibri" w:hAnsi="Calibri"/>
           <w:b/>
-          <w:i w:val="0"/>
-          <w:sz w:val="22"/>
         </w:rPr>
         <w:t>Gerente de Projeto / PO (Abraão)</w:t>
       </w:r>
       <w:r>
-        <w:rPr>
-          <w:rFonts w:ascii="Calibri" w:hAnsi="Calibri"/>
-          <w:b w:val="0"/>
-          <w:i w:val="0"/>
-          <w:sz w:val="22"/>
-        </w:rPr>
         <w:t xml:space="preserve"> e pelo </w:t>
       </w:r>
       <w:r>
         <w:rPr>
-          <w:rFonts w:ascii="Calibri" w:hAnsi="Calibri"/>
           <w:b/>
-          <w:i w:val="0"/>
-          <w:sz w:val="22"/>
         </w:rPr>
         <w:t>Tech Lead / Arquiteto (Cézar Velazquez)</w:t>
       </w:r>
       <w:r>
-        <w:rPr>
-          <w:rFonts w:ascii="Calibri" w:hAnsi="Calibri"/>
-          <w:b w:val="0"/>
-          <w:i w:val="0"/>
-          <w:sz w:val="22"/>
-        </w:rPr>
         <w:t xml:space="preserve">, constituindo a baseline de design do projeto (PCP-MILHASFACIL01-001). Reitera-se que </w:t>
       </w:r>
       <w:r>
         <w:rPr>
-          <w:rFonts w:ascii="Calibri" w:hAnsi="Calibri"/>
           <w:b/>
-          <w:i w:val="0"/>
-          <w:sz w:val="22"/>
         </w:rPr>
         <w:t>não há aprovação de design de UI/UX</w:t>
       </w:r>
       <w:r>
-        <w:rPr>
-          <w:rFonts w:ascii="Calibri" w:hAnsi="Calibri"/>
-          <w:b w:val="0"/>
-          <w:i w:val="0"/>
-          <w:sz w:val="22"/>
-        </w:rPr>
         <w:t>, por o layout ser fornecido pelo cliente Hub de Milhas.</w:t>
       </w:r>
     </w:p>
     <w:tbl>
       <w:tblPr>
+        <w:tblStyle w:val="TableGrid"/>
         <w:tblW w:type="auto" w:w="0"/>
         <w:tblLook w:firstColumn="1" w:firstRow="1" w:lastColumn="0" w:lastRow="0" w:noHBand="0" w:noVBand="1" w:val="04A0"/>
-        <w:tblBorders>
-          <w:top w:val="single" w:sz="4" w:space="0" w:color="003366"/>
-          <w:left w:val="single" w:sz="4" w:space="0" w:color="003366"/>
-          <w:bottom w:val="single" w:sz="4" w:space="0" w:color="003366"/>
-          <w:right w:val="single" w:sz="4" w:space="0" w:color="003366"/>
-          <w:insideH w:val="single" w:sz="4" w:space="0" w:color="003366"/>
-          <w:insideV w:val="single" w:sz="4" w:space="0" w:color="003366"/>
-        </w:tblBorders>
       </w:tblPr>
       <w:tblGrid>
-        <w:gridCol w:w="2967"/>
-        <w:gridCol w:w="2967"/>
-        <w:gridCol w:w="2967"/>
+        <w:gridCol w:w="2880"/>
+        <w:gridCol w:w="2880"/>
+        <w:gridCol w:w="2880"/>
       </w:tblGrid>
       <w:tr>
-        <w:trPr>
-          <w:cantSplit w:val="1"/>
-        </w:trPr>
         <w:tc>
           <w:tcPr>
-            <w:tcW w:type="dxa" w:w="2967"/>
-            <w:tcMar>
-              <w:top w:w="60" w:type="dxa"/>
-              <w:bottom w:w="60" w:type="dxa"/>
-              <w:left w:w="100" w:type="dxa"/>
-              <w:right w:w="100" w:type="dxa"/>
-            </w:tcMar>
-            <w:shd w:val="clear" w:color="auto" w:fill="003366"/>
+            <w:tcW w:type="dxa" w:w="2880"/>
           </w:tcPr>
           <w:p>
-            <w:pPr>
-              <w:spacing w:before="40" w:after="40"/>
-            </w:pPr>
             <w:r>
               <w:rPr>
-                <w:rFonts w:ascii="Calibri" w:hAnsi="Calibri"/>
                 <w:b/>
-                <w:i w:val="0"/>
-                <w:color w:val="FFFFFF"/>
-                <w:sz w:val="20"/>
               </w:rPr>
               <w:t>Aprovador</w:t>
             </w:r>
@@ -2857,26 +1281,12 @@
         </w:tc>
         <w:tc>
           <w:tcPr>
-            <w:tcW w:type="dxa" w:w="2967"/>
-            <w:tcMar>
-              <w:top w:w="60" w:type="dxa"/>
-              <w:bottom w:w="60" w:type="dxa"/>
-              <w:left w:w="100" w:type="dxa"/>
-              <w:right w:w="100" w:type="dxa"/>
-            </w:tcMar>
-            <w:shd w:val="clear" w:color="auto" w:fill="003366"/>
+            <w:tcW w:type="dxa" w:w="2880"/>
           </w:tcPr>
           <w:p>
-            <w:pPr>
-              <w:spacing w:before="40" w:after="40"/>
-            </w:pPr>
             <w:r>
               <w:rPr>
-                <w:rFonts w:ascii="Calibri" w:hAnsi="Calibri"/>
                 <w:b/>
-                <w:i w:val="0"/>
-                <w:color w:val="FFFFFF"/>
-                <w:sz w:val="20"/>
               </w:rPr>
               <w:t>Papel</w:t>
             </w:r>
@@ -2884,26 +1294,12 @@
         </w:tc>
         <w:tc>
           <w:tcPr>
-            <w:tcW w:type="dxa" w:w="2967"/>
-            <w:tcMar>
-              <w:top w:w="60" w:type="dxa"/>
-              <w:bottom w:w="60" w:type="dxa"/>
-              <w:left w:w="100" w:type="dxa"/>
-              <w:right w:w="100" w:type="dxa"/>
-            </w:tcMar>
-            <w:shd w:val="clear" w:color="auto" w:fill="003366"/>
+            <w:tcW w:type="dxa" w:w="2880"/>
           </w:tcPr>
           <w:p>
-            <w:pPr>
-              <w:spacing w:before="40" w:after="40"/>
-            </w:pPr>
             <w:r>
               <w:rPr>
-                <w:rFonts w:ascii="Calibri" w:hAnsi="Calibri"/>
                 <w:b/>
-                <w:i w:val="0"/>
-                <w:color w:val="FFFFFF"/>
-                <w:sz w:val="20"/>
               </w:rPr>
               <w:t>Decisão</w:t>
             </w:r>
@@ -2911,179 +1307,74 @@
         </w:tc>
       </w:tr>
       <w:tr>
-        <w:trPr>
-          <w:cantSplit w:val="1"/>
-        </w:trPr>
         <w:tc>
           <w:tcPr>
-            <w:tcW w:type="dxa" w:w="2967"/>
-            <w:tcMar>
-              <w:top w:w="60" w:type="dxa"/>
-              <w:bottom w:w="60" w:type="dxa"/>
-              <w:left w:w="100" w:type="dxa"/>
-              <w:right w:w="100" w:type="dxa"/>
-            </w:tcMar>
-            <w:shd w:val="clear" w:color="auto" w:fill="EBF5FB"/>
+            <w:tcW w:type="dxa" w:w="2880"/>
           </w:tcPr>
           <w:p>
-            <w:pPr>
-              <w:spacing w:before="40" w:after="40"/>
-            </w:pPr>
             <w:r>
-              <w:rPr>
-                <w:rFonts w:ascii="Calibri" w:hAnsi="Calibri"/>
-                <w:b w:val="0"/>
-                <w:i w:val="0"/>
-                <w:sz w:val="20"/>
-              </w:rPr>
               <w:t>Abraão</w:t>
             </w:r>
           </w:p>
         </w:tc>
         <w:tc>
           <w:tcPr>
-            <w:tcW w:type="dxa" w:w="2967"/>
-            <w:tcMar>
-              <w:top w:w="60" w:type="dxa"/>
-              <w:bottom w:w="60" w:type="dxa"/>
-              <w:left w:w="100" w:type="dxa"/>
-              <w:right w:w="100" w:type="dxa"/>
-            </w:tcMar>
-            <w:shd w:val="clear" w:color="auto" w:fill="EBF5FB"/>
+            <w:tcW w:type="dxa" w:w="2880"/>
           </w:tcPr>
           <w:p>
-            <w:pPr>
-              <w:spacing w:before="40" w:after="40"/>
-            </w:pPr>
             <w:r>
-              <w:rPr>
-                <w:rFonts w:ascii="Calibri" w:hAnsi="Calibri"/>
-                <w:b w:val="0"/>
-                <w:i w:val="0"/>
-                <w:sz w:val="20"/>
-              </w:rPr>
               <w:t>Gerente de Projeto / PO</w:t>
             </w:r>
           </w:p>
         </w:tc>
         <w:tc>
           <w:tcPr>
-            <w:tcW w:type="dxa" w:w="2967"/>
-            <w:tcMar>
-              <w:top w:w="60" w:type="dxa"/>
-              <w:bottom w:w="60" w:type="dxa"/>
-              <w:left w:w="100" w:type="dxa"/>
-              <w:right w:w="100" w:type="dxa"/>
-            </w:tcMar>
-            <w:shd w:val="clear" w:color="auto" w:fill="EBF5FB"/>
+            <w:tcW w:type="dxa" w:w="2880"/>
           </w:tcPr>
           <w:p>
-            <w:pPr>
-              <w:spacing w:before="40" w:after="40"/>
-            </w:pPr>
             <w:r>
-              <w:rPr>
-                <w:rFonts w:ascii="Calibri" w:hAnsi="Calibri"/>
-                <w:b w:val="0"/>
-                <w:i w:val="0"/>
-                <w:sz w:val="20"/>
-              </w:rPr>
               <w:t>Aprovado</w:t>
             </w:r>
           </w:p>
         </w:tc>
       </w:tr>
       <w:tr>
-        <w:trPr>
-          <w:cantSplit w:val="1"/>
-        </w:trPr>
         <w:tc>
           <w:tcPr>
-            <w:tcW w:type="dxa" w:w="2967"/>
-            <w:tcMar>
-              <w:top w:w="60" w:type="dxa"/>
-              <w:bottom w:w="60" w:type="dxa"/>
-              <w:left w:w="100" w:type="dxa"/>
-              <w:right w:w="100" w:type="dxa"/>
-            </w:tcMar>
+            <w:tcW w:type="dxa" w:w="2880"/>
           </w:tcPr>
           <w:p>
-            <w:pPr>
-              <w:spacing w:before="40" w:after="40"/>
-            </w:pPr>
             <w:r>
-              <w:rPr>
-                <w:rFonts w:ascii="Calibri" w:hAnsi="Calibri"/>
-                <w:b w:val="0"/>
-                <w:i w:val="0"/>
-                <w:sz w:val="20"/>
-              </w:rPr>
               <w:t>Cézar Velazquez</w:t>
             </w:r>
           </w:p>
         </w:tc>
         <w:tc>
           <w:tcPr>
-            <w:tcW w:type="dxa" w:w="2967"/>
-            <w:tcMar>
-              <w:top w:w="60" w:type="dxa"/>
-              <w:bottom w:w="60" w:type="dxa"/>
-              <w:left w:w="100" w:type="dxa"/>
-              <w:right w:w="100" w:type="dxa"/>
-            </w:tcMar>
+            <w:tcW w:type="dxa" w:w="2880"/>
           </w:tcPr>
           <w:p>
-            <w:pPr>
-              <w:spacing w:before="40" w:after="40"/>
-            </w:pPr>
             <w:r>
-              <w:rPr>
-                <w:rFonts w:ascii="Calibri" w:hAnsi="Calibri"/>
-                <w:b w:val="0"/>
-                <w:i w:val="0"/>
-                <w:sz w:val="20"/>
-              </w:rPr>
               <w:t>Tech Lead / Arquiteto</w:t>
             </w:r>
           </w:p>
         </w:tc>
         <w:tc>
           <w:tcPr>
-            <w:tcW w:type="dxa" w:w="2967"/>
-            <w:tcMar>
-              <w:top w:w="60" w:type="dxa"/>
-              <w:bottom w:w="60" w:type="dxa"/>
-              <w:left w:w="100" w:type="dxa"/>
-              <w:right w:w="100" w:type="dxa"/>
-            </w:tcMar>
+            <w:tcW w:type="dxa" w:w="2880"/>
           </w:tcPr>
           <w:p>
-            <w:pPr>
-              <w:spacing w:before="40" w:after="40"/>
-            </w:pPr>
             <w:r>
-              <w:rPr>
-                <w:rFonts w:ascii="Calibri" w:hAnsi="Calibri"/>
-                <w:b w:val="0"/>
-                <w:i w:val="0"/>
-                <w:sz w:val="20"/>
-              </w:rPr>
               <w:t>Aprovado</w:t>
             </w:r>
           </w:p>
         </w:tc>
       </w:tr>
     </w:tbl>
+    <w:p/>
     <w:p>
       <w:pPr>
-        <w:spacing w:before="0" w:after="160"/>
-      </w:pPr>
-    </w:p>
-    <w:p>
-      <w:pPr>
-        <w:pStyle w:val="Heading2"/>
-        <w:keepNext/>
-        <w:keepLines/>
+        <w:pStyle w:val="Heading3"/>
       </w:pPr>
       <w:r>
         <w:t>Evidências referenciadas</w:t>
@@ -3091,48 +1382,24 @@
     </w:p>
     <w:tbl>
       <w:tblPr>
+        <w:tblStyle w:val="TableGrid"/>
         <w:tblW w:type="auto" w:w="0"/>
         <w:tblLook w:firstColumn="1" w:firstRow="1" w:lastColumn="0" w:lastRow="0" w:noHBand="0" w:noVBand="1" w:val="04A0"/>
-        <w:tblBorders>
-          <w:top w:val="single" w:sz="4" w:space="0" w:color="003366"/>
-          <w:left w:val="single" w:sz="4" w:space="0" w:color="003366"/>
-          <w:bottom w:val="single" w:sz="4" w:space="0" w:color="003366"/>
-          <w:right w:val="single" w:sz="4" w:space="0" w:color="003366"/>
-          <w:insideH w:val="single" w:sz="4" w:space="0" w:color="003366"/>
-          <w:insideV w:val="single" w:sz="4" w:space="0" w:color="003366"/>
-        </w:tblBorders>
       </w:tblPr>
       <w:tblGrid>
-        <w:gridCol w:w="2967"/>
-        <w:gridCol w:w="2967"/>
-        <w:gridCol w:w="2967"/>
+        <w:gridCol w:w="2880"/>
+        <w:gridCol w:w="2880"/>
+        <w:gridCol w:w="2880"/>
       </w:tblGrid>
       <w:tr>
-        <w:trPr>
-          <w:cantSplit w:val="1"/>
-        </w:trPr>
         <w:tc>
           <w:tcPr>
-            <w:tcW w:type="dxa" w:w="2967"/>
-            <w:tcMar>
-              <w:top w:w="60" w:type="dxa"/>
-              <w:bottom w:w="60" w:type="dxa"/>
-              <w:left w:w="100" w:type="dxa"/>
-              <w:right w:w="100" w:type="dxa"/>
-            </w:tcMar>
-            <w:shd w:val="clear" w:color="auto" w:fill="003366"/>
+            <w:tcW w:type="dxa" w:w="2880"/>
           </w:tcPr>
           <w:p>
-            <w:pPr>
-              <w:spacing w:before="40" w:after="40"/>
-            </w:pPr>
             <w:r>
               <w:rPr>
-                <w:rFonts w:ascii="Calibri" w:hAnsi="Calibri"/>
                 <w:b/>
-                <w:i w:val="0"/>
-                <w:color w:val="FFFFFF"/>
-                <w:sz w:val="20"/>
               </w:rPr>
               <w:t>Código</w:t>
             </w:r>
@@ -3140,26 +1407,12 @@
         </w:tc>
         <w:tc>
           <w:tcPr>
-            <w:tcW w:type="dxa" w:w="2967"/>
-            <w:tcMar>
-              <w:top w:w="60" w:type="dxa"/>
-              <w:bottom w:w="60" w:type="dxa"/>
-              <w:left w:w="100" w:type="dxa"/>
-              <w:right w:w="100" w:type="dxa"/>
-            </w:tcMar>
-            <w:shd w:val="clear" w:color="auto" w:fill="003366"/>
+            <w:tcW w:type="dxa" w:w="2880"/>
           </w:tcPr>
           <w:p>
-            <w:pPr>
-              <w:spacing w:before="40" w:after="40"/>
-            </w:pPr>
             <w:r>
               <w:rPr>
-                <w:rFonts w:ascii="Calibri" w:hAnsi="Calibri"/>
                 <w:b/>
-                <w:i w:val="0"/>
-                <w:color w:val="FFFFFF"/>
-                <w:sz w:val="20"/>
               </w:rPr>
               <w:t>O que capturar</w:t>
             </w:r>
@@ -3167,26 +1420,12 @@
         </w:tc>
         <w:tc>
           <w:tcPr>
-            <w:tcW w:type="dxa" w:w="2967"/>
-            <w:tcMar>
-              <w:top w:w="60" w:type="dxa"/>
-              <w:bottom w:w="60" w:type="dxa"/>
-              <w:left w:w="100" w:type="dxa"/>
-              <w:right w:w="100" w:type="dxa"/>
-            </w:tcMar>
-            <w:shd w:val="clear" w:color="auto" w:fill="003366"/>
+            <w:tcW w:type="dxa" w:w="2880"/>
           </w:tcPr>
           <w:p>
-            <w:pPr>
-              <w:spacing w:before="40" w:after="40"/>
-            </w:pPr>
             <w:r>
               <w:rPr>
-                <w:rFonts w:ascii="Calibri" w:hAnsi="Calibri"/>
                 <w:b/>
-                <w:i w:val="0"/>
-                <w:color w:val="FFFFFF"/>
-                <w:sz w:val="20"/>
               </w:rPr>
               <w:t>Fonte</w:t>
             </w:r>
@@ -3194,102 +1433,42 @@
         </w:tc>
       </w:tr>
       <w:tr>
-        <w:trPr>
-          <w:cantSplit w:val="1"/>
-        </w:trPr>
         <w:tc>
           <w:tcPr>
-            <w:tcW w:type="dxa" w:w="2967"/>
-            <w:tcMar>
-              <w:top w:w="60" w:type="dxa"/>
-              <w:bottom w:w="60" w:type="dxa"/>
-              <w:left w:w="100" w:type="dxa"/>
-              <w:right w:w="100" w:type="dxa"/>
-            </w:tcMar>
-            <w:shd w:val="clear" w:color="auto" w:fill="EBF5FB"/>
+            <w:tcW w:type="dxa" w:w="2880"/>
           </w:tcPr>
           <w:p>
-            <w:pPr>
-              <w:spacing w:before="40" w:after="40"/>
-            </w:pPr>
             <w:r>
-              <w:rPr>
-                <w:rFonts w:ascii="Calibri" w:hAnsi="Calibri"/>
-                <w:b w:val="0"/>
-                <w:i w:val="0"/>
-                <w:sz w:val="20"/>
-              </w:rPr>
               <w:t>IMG-ARQ-01</w:t>
             </w:r>
           </w:p>
         </w:tc>
         <w:tc>
           <w:tcPr>
-            <w:tcW w:type="dxa" w:w="2967"/>
-            <w:tcMar>
-              <w:top w:w="60" w:type="dxa"/>
-              <w:bottom w:w="60" w:type="dxa"/>
-              <w:left w:w="100" w:type="dxa"/>
-              <w:right w:w="100" w:type="dxa"/>
-            </w:tcMar>
-            <w:shd w:val="clear" w:color="auto" w:fill="EBF5FB"/>
+            <w:tcW w:type="dxa" w:w="2880"/>
           </w:tcPr>
           <w:p>
-            <w:pPr>
-              <w:spacing w:before="40" w:after="40"/>
-            </w:pPr>
             <w:r>
-              <w:rPr>
-                <w:rFonts w:ascii="Calibri" w:hAnsi="Calibri"/>
-                <w:b w:val="0"/>
-                <w:i w:val="0"/>
-                <w:sz w:val="20"/>
-              </w:rPr>
               <w:t>Diagrama de arquitetura da solução (3 serviços)</w:t>
             </w:r>
           </w:p>
         </w:tc>
         <w:tc>
           <w:tcPr>
-            <w:tcW w:type="dxa" w:w="2967"/>
-            <w:tcMar>
-              <w:top w:w="60" w:type="dxa"/>
-              <w:bottom w:w="60" w:type="dxa"/>
-              <w:left w:w="100" w:type="dxa"/>
-              <w:right w:w="100" w:type="dxa"/>
-            </w:tcMar>
-            <w:shd w:val="clear" w:color="auto" w:fill="EBF5FB"/>
+            <w:tcW w:type="dxa" w:w="2880"/>
           </w:tcPr>
           <w:p>
-            <w:pPr>
-              <w:spacing w:before="40" w:after="40"/>
-            </w:pPr>
             <w:r>
-              <w:rPr>
-                <w:rFonts w:ascii="Calibri" w:hAnsi="Calibri"/>
-                <w:b w:val="0"/>
-                <w:i w:val="0"/>
-                <w:sz w:val="20"/>
-              </w:rPr>
               <w:t>Documento de arquitetura / quadro do Design Review</w:t>
             </w:r>
           </w:p>
         </w:tc>
       </w:tr>
     </w:tbl>
+    <w:p/>
     <w:p>
       <w:pPr>
-        <w:spacing w:before="0" w:after="160"/>
-      </w:pPr>
-    </w:p>
-    <w:p>
-      <w:pPr>
-        <w:pStyle w:val="Heading1"/>
-        <w:keepNext/>
-        <w:keepLines/>
-        <w:pBdr>
-          <w:bottom w:val="single" w:sz="4" w:space="2" w:color="D6E4F0"/>
-        </w:pBdr>
+        <w:pStyle w:val="Heading2"/>
       </w:pPr>
       <w:r>
         <w:t>Histórico de revisões</w:t>
@@ -3297,48 +1476,25 @@
     </w:p>
     <w:tbl>
       <w:tblPr>
+        <w:tblStyle w:val="TableGrid"/>
         <w:tblW w:type="auto" w:w="0"/>
         <w:tblLook w:firstColumn="1" w:firstRow="1" w:lastColumn="0" w:lastRow="0" w:noHBand="0" w:noVBand="1" w:val="04A0"/>
-        <w:tblBorders>
-          <w:top w:val="single" w:sz="4" w:space="0" w:color="AAAAAA"/>
-          <w:left w:val="single" w:sz="4" w:space="0" w:color="AAAAAA"/>
-          <w:bottom w:val="single" w:sz="4" w:space="0" w:color="AAAAAA"/>
-          <w:right w:val="single" w:sz="4" w:space="0" w:color="AAAAAA"/>
-          <w:insideH w:val="single" w:sz="4" w:space="0" w:color="AAAAAA"/>
-          <w:insideV w:val="single" w:sz="4" w:space="0" w:color="AAAAAA"/>
-        </w:tblBorders>
       </w:tblPr>
       <w:tblGrid>
-        <w:gridCol w:w="2225"/>
-        <w:gridCol w:w="2225"/>
-        <w:gridCol w:w="2225"/>
-        <w:gridCol w:w="2225"/>
+        <w:gridCol w:w="2160"/>
+        <w:gridCol w:w="2160"/>
+        <w:gridCol w:w="2160"/>
+        <w:gridCol w:w="2160"/>
       </w:tblGrid>
       <w:tr>
-        <w:trPr>
-          <w:cantSplit w:val="1"/>
-        </w:trPr>
         <w:tc>
           <w:tcPr>
-            <w:tcW w:type="dxa" w:w="2225"/>
-            <w:tcMar>
-              <w:top w:w="60" w:type="dxa"/>
-              <w:bottom w:w="60" w:type="dxa"/>
-              <w:left w:w="100" w:type="dxa"/>
-              <w:right w:w="100" w:type="dxa"/>
-            </w:tcMar>
-            <w:shd w:val="clear" w:color="auto" w:fill="D6E4F0"/>
+            <w:tcW w:type="dxa" w:w="2160"/>
           </w:tcPr>
           <w:p>
-            <w:pPr>
-              <w:spacing w:before="40" w:after="40"/>
-            </w:pPr>
             <w:r>
               <w:rPr>
-                <w:rFonts w:ascii="Calibri" w:hAnsi="Calibri"/>
                 <w:b/>
-                <w:i w:val="0"/>
-                <w:sz w:val="20"/>
               </w:rPr>
               <w:t>Versão</w:t>
             </w:r>
@@ -3346,25 +1502,12 @@
         </w:tc>
         <w:tc>
           <w:tcPr>
-            <w:tcW w:type="dxa" w:w="2225"/>
-            <w:tcMar>
-              <w:top w:w="60" w:type="dxa"/>
-              <w:bottom w:w="60" w:type="dxa"/>
-              <w:left w:w="100" w:type="dxa"/>
-              <w:right w:w="100" w:type="dxa"/>
-            </w:tcMar>
-            <w:shd w:val="clear" w:color="auto" w:fill="D6E4F0"/>
+            <w:tcW w:type="dxa" w:w="2160"/>
           </w:tcPr>
           <w:p>
-            <w:pPr>
-              <w:spacing w:before="40" w:after="40"/>
-            </w:pPr>
             <w:r>
               <w:rPr>
-                <w:rFonts w:ascii="Calibri" w:hAnsi="Calibri"/>
                 <w:b/>
-                <w:i w:val="0"/>
-                <w:sz w:val="20"/>
               </w:rPr>
               <w:t>Data</w:t>
             </w:r>
@@ -3372,25 +1515,12 @@
         </w:tc>
         <w:tc>
           <w:tcPr>
-            <w:tcW w:type="dxa" w:w="2225"/>
-            <w:tcMar>
-              <w:top w:w="60" w:type="dxa"/>
-              <w:bottom w:w="60" w:type="dxa"/>
-              <w:left w:w="100" w:type="dxa"/>
-              <w:right w:w="100" w:type="dxa"/>
-            </w:tcMar>
-            <w:shd w:val="clear" w:color="auto" w:fill="D6E4F0"/>
+            <w:tcW w:type="dxa" w:w="2160"/>
           </w:tcPr>
           <w:p>
-            <w:pPr>
-              <w:spacing w:before="40" w:after="40"/>
-            </w:pPr>
             <w:r>
               <w:rPr>
-                <w:rFonts w:ascii="Calibri" w:hAnsi="Calibri"/>
                 <w:b/>
-                <w:i w:val="0"/>
-                <w:sz w:val="20"/>
               </w:rPr>
               <w:t>Autor</w:t>
             </w:r>
@@ -3398,25 +1528,12 @@
         </w:tc>
         <w:tc>
           <w:tcPr>
-            <w:tcW w:type="dxa" w:w="2225"/>
-            <w:tcMar>
-              <w:top w:w="60" w:type="dxa"/>
-              <w:bottom w:w="60" w:type="dxa"/>
-              <w:left w:w="100" w:type="dxa"/>
-              <w:right w:w="100" w:type="dxa"/>
-            </w:tcMar>
-            <w:shd w:val="clear" w:color="auto" w:fill="D6E4F0"/>
+            <w:tcW w:type="dxa" w:w="2160"/>
           </w:tcPr>
           <w:p>
-            <w:pPr>
-              <w:spacing w:before="40" w:after="40"/>
-            </w:pPr>
             <w:r>
               <w:rPr>
-                <w:rFonts w:ascii="Calibri" w:hAnsi="Calibri"/>
                 <w:b/>
-                <w:i w:val="0"/>
-                <w:sz w:val="20"/>
               </w:rPr>
               <w:t>Descrição</w:t>
             </w:r>
@@ -3424,415 +1541,99 @@
         </w:tc>
       </w:tr>
       <w:tr>
-        <w:trPr>
-          <w:cantSplit w:val="1"/>
-        </w:trPr>
         <w:tc>
           <w:tcPr>
-            <w:tcW w:type="dxa" w:w="2225"/>
-            <w:tcMar>
-              <w:top w:w="60" w:type="dxa"/>
-              <w:bottom w:w="60" w:type="dxa"/>
-              <w:left w:w="100" w:type="dxa"/>
-              <w:right w:w="100" w:type="dxa"/>
-            </w:tcMar>
-            <w:shd w:val="clear" w:color="auto" w:fill="F0F4F8"/>
+            <w:tcW w:type="dxa" w:w="2160"/>
           </w:tcPr>
           <w:p>
-            <w:pPr>
-              <w:spacing w:before="40" w:after="40"/>
-            </w:pPr>
             <w:r>
-              <w:rPr>
-                <w:rFonts w:ascii="Calibri" w:hAnsi="Calibri"/>
-                <w:b/>
-                <w:i w:val="0"/>
-                <w:sz w:val="20"/>
-              </w:rPr>
               <w:t>1.0</w:t>
             </w:r>
           </w:p>
         </w:tc>
         <w:tc>
           <w:tcPr>
-            <w:tcW w:type="dxa" w:w="2225"/>
-            <w:tcMar>
-              <w:top w:w="60" w:type="dxa"/>
-              <w:bottom w:w="60" w:type="dxa"/>
-              <w:left w:w="100" w:type="dxa"/>
-              <w:right w:w="100" w:type="dxa"/>
-            </w:tcMar>
+            <w:tcW w:type="dxa" w:w="2160"/>
           </w:tcPr>
           <w:p>
-            <w:pPr>
-              <w:spacing w:before="40" w:after="40"/>
-            </w:pPr>
             <w:r>
-              <w:rPr>
-                <w:rFonts w:ascii="Calibri" w:hAnsi="Calibri"/>
-                <w:b w:val="0"/>
-                <w:i w:val="0"/>
-                <w:sz w:val="20"/>
-              </w:rPr>
               <w:t>15/06/2026</w:t>
             </w:r>
           </w:p>
         </w:tc>
         <w:tc>
           <w:tcPr>
-            <w:tcW w:type="dxa" w:w="2225"/>
-            <w:tcMar>
-              <w:top w:w="60" w:type="dxa"/>
-              <w:bottom w:w="60" w:type="dxa"/>
-              <w:left w:w="100" w:type="dxa"/>
-              <w:right w:w="100" w:type="dxa"/>
-            </w:tcMar>
+            <w:tcW w:type="dxa" w:w="2160"/>
           </w:tcPr>
           <w:p>
-            <w:pPr>
-              <w:spacing w:before="40" w:after="40"/>
-            </w:pPr>
             <w:r>
-              <w:rPr>
-                <w:rFonts w:ascii="Calibri" w:hAnsi="Calibri"/>
-                <w:b w:val="0"/>
-                <w:i w:val="0"/>
-                <w:sz w:val="20"/>
-              </w:rPr>
               <w:t>Time de Melhoria Contínua</w:t>
             </w:r>
           </w:p>
         </w:tc>
         <w:tc>
           <w:tcPr>
-            <w:tcW w:type="dxa" w:w="2225"/>
-            <w:tcMar>
-              <w:top w:w="60" w:type="dxa"/>
-              <w:bottom w:w="60" w:type="dxa"/>
-              <w:left w:w="100" w:type="dxa"/>
-              <w:right w:w="100" w:type="dxa"/>
-            </w:tcMar>
+            <w:tcW w:type="dxa" w:w="2160"/>
           </w:tcPr>
           <w:p>
-            <w:pPr>
-              <w:spacing w:before="40" w:after="40"/>
-            </w:pPr>
             <w:r>
-              <w:rPr>
-                <w:rFonts w:ascii="Calibri" w:hAnsi="Calibri"/>
-                <w:b w:val="0"/>
-                <w:i w:val="0"/>
-                <w:sz w:val="20"/>
-              </w:rPr>
               <w:t>Emissão inicial — registro da reunião de Design Review e aprovação da arquitetura (PO + Tech Lead) realizada em 11/02/2026.</w:t>
             </w:r>
           </w:p>
         </w:tc>
       </w:tr>
       <w:tr>
-        <w:trPr>
-          <w:cantSplit w:val="1"/>
-        </w:trPr>
         <w:tc>
           <w:tcPr>
-            <w:tcW w:type="dxa" w:w="2225"/>
-            <w:tcMar>
-              <w:top w:w="60" w:type="dxa"/>
-              <w:bottom w:w="60" w:type="dxa"/>
-              <w:left w:w="100" w:type="dxa"/>
-              <w:right w:w="100" w:type="dxa"/>
-            </w:tcMar>
-            <w:shd w:val="clear" w:color="auto" w:fill="F0F4F8"/>
+            <w:tcW w:type="dxa" w:w="2160"/>
           </w:tcPr>
           <w:p>
-            <w:pPr>
-              <w:spacing w:before="40" w:after="40"/>
-            </w:pPr>
             <w:r>
-              <w:rPr>
-                <w:rFonts w:ascii="Calibri" w:hAnsi="Calibri"/>
-                <w:b/>
-                <w:i w:val="0"/>
-                <w:sz w:val="20"/>
-              </w:rPr>
               <w:t>1.1</w:t>
             </w:r>
           </w:p>
         </w:tc>
         <w:tc>
           <w:tcPr>
-            <w:tcW w:type="dxa" w:w="2225"/>
-            <w:tcMar>
-              <w:top w:w="60" w:type="dxa"/>
-              <w:bottom w:w="60" w:type="dxa"/>
-              <w:left w:w="100" w:type="dxa"/>
-              <w:right w:w="100" w:type="dxa"/>
-            </w:tcMar>
+            <w:tcW w:type="dxa" w:w="2160"/>
           </w:tcPr>
           <w:p>
-            <w:pPr>
-              <w:spacing w:before="40" w:after="40"/>
-            </w:pPr>
             <w:r>
-              <w:rPr>
-                <w:rFonts w:ascii="Calibri" w:hAnsi="Calibri"/>
-                <w:b w:val="0"/>
-                <w:i w:val="0"/>
-                <w:sz w:val="20"/>
-              </w:rPr>
               <w:t>15/06/2026</w:t>
             </w:r>
           </w:p>
         </w:tc>
         <w:tc>
           <w:tcPr>
-            <w:tcW w:type="dxa" w:w="2225"/>
-            <w:tcMar>
-              <w:top w:w="60" w:type="dxa"/>
-              <w:bottom w:w="60" w:type="dxa"/>
-              <w:left w:w="100" w:type="dxa"/>
-              <w:right w:w="100" w:type="dxa"/>
-            </w:tcMar>
+            <w:tcW w:type="dxa" w:w="2160"/>
           </w:tcPr>
           <w:p>
-            <w:pPr>
-              <w:spacing w:before="40" w:after="40"/>
-            </w:pPr>
             <w:r>
-              <w:rPr>
-                <w:rFonts w:ascii="Calibri" w:hAnsi="Calibri"/>
-                <w:b w:val="0"/>
-                <w:i w:val="0"/>
-                <w:sz w:val="20"/>
-              </w:rPr>
               <w:t>Time de Melhoria Contínua</w:t>
             </w:r>
           </w:p>
         </w:tc>
         <w:tc>
           <w:tcPr>
-            <w:tcW w:type="dxa" w:w="2225"/>
-            <w:tcMar>
-              <w:top w:w="60" w:type="dxa"/>
-              <w:bottom w:w="60" w:type="dxa"/>
-              <w:left w:w="100" w:type="dxa"/>
-              <w:right w:w="100" w:type="dxa"/>
-            </w:tcMar>
+            <w:tcW w:type="dxa" w:w="2160"/>
           </w:tcPr>
           <w:p>
-            <w:pPr>
-              <w:spacing w:before="40" w:after="40"/>
-            </w:pPr>
             <w:r>
-              <w:rPr>
-                <w:rFonts w:ascii="Calibri" w:hAnsi="Calibri"/>
-                <w:b w:val="0"/>
-                <w:i w:val="0"/>
-                <w:sz w:val="20"/>
-              </w:rPr>
               <w:t>Inclusão dos campos de cabeçalho Código do projeto (MILHASFACIL01) e Organização (Timeware Brasil Softwares e Serviços LTDA), padronizando com os demais registros do projeto.</w:t>
             </w:r>
           </w:p>
         </w:tc>
       </w:tr>
     </w:tbl>
-    <w:p>
-      <w:pPr>
-        <w:spacing w:before="0" w:after="160"/>
-      </w:pPr>
-    </w:p>
+    <w:p/>
     <w:sectPr>
-      <w:headerReference w:type="default" r:id="rId9"/>
-      <w:headerReference w:type="first" r:id="rId10"/>
-      <w:footerReference w:type="default" r:id="rId11"/>
-      <w:footerReference w:type="first" r:id="rId12"/>
-      <w:pgSz w:w="11906" w:h="16838"/>
-      <w:pgMar w:top="1587" w:right="1417" w:bottom="1417" w:left="1587" w:header="720" w:footer="720" w:gutter="0"/>
+      <w:pgSz w:w="12240" w:h="15840"/>
+      <w:pgMar w:top="1440" w:right="1800" w:bottom="1440" w:left="1800" w:header="720" w:footer="720" w:gutter="0"/>
       <w:cols w:space="720"/>
-      <w:titlePg/>
       <w:docGrid w:linePitch="360"/>
     </w:sectPr>
   </w:body>
 </w:document>
-</file>
-
-<file path=word/footer1.xml><?xml version="1.0" encoding="utf-8"?>
-<w:ftr xmlns:m="http://schemas.openxmlformats.org/officeDocument/2006/math" xmlns:mc="http://schemas.openxmlformats.org/markup-compatibility/2006" xmlns:mo="http://schemas.microsoft.com/office/mac/office/2008/main" xmlns:mv="urn:schemas-microsoft-com:mac:vml" xmlns:o="urn:schemas-microsoft-com:office:office" xmlns:r="http://schemas.openxmlformats.org/officeDocument/2006/relationships" xmlns:v="urn:schemas-microsoft-com:vml" xmlns:w10="urn:schemas-microsoft-com:office:word" xmlns:w14="http://schemas.microsoft.com/office/word/2010/wordml" xmlns:w="http://schemas.openxmlformats.org/wordprocessingml/2006/main" xmlns:wne="http://schemas.microsoft.com/office/word/2006/wordml" xmlns:wp14="http://schemas.microsoft.com/office/word/2010/wordprocessingDrawing" xmlns:wp="http://schemas.openxmlformats.org/drawingml/2006/wordprocessingDrawing" xmlns:wpc="http://schemas.microsoft.com/office/word/2010/wordprocessingCanvas" xmlns:wpg="http://schemas.microsoft.com/office/word/2010/wordprocessingGroup" xmlns:wpi="http://schemas.microsoft.com/office/word/2010/wordprocessingInk" xmlns:wps="http://schemas.microsoft.com/office/word/2010/wordprocessingShape" mc:Ignorable="w14 wp14">
-  <w:p>
-    <w:pPr>
-      <w:pStyle w:val="Footer"/>
-      <w:tabs>
-        <w:tab w:val="right" w:pos="8901"/>
-      </w:tabs>
-      <w:pBdr>
-        <w:top w:val="single" w:sz="4" w:space="4" w:color="003366"/>
-      </w:pBdr>
-      <w:spacing w:before="80" w:after="0"/>
-    </w:pPr>
-    <w:r>
-      <w:rPr>
-        <w:rFonts w:ascii="Calibri" w:hAnsi="Calibri"/>
-        <w:color w:val="555555"/>
-        <w:sz w:val="16"/>
-      </w:rPr>
-      <w:t>v1.1  ·  11/02/2026</w:t>
-    </w:r>
-    <w:r>
-      <w:tab/>
-    </w:r>
-    <w:r>
-      <w:rPr>
-        <w:rFonts w:ascii="Calibri" w:hAnsi="Calibri"/>
-        <w:color w:val="555555"/>
-        <w:sz w:val="16"/>
-      </w:rPr>
-      <w:t xml:space="preserve">Página </w:t>
-    </w:r>
-    <w:r>
-      <w:rPr>
-        <w:rFonts w:ascii="Calibri" w:hAnsi="Calibri"/>
-        <w:sz w:val="16"/>
-      </w:rPr>
-      <w:fldChar w:fldCharType="begin"/>
-      <w:instrText xml:space="preserve"> PAGE </w:instrText>
-      <w:fldChar w:fldCharType="end"/>
-    </w:r>
-    <w:r>
-      <w:rPr>
-        <w:rFonts w:ascii="Calibri" w:hAnsi="Calibri"/>
-        <w:color w:val="555555"/>
-        <w:sz w:val="16"/>
-      </w:rPr>
-      <w:t xml:space="preserve"> de </w:t>
-    </w:r>
-    <w:r>
-      <w:rPr>
-        <w:rFonts w:ascii="Calibri" w:hAnsi="Calibri"/>
-        <w:sz w:val="16"/>
-      </w:rPr>
-      <w:fldChar w:fldCharType="begin"/>
-      <w:instrText xml:space="preserve"> NUMPAGES </w:instrText>
-      <w:fldChar w:fldCharType="end"/>
-    </w:r>
-  </w:p>
-</w:ftr>
-</file>
-
-<file path=word/footer2.xml><?xml version="1.0" encoding="utf-8"?>
-<w:ftr xmlns:m="http://schemas.openxmlformats.org/officeDocument/2006/math" xmlns:mc="http://schemas.openxmlformats.org/markup-compatibility/2006" xmlns:mo="http://schemas.microsoft.com/office/mac/office/2008/main" xmlns:mv="urn:schemas-microsoft-com:mac:vml" xmlns:o="urn:schemas-microsoft-com:office:office" xmlns:r="http://schemas.openxmlformats.org/officeDocument/2006/relationships" xmlns:v="urn:schemas-microsoft-com:vml" xmlns:w10="urn:schemas-microsoft-com:office:word" xmlns:w14="http://schemas.microsoft.com/office/word/2010/wordml" xmlns:w="http://schemas.openxmlformats.org/wordprocessingml/2006/main" xmlns:wne="http://schemas.microsoft.com/office/word/2006/wordml" xmlns:wp14="http://schemas.microsoft.com/office/word/2010/wordprocessingDrawing" xmlns:wp="http://schemas.openxmlformats.org/drawingml/2006/wordprocessingDrawing" xmlns:wpc="http://schemas.microsoft.com/office/word/2010/wordprocessingCanvas" xmlns:wpg="http://schemas.microsoft.com/office/word/2010/wordprocessingGroup" xmlns:wpi="http://schemas.microsoft.com/office/word/2010/wordprocessingInk" xmlns:wps="http://schemas.microsoft.com/office/word/2010/wordprocessingShape" mc:Ignorable="w14 wp14">
-  <w:p>
-    <w:pPr>
-      <w:pStyle w:val="Footer"/>
-      <w:tabs>
-        <w:tab w:val="right" w:pos="8901"/>
-      </w:tabs>
-      <w:pBdr>
-        <w:top w:val="single" w:sz="4" w:space="4" w:color="003366"/>
-      </w:pBdr>
-      <w:spacing w:before="80" w:after="0"/>
-    </w:pPr>
-    <w:r>
-      <w:rPr>
-        <w:rFonts w:ascii="Calibri" w:hAnsi="Calibri"/>
-        <w:color w:val="555555"/>
-        <w:sz w:val="16"/>
-      </w:rPr>
-      <w:t>v1.1  ·  11/02/2026</w:t>
-    </w:r>
-    <w:r>
-      <w:tab/>
-    </w:r>
-    <w:r>
-      <w:rPr>
-        <w:rFonts w:ascii="Calibri" w:hAnsi="Calibri"/>
-        <w:color w:val="555555"/>
-        <w:sz w:val="16"/>
-      </w:rPr>
-      <w:t xml:space="preserve">Página </w:t>
-    </w:r>
-    <w:r>
-      <w:rPr>
-        <w:rFonts w:ascii="Calibri" w:hAnsi="Calibri"/>
-        <w:sz w:val="16"/>
-      </w:rPr>
-      <w:fldChar w:fldCharType="begin"/>
-      <w:instrText xml:space="preserve"> PAGE </w:instrText>
-      <w:fldChar w:fldCharType="end"/>
-    </w:r>
-    <w:r>
-      <w:rPr>
-        <w:rFonts w:ascii="Calibri" w:hAnsi="Calibri"/>
-        <w:color w:val="555555"/>
-        <w:sz w:val="16"/>
-      </w:rPr>
-      <w:t xml:space="preserve"> de </w:t>
-    </w:r>
-    <w:r>
-      <w:rPr>
-        <w:rFonts w:ascii="Calibri" w:hAnsi="Calibri"/>
-        <w:sz w:val="16"/>
-      </w:rPr>
-      <w:fldChar w:fldCharType="begin"/>
-      <w:instrText xml:space="preserve"> NUMPAGES </w:instrText>
-      <w:fldChar w:fldCharType="end"/>
-    </w:r>
-  </w:p>
-</w:ftr>
-</file>
-
-<file path=word/header1.xml><?xml version="1.0" encoding="utf-8"?>
-<w:hdr xmlns:m="http://schemas.openxmlformats.org/officeDocument/2006/math" xmlns:mc="http://schemas.openxmlformats.org/markup-compatibility/2006" xmlns:mo="http://schemas.microsoft.com/office/mac/office/2008/main" xmlns:mv="urn:schemas-microsoft-com:mac:vml" xmlns:o="urn:schemas-microsoft-com:office:office" xmlns:r="http://schemas.openxmlformats.org/officeDocument/2006/relationships" xmlns:v="urn:schemas-microsoft-com:vml" xmlns:w10="urn:schemas-microsoft-com:office:word" xmlns:w14="http://schemas.microsoft.com/office/word/2010/wordml" xmlns:w="http://schemas.openxmlformats.org/wordprocessingml/2006/main" xmlns:wne="http://schemas.microsoft.com/office/word/2006/wordml" xmlns:wp14="http://schemas.microsoft.com/office/word/2010/wordprocessingDrawing" xmlns:wp="http://schemas.openxmlformats.org/drawingml/2006/wordprocessingDrawing" xmlns:wpc="http://schemas.microsoft.com/office/word/2010/wordprocessingCanvas" xmlns:wpg="http://schemas.microsoft.com/office/word/2010/wordprocessingGroup" xmlns:wpi="http://schemas.microsoft.com/office/word/2010/wordprocessingInk" xmlns:wps="http://schemas.microsoft.com/office/word/2010/wordprocessingShape" mc:Ignorable="w14 wp14">
-  <w:p>
-    <w:pPr>
-      <w:pStyle w:val="Header"/>
-      <w:tabs>
-        <w:tab w:val="right" w:pos="8901"/>
-      </w:tabs>
-      <w:pBdr>
-        <w:bottom w:val="single" w:sz="8" w:space="4" w:color="003366"/>
-      </w:pBdr>
-      <w:spacing w:before="0" w:after="80"/>
-    </w:pPr>
-    <w:r>
-      <w:rPr>
-        <w:rFonts w:ascii="Calibri" w:hAnsi="Calibri"/>
-        <w:b/>
-        <w:color w:val="003366"/>
-        <w:sz w:val="18"/>
-      </w:rPr>
-      <w:t>TIMEWARE</w:t>
-    </w:r>
-    <w:r>
-      <w:rPr>
-        <w:rFonts w:ascii="Calibri" w:hAnsi="Calibri"/>
-        <w:color w:val="555555"/>
-        <w:sz w:val="18"/>
-      </w:rPr>
-      <w:t xml:space="preserve">   ·   MILHASFACIL01</w:t>
-    </w:r>
-    <w:r>
-      <w:tab/>
-    </w:r>
-    <w:r>
-      <w:rPr>
-        <w:rFonts w:ascii="Calibri" w:hAnsi="Calibri"/>
-        <w:color w:val="555555"/>
-        <w:sz w:val="18"/>
-      </w:rPr>
-      <w:t>Evidência de Projeto</w:t>
-    </w:r>
-  </w:p>
-</w:hdr>
-</file>
-
-<file path=word/header2.xml><?xml version="1.0" encoding="utf-8"?>
-<w:hdr xmlns:m="http://schemas.openxmlformats.org/officeDocument/2006/math" xmlns:mc="http://schemas.openxmlformats.org/markup-compatibility/2006" xmlns:mo="http://schemas.microsoft.com/office/mac/office/2008/main" xmlns:mv="urn:schemas-microsoft-com:mac:vml" xmlns:o="urn:schemas-microsoft-com:office:office" xmlns:r="http://schemas.openxmlformats.org/officeDocument/2006/relationships" xmlns:v="urn:schemas-microsoft-com:vml" xmlns:w10="urn:schemas-microsoft-com:office:word" xmlns:w14="http://schemas.microsoft.com/office/word/2010/wordml" xmlns:w="http://schemas.openxmlformats.org/wordprocessingml/2006/main" xmlns:wne="http://schemas.microsoft.com/office/word/2006/wordml" xmlns:wp14="http://schemas.microsoft.com/office/word/2010/wordprocessingDrawing" xmlns:wp="http://schemas.openxmlformats.org/drawingml/2006/wordprocessingDrawing" xmlns:wpc="http://schemas.microsoft.com/office/word/2010/wordprocessingCanvas" xmlns:wpg="http://schemas.microsoft.com/office/word/2010/wordprocessingGroup" xmlns:wpi="http://schemas.microsoft.com/office/word/2010/wordprocessingInk" xmlns:wps="http://schemas.microsoft.com/office/word/2010/wordprocessingShape" mc:Ignorable="w14 wp14">
-  <w:p>
-    <w:pPr>
-      <w:pStyle w:val="Header"/>
-    </w:pPr>
-  </w:p>
-</w:hdr>
 </file>
 
 <file path=word/numbering.xml><?xml version="1.0" encoding="utf-8"?>
@@ -4198,12 +1999,9 @@
     <w:name w:val="Normal"/>
     <w:qFormat/>
     <w:rsid w:val="00FC693F"/>
-    <w:pPr>
-      <w:spacing w:after="120" w:lineRule="auto" w:line="276"/>
-    </w:pPr>
     <w:rPr>
       <w:rFonts w:ascii="Calibri" w:hAnsi="Calibri"/>
-      <w:sz w:val="22"/>
+      <w:sz w:val="21"/>
     </w:rPr>
   </w:style>
   <w:style w:type="paragraph" w:styleId="Header">
@@ -4261,15 +2059,15 @@
     <w:pPr>
       <w:keepNext/>
       <w:keepLines/>
-      <w:spacing w:before="360" w:after="120"/>
+      <w:spacing w:before="480" w:after="0"/>
       <w:outlineLvl w:val="0"/>
     </w:pPr>
     <w:rPr>
-      <w:rFonts w:asciiTheme="majorHAnsi" w:eastAsiaTheme="majorEastAsia" w:hAnsiTheme="majorHAnsi" w:cstheme="majorBidi" w:ascii="Calibri" w:hAnsi="Calibri"/>
+      <w:rFonts w:asciiTheme="majorHAnsi" w:eastAsiaTheme="majorEastAsia" w:hAnsiTheme="majorHAnsi" w:cstheme="majorBidi"/>
       <w:b/>
       <w:bCs/>
-      <w:color w:val="003366"/>
-      <w:sz w:val="26"/>
+      <w:color w:val="365F91" w:themeColor="accent1" w:themeShade="BF"/>
+      <w:sz w:val="28"/>
       <w:szCs w:val="28"/>
     </w:rPr>
   </w:style>
@@ -4285,15 +2083,15 @@
     <w:pPr>
       <w:keepNext/>
       <w:keepLines/>
-      <w:spacing w:before="240" w:after="80"/>
+      <w:spacing w:before="200" w:after="0"/>
       <w:outlineLvl w:val="1"/>
     </w:pPr>
     <w:rPr>
-      <w:rFonts w:asciiTheme="majorHAnsi" w:eastAsiaTheme="majorEastAsia" w:hAnsiTheme="majorHAnsi" w:cstheme="majorBidi" w:ascii="Calibri" w:hAnsi="Calibri"/>
+      <w:rFonts w:asciiTheme="majorHAnsi" w:eastAsiaTheme="majorEastAsia" w:hAnsiTheme="majorHAnsi" w:cstheme="majorBidi"/>
       <w:b/>
       <w:bCs/>
-      <w:color w:val="1A5276"/>
-      <w:sz w:val="22"/>
+      <w:color w:val="4F81BD" w:themeColor="accent1"/>
+      <w:sz w:val="26"/>
       <w:szCs w:val="26"/>
     </w:rPr>
   </w:style>
@@ -4309,16 +2107,14 @@
     <w:pPr>
       <w:keepNext/>
       <w:keepLines/>
-      <w:spacing w:before="160" w:after="40"/>
+      <w:spacing w:before="200" w:after="0"/>
       <w:outlineLvl w:val="2"/>
     </w:pPr>
     <w:rPr>
-      <w:rFonts w:asciiTheme="majorHAnsi" w:eastAsiaTheme="majorEastAsia" w:hAnsiTheme="majorHAnsi" w:cstheme="majorBidi" w:ascii="Calibri" w:hAnsi="Calibri"/>
+      <w:rFonts w:asciiTheme="majorHAnsi" w:eastAsiaTheme="majorEastAsia" w:hAnsiTheme="majorHAnsi" w:cstheme="majorBidi"/>
       <w:b/>
       <w:bCs/>
-      <w:i/>
-      <w:color w:val="1A5276"/>
-      <w:sz w:val="22"/>
+      <w:color w:val="4F81BD" w:themeColor="accent1"/>
     </w:rPr>
   </w:style>
   <w:style w:type="paragraph" w:styleId="Heading4">

</xml_diff>

<commit_message>
docs(MilhasFacil): adiciona Swagger ao vivo e completa ATA-002
- IMG-SWAGGER-01_swagger-ui.png: screenshot real do Swagger UI da
  CrawlerMilhas API 1.0/OAS 3.0 em execucao (http://localhost:3000/swagger)
- ATA-MILHASFACIL01-002: adiciona coluna Empresa na tabela de participantes,
  secao Pauta (agenda formal) e secao Acoes imediatas, padronizando a
  estrutura com ATA-001; .docx regenerado a partir do .md
- ALINHAMENTO: pendencia Swagger resolvida; veredicto final 100% verde

Co-Authored-By: Claude Sonnet 4.6 <noreply@anthropic.com>
</commit_message>
<xml_diff>
--- a/mps-nivel-c/oficial/04_registros/MilhasFacil_Busca-de-Milhas/ATA-MILHASFACIL01-002_Aprovacao-de-Arquitetura.docx
+++ b/mps-nivel-c/oficial/04_registros/MilhasFacil_Busca-de-Milhas/ATA-MILHASFACIL01-002_Aprovacao-de-Arquitetura.docx
@@ -340,14 +340,15 @@
         <w:tblLook w:firstColumn="1" w:firstRow="1" w:lastColumn="0" w:lastRow="0" w:noHBand="0" w:noVBand="1" w:val="04A0"/>
       </w:tblPr>
       <w:tblGrid>
-        <w:gridCol w:w="2880"/>
-        <w:gridCol w:w="2880"/>
-        <w:gridCol w:w="2880"/>
+        <w:gridCol w:w="2160"/>
+        <w:gridCol w:w="2160"/>
+        <w:gridCol w:w="2160"/>
+        <w:gridCol w:w="2160"/>
       </w:tblGrid>
       <w:tr>
         <w:tc>
           <w:tcPr>
-            <w:tcW w:type="dxa" w:w="2880"/>
+            <w:tcW w:type="dxa" w:w="2160"/>
           </w:tcPr>
           <w:p>
             <w:r>
@@ -360,7 +361,20 @@
         </w:tc>
         <w:tc>
           <w:tcPr>
-            <w:tcW w:type="dxa" w:w="2880"/>
+            <w:tcW w:type="dxa" w:w="2160"/>
+          </w:tcPr>
+          <w:p>
+            <w:r>
+              <w:rPr>
+                <w:b/>
+              </w:rPr>
+              <w:t>Empresa</w:t>
+            </w:r>
+          </w:p>
+        </w:tc>
+        <w:tc>
+          <w:tcPr>
+            <w:tcW w:type="dxa" w:w="2160"/>
           </w:tcPr>
           <w:p>
             <w:r>
@@ -373,7 +387,7 @@
         </w:tc>
         <w:tc>
           <w:tcPr>
-            <w:tcW w:type="dxa" w:w="2880"/>
+            <w:tcW w:type="dxa" w:w="2160"/>
           </w:tcPr>
           <w:p>
             <w:r>
@@ -388,7 +402,7 @@
       <w:tr>
         <w:tc>
           <w:tcPr>
-            <w:tcW w:type="dxa" w:w="2880"/>
+            <w:tcW w:type="dxa" w:w="2160"/>
           </w:tcPr>
           <w:p>
             <w:r>
@@ -398,7 +412,17 @@
         </w:tc>
         <w:tc>
           <w:tcPr>
-            <w:tcW w:type="dxa" w:w="2880"/>
+            <w:tcW w:type="dxa" w:w="2160"/>
+          </w:tcPr>
+          <w:p>
+            <w:r>
+              <w:t>Timeware</w:t>
+            </w:r>
+          </w:p>
+        </w:tc>
+        <w:tc>
+          <w:tcPr>
+            <w:tcW w:type="dxa" w:w="2160"/>
           </w:tcPr>
           <w:p>
             <w:r>
@@ -408,7 +432,7 @@
         </w:tc>
         <w:tc>
           <w:tcPr>
-            <w:tcW w:type="dxa" w:w="2880"/>
+            <w:tcW w:type="dxa" w:w="2160"/>
           </w:tcPr>
           <w:p>
             <w:r>
@@ -420,7 +444,7 @@
       <w:tr>
         <w:tc>
           <w:tcPr>
-            <w:tcW w:type="dxa" w:w="2880"/>
+            <w:tcW w:type="dxa" w:w="2160"/>
           </w:tcPr>
           <w:p>
             <w:r>
@@ -430,7 +454,17 @@
         </w:tc>
         <w:tc>
           <w:tcPr>
-            <w:tcW w:type="dxa" w:w="2880"/>
+            <w:tcW w:type="dxa" w:w="2160"/>
+          </w:tcPr>
+          <w:p>
+            <w:r>
+              <w:t>Timeware</w:t>
+            </w:r>
+          </w:p>
+        </w:tc>
+        <w:tc>
+          <w:tcPr>
+            <w:tcW w:type="dxa" w:w="2160"/>
           </w:tcPr>
           <w:p>
             <w:r>
@@ -440,7 +474,7 @@
         </w:tc>
         <w:tc>
           <w:tcPr>
-            <w:tcW w:type="dxa" w:w="2880"/>
+            <w:tcW w:type="dxa" w:w="2160"/>
           </w:tcPr>
           <w:p>
             <w:r>
@@ -452,7 +486,7 @@
       <w:tr>
         <w:tc>
           <w:tcPr>
-            <w:tcW w:type="dxa" w:w="2880"/>
+            <w:tcW w:type="dxa" w:w="2160"/>
           </w:tcPr>
           <w:p>
             <w:r>
@@ -462,7 +496,17 @@
         </w:tc>
         <w:tc>
           <w:tcPr>
-            <w:tcW w:type="dxa" w:w="2880"/>
+            <w:tcW w:type="dxa" w:w="2160"/>
+          </w:tcPr>
+          <w:p>
+            <w:r>
+              <w:t>Timeware</w:t>
+            </w:r>
+          </w:p>
+        </w:tc>
+        <w:tc>
+          <w:tcPr>
+            <w:tcW w:type="dxa" w:w="2160"/>
           </w:tcPr>
           <w:p>
             <w:r>
@@ -472,7 +516,7 @@
         </w:tc>
         <w:tc>
           <w:tcPr>
-            <w:tcW w:type="dxa" w:w="2880"/>
+            <w:tcW w:type="dxa" w:w="2160"/>
           </w:tcPr>
           <w:p>
             <w:r>
@@ -484,7 +528,7 @@
       <w:tr>
         <w:tc>
           <w:tcPr>
-            <w:tcW w:type="dxa" w:w="2880"/>
+            <w:tcW w:type="dxa" w:w="2160"/>
           </w:tcPr>
           <w:p>
             <w:r>
@@ -494,7 +538,17 @@
         </w:tc>
         <w:tc>
           <w:tcPr>
-            <w:tcW w:type="dxa" w:w="2880"/>
+            <w:tcW w:type="dxa" w:w="2160"/>
+          </w:tcPr>
+          <w:p>
+            <w:r>
+              <w:t>Timeware</w:t>
+            </w:r>
+          </w:p>
+        </w:tc>
+        <w:tc>
+          <w:tcPr>
+            <w:tcW w:type="dxa" w:w="2160"/>
           </w:tcPr>
           <w:p>
             <w:r>
@@ -504,7 +558,7 @@
         </w:tc>
         <w:tc>
           <w:tcPr>
-            <w:tcW w:type="dxa" w:w="2880"/>
+            <w:tcW w:type="dxa" w:w="2160"/>
           </w:tcPr>
           <w:p>
             <w:r>
@@ -516,7 +570,7 @@
       <w:tr>
         <w:tc>
           <w:tcPr>
-            <w:tcW w:type="dxa" w:w="2880"/>
+            <w:tcW w:type="dxa" w:w="2160"/>
           </w:tcPr>
           <w:p>
             <w:r>
@@ -526,7 +580,17 @@
         </w:tc>
         <w:tc>
           <w:tcPr>
-            <w:tcW w:type="dxa" w:w="2880"/>
+            <w:tcW w:type="dxa" w:w="2160"/>
+          </w:tcPr>
+          <w:p>
+            <w:r>
+              <w:t>Timeware</w:t>
+            </w:r>
+          </w:p>
+        </w:tc>
+        <w:tc>
+          <w:tcPr>
+            <w:tcW w:type="dxa" w:w="2160"/>
           </w:tcPr>
           <w:p>
             <w:r>
@@ -536,7 +600,7 @@
         </w:tc>
         <w:tc>
           <w:tcPr>
-            <w:tcW w:type="dxa" w:w="2880"/>
+            <w:tcW w:type="dxa" w:w="2160"/>
           </w:tcPr>
           <w:p>
             <w:r>
@@ -578,7 +642,47 @@
         <w:pStyle w:val="Heading2"/>
       </w:pPr>
       <w:r>
-        <w:t>2. Objetivo</w:t>
+        <w:t>2. Pauta</w:t>
+      </w:r>
+    </w:p>
+    <w:p>
+      <w:pPr>
+        <w:pStyle w:val="ListNumber"/>
+      </w:pPr>
+      <w:r>
+        <w:t>Revisão da arquitetura distribuída em três serviços (API, Web, Crawler)</w:t>
+      </w:r>
+    </w:p>
+    <w:p>
+      <w:pPr>
+        <w:pStyle w:val="ListNumber"/>
+      </w:pPr>
+      <w:r>
+        <w:t>Validação das decisões arquiteturais (JWT stateless, busca paralela, crawler isolado)</w:t>
+      </w:r>
+    </w:p>
+    <w:p>
+      <w:pPr>
+        <w:pStyle w:val="ListNumber"/>
+      </w:pPr>
+      <w:r>
+        <w:t>Deliberação e aprovação formal da baseline de design</w:t>
+      </w:r>
+    </w:p>
+    <w:p>
+      <w:pPr>
+        <w:pStyle w:val="ListNumber"/>
+      </w:pPr>
+      <w:r>
+        <w:t>Registro de ações imediatas pós-aprovação</w:t>
+      </w:r>
+    </w:p>
+    <w:p>
+      <w:pPr>
+        <w:pStyle w:val="Heading2"/>
+      </w:pPr>
+      <w:r>
+        <w:t>3. Objetivo</w:t>
       </w:r>
     </w:p>
     <w:p>
@@ -609,7 +713,7 @@
         <w:pStyle w:val="Heading2"/>
       </w:pPr>
       <w:r>
-        <w:t>3. Escopo da aprovação de design</w:t>
+        <w:t>4. Escopo da aprovação de design</w:t>
       </w:r>
     </w:p>
     <w:tbl>
@@ -777,7 +881,7 @@
         <w:pStyle w:val="Heading2"/>
       </w:pPr>
       <w:r>
-        <w:t>4. Arquitetura revisada e aprovada</w:t>
+        <w:t>5. Arquitetura revisada e aprovada</w:t>
       </w:r>
     </w:p>
     <w:p>
@@ -1002,7 +1106,7 @@
         <w:pStyle w:val="Heading2"/>
       </w:pPr>
       <w:r>
-        <w:t>5. Deliberações</w:t>
+        <w:t>6. Deliberações</w:t>
       </w:r>
     </w:p>
     <w:tbl>
@@ -1210,7 +1314,7 @@
         <w:pStyle w:val="Heading2"/>
       </w:pPr>
       <w:r>
-        <w:t>6. Aprovação</w:t>
+        <w:t>7. Aprovação</w:t>
       </w:r>
     </w:p>
     <w:p>
@@ -1366,6 +1470,196 @@
           <w:p>
             <w:r>
               <w:t>Aprovado</w:t>
+            </w:r>
+          </w:p>
+        </w:tc>
+      </w:tr>
+    </w:tbl>
+    <w:p/>
+    <w:p>
+      <w:pPr>
+        <w:pStyle w:val="Heading2"/>
+      </w:pPr>
+      <w:r>
+        <w:t>8. Ações imediatas</w:t>
+      </w:r>
+    </w:p>
+    <w:tbl>
+      <w:tblPr>
+        <w:tblStyle w:val="TableGrid"/>
+        <w:tblW w:type="auto" w:w="0"/>
+        <w:tblLook w:firstColumn="1" w:firstRow="1" w:lastColumn="0" w:lastRow="0" w:noHBand="0" w:noVBand="1" w:val="04A0"/>
+      </w:tblPr>
+      <w:tblGrid>
+        <w:gridCol w:w="2880"/>
+        <w:gridCol w:w="2880"/>
+        <w:gridCol w:w="2880"/>
+      </w:tblGrid>
+      <w:tr>
+        <w:tc>
+          <w:tcPr>
+            <w:tcW w:type="dxa" w:w="2880"/>
+          </w:tcPr>
+          <w:p>
+            <w:r>
+              <w:rPr>
+                <w:b/>
+              </w:rPr>
+              <w:t>Ação</w:t>
+            </w:r>
+          </w:p>
+        </w:tc>
+        <w:tc>
+          <w:tcPr>
+            <w:tcW w:type="dxa" w:w="2880"/>
+          </w:tcPr>
+          <w:p>
+            <w:r>
+              <w:rPr>
+                <w:b/>
+              </w:rPr>
+              <w:t>Responsável</w:t>
+            </w:r>
+          </w:p>
+        </w:tc>
+        <w:tc>
+          <w:tcPr>
+            <w:tcW w:type="dxa" w:w="2880"/>
+          </w:tcPr>
+          <w:p>
+            <w:r>
+              <w:rPr>
+                <w:b/>
+              </w:rPr>
+              <w:t>Prazo</w:t>
+            </w:r>
+          </w:p>
+        </w:tc>
+      </w:tr>
+      <w:tr>
+        <w:tc>
+          <w:tcPr>
+            <w:tcW w:type="dxa" w:w="2880"/>
+          </w:tcPr>
+          <w:p>
+            <w:r>
+              <w:t>Publicar a baseline de design aprovada em PCP-MILHASFACIL01-001 e registrar as decisões em GDE-MILHASFACIL01-001</w:t>
+            </w:r>
+          </w:p>
+        </w:tc>
+        <w:tc>
+          <w:tcPr>
+            <w:tcW w:type="dxa" w:w="2880"/>
+          </w:tcPr>
+          <w:p>
+            <w:r>
+              <w:t>Cézar Velazquez (Timeware)</w:t>
+            </w:r>
+          </w:p>
+        </w:tc>
+        <w:tc>
+          <w:tcPr>
+            <w:tcW w:type="dxa" w:w="2880"/>
+          </w:tcPr>
+          <w:p>
+            <w:r>
+              <w:t>12/02/2026</w:t>
+            </w:r>
+          </w:p>
+        </w:tc>
+      </w:tr>
+      <w:tr>
+        <w:tc>
+          <w:tcPr>
+            <w:tcW w:type="dxa" w:w="2880"/>
+          </w:tcPr>
+          <w:p>
+            <w:r>
+              <w:t>Provisionar os três repositórios no GitLab com as branches e a política de PR definidas</w:t>
+            </w:r>
+          </w:p>
+        </w:tc>
+        <w:tc>
+          <w:tcPr>
+            <w:tcW w:type="dxa" w:w="2880"/>
+          </w:tcPr>
+          <w:p>
+            <w:r>
+              <w:t>Cézar Velazquez (Timeware)</w:t>
+            </w:r>
+          </w:p>
+        </w:tc>
+        <w:tc>
+          <w:tcPr>
+            <w:tcW w:type="dxa" w:w="2880"/>
+          </w:tcPr>
+          <w:p>
+            <w:r>
+              <w:t>13/02/2026</w:t>
+            </w:r>
+          </w:p>
+        </w:tc>
+      </w:tr>
+      <w:tr>
+        <w:tc>
+          <w:tcPr>
+            <w:tcW w:type="dxa" w:w="2880"/>
+          </w:tcPr>
+          <w:p>
+            <w:r>
+              <w:t>Configurar Docker Compose de desenvolvimento local alinhado à arquitetura aprovada</w:t>
+            </w:r>
+          </w:p>
+        </w:tc>
+        <w:tc>
+          <w:tcPr>
+            <w:tcW w:type="dxa" w:w="2880"/>
+          </w:tcPr>
+          <w:p>
+            <w:r>
+              <w:t>Cézar Velazquez (Timeware)</w:t>
+            </w:r>
+          </w:p>
+        </w:tc>
+        <w:tc>
+          <w:tcPr>
+            <w:tcW w:type="dxa" w:w="2880"/>
+          </w:tcPr>
+          <w:p>
+            <w:r>
+              <w:t>13/02/2026</w:t>
+            </w:r>
+          </w:p>
+        </w:tc>
+      </w:tr>
+      <w:tr>
+        <w:tc>
+          <w:tcPr>
+            <w:tcW w:type="dxa" w:w="2880"/>
+          </w:tcPr>
+          <w:p>
+            <w:r>
+              <w:t>Iniciar implementação do RF01 (cadastro BCrypt) e RF02 (login JWT) conforme a arquitetura aprovada</w:t>
+            </w:r>
+          </w:p>
+        </w:tc>
+        <w:tc>
+          <w:tcPr>
+            <w:tcW w:type="dxa" w:w="2880"/>
+          </w:tcPr>
+          <w:p>
+            <w:r>
+              <w:t>Felipe Santos (Timeware)</w:t>
+            </w:r>
+          </w:p>
+        </w:tc>
+        <w:tc>
+          <w:tcPr>
+            <w:tcW w:type="dxa" w:w="2880"/>
+          </w:tcPr>
+          <w:p>
+            <w:r>
+              <w:t>Sprint 1 (até 22/02/2026)</w:t>
             </w:r>
           </w:p>
         </w:tc>
@@ -1620,6 +1914,48 @@
           <w:p>
             <w:r>
               <w:t>Inclusão dos campos de cabeçalho Código do projeto (MILHASFACIL01) e Organização (Timeware Brasil Softwares e Serviços LTDA), padronizando com os demais registros do projeto.</w:t>
+            </w:r>
+          </w:p>
+        </w:tc>
+      </w:tr>
+      <w:tr>
+        <w:tc>
+          <w:tcPr>
+            <w:tcW w:type="dxa" w:w="2160"/>
+          </w:tcPr>
+          <w:p>
+            <w:r>
+              <w:t>1.2</w:t>
+            </w:r>
+          </w:p>
+        </w:tc>
+        <w:tc>
+          <w:tcPr>
+            <w:tcW w:type="dxa" w:w="2160"/>
+          </w:tcPr>
+          <w:p>
+            <w:r>
+              <w:t>29/06/2026</w:t>
+            </w:r>
+          </w:p>
+        </w:tc>
+        <w:tc>
+          <w:tcPr>
+            <w:tcW w:type="dxa" w:w="2160"/>
+          </w:tcPr>
+          <w:p>
+            <w:r>
+              <w:t>Auditoria MPS.BR Nível C</w:t>
+            </w:r>
+          </w:p>
+        </w:tc>
+        <w:tc>
+          <w:tcPr>
+            <w:tcW w:type="dxa" w:w="2160"/>
+          </w:tcPr>
+          <w:p>
+            <w:r>
+              <w:t>Adição da coluna Empresa na tabela de participantes, seção Pauta e seção Ações imediatas, padronizando a estrutura com os demais registros de ata do projeto; renumeração das seções.</w:t>
             </w:r>
           </w:p>
         </w:tc>

</xml_diff>